<commit_message>
Update CRM PRD v0.4 — complete volunteer profile data model
Added comprehensive volunteer profile field list to Section 5.1:
- Identity & Contact (name, email, phone, city/zip, LinkedIn, photo)
- Biographical (birthdate, date joined CBM, how heard about CBM)
- Professional Background (employer, title, industry, experience, bio)
- Skills & Expertise (industry tags, functional tags, SME tags)
- Interests (hobbies, causes, speaking/marketing willingness)
- Role & Capacity (existing fields retained)
- Administrative (dues status, Moodle completion, ethics sign-off, status)
- KPIs (system-calculated — clients served, hours, workshops, tenure, NPS)
</commit_message>
<xml_diff>
--- a/PRDs/CBM-PRD-CRM.docx
+++ b/PRDs/CBM-PRD-CRM.docx
@@ -1265,70 +1265,479 @@
     </w:p>
     <w:p>
       <w:pPr>
-        <w:pStyle w:val="ListParagraph"/>
-        <w:numPr>
-          <w:ilvl w:val="0"/>
-          <w:numId w:val="2"/>
-        </w:numPr>
-        <w:spacing w:after="80"/>
-      </w:pPr>
-      <w:r>
-        <w:rPr>
-          <w:b w:val="false"/>
-          <w:bCs w:val="false"/>
-        </w:rPr>
-        <w:t xml:space="preserve">Single profile per volunteer regardless of roles held</w:t>
-      </w:r>
-    </w:p>
-    <w:p>
-      <w:pPr>
-        <w:pStyle w:val="ListParagraph"/>
-        <w:numPr>
-          <w:ilvl w:val="0"/>
-          <w:numId w:val="2"/>
-        </w:numPr>
-        <w:spacing w:after="80"/>
-      </w:pPr>
-      <w:r>
-        <w:rPr>
-          <w:b w:val="false"/>
-          <w:bCs w:val="false"/>
-        </w:rPr>
-        <w:t xml:space="preserve">Roles are additive — mentor, co-mentor, SME, or any combination</w:t>
-      </w:r>
-    </w:p>
-    <w:p>
-      <w:pPr>
-        <w:pStyle w:val="ListParagraph"/>
-        <w:numPr>
-          <w:ilvl w:val="0"/>
-          <w:numId w:val="2"/>
-        </w:numPr>
-        <w:spacing w:after="80"/>
-      </w:pPr>
-      <w:r>
-        <w:rPr>
-          <w:b w:val="false"/>
-          <w:bCs w:val="false"/>
-        </w:rPr>
-        <w:t xml:space="preserve">Industry expertise tags (e.g., retail, manufacturing, nonprofit, tech, food service)</w:t>
-      </w:r>
-    </w:p>
-    <w:p>
-      <w:pPr>
-        <w:pStyle w:val="ListParagraph"/>
-        <w:numPr>
-          <w:ilvl w:val="0"/>
-          <w:numId w:val="2"/>
-        </w:numPr>
-        <w:spacing w:after="80"/>
-      </w:pPr>
-      <w:r>
-        <w:rPr>
-          <w:b w:val="false"/>
-          <w:bCs w:val="false"/>
-        </w:rPr>
-        <w:t xml:space="preserve">Functional skill tags (e.g., marketing, finance, operations, HR, fundraising, governance)</w:t>
+        <w:spacing w:after="120"/>
+      </w:pPr>
+      <w:r>
+        <w:t xml:space="preserve">Single profile per volunteer regardless of roles held. Roles are additive — mentor, co-mentor, SME, or any combination.</w:t>
+      </w:r>
+    </w:p>
+    <w:p>
+      <w:r>
+        <w:t xml:space="preserve"/>
+      </w:r>
+    </w:p>
+    <w:p>
+      <w:pPr>
+        <w:pStyle w:val="Heading3"/>
+      </w:pPr>
+      <w:r>
+        <w:t xml:space="preserve">Identity &amp; Contact</w:t>
+      </w:r>
+    </w:p>
+    <w:p>
+      <w:pPr>
+        <w:pStyle w:val="ListParagraph"/>
+        <w:numPr>
+          <w:ilvl w:val="0"/>
+          <w:numId w:val="2"/>
+        </w:numPr>
+        <w:spacing w:after="80"/>
+      </w:pPr>
+      <w:r>
+        <w:rPr>
+          <w:b w:val="false"/>
+          <w:bCs w:val="false"/>
+        </w:rPr>
+        <w:t xml:space="preserve">First name, last name</w:t>
+      </w:r>
+    </w:p>
+    <w:p>
+      <w:pPr>
+        <w:pStyle w:val="ListParagraph"/>
+        <w:numPr>
+          <w:ilvl w:val="0"/>
+          <w:numId w:val="2"/>
+        </w:numPr>
+        <w:spacing w:after="80"/>
+      </w:pPr>
+      <w:r>
+        <w:rPr>
+          <w:b w:val="false"/>
+          <w:bCs w:val="false"/>
+        </w:rPr>
+        <w:t xml:space="preserve">Preferred name / nickname</w:t>
+      </w:r>
+    </w:p>
+    <w:p>
+      <w:pPr>
+        <w:pStyle w:val="ListParagraph"/>
+        <w:numPr>
+          <w:ilvl w:val="0"/>
+          <w:numId w:val="2"/>
+        </w:numPr>
+        <w:spacing w:after="80"/>
+      </w:pPr>
+      <w:r>
+        <w:rPr>
+          <w:b w:val="false"/>
+          <w:bCs w:val="false"/>
+        </w:rPr>
+        <w:t xml:space="preserve">Email address (primary)</w:t>
+      </w:r>
+    </w:p>
+    <w:p>
+      <w:pPr>
+        <w:pStyle w:val="ListParagraph"/>
+        <w:numPr>
+          <w:ilvl w:val="0"/>
+          <w:numId w:val="2"/>
+        </w:numPr>
+        <w:spacing w:after="80"/>
+      </w:pPr>
+      <w:r>
+        <w:rPr>
+          <w:b w:val="false"/>
+          <w:bCs w:val="false"/>
+        </w:rPr>
+        <w:t xml:space="preserve">Phone number</w:t>
+      </w:r>
+    </w:p>
+    <w:p>
+      <w:pPr>
+        <w:pStyle w:val="ListParagraph"/>
+        <w:numPr>
+          <w:ilvl w:val="0"/>
+          <w:numId w:val="2"/>
+        </w:numPr>
+        <w:spacing w:after="80"/>
+      </w:pPr>
+      <w:r>
+        <w:rPr>
+          <w:b w:val="false"/>
+          <w:bCs w:val="false"/>
+        </w:rPr>
+        <w:t xml:space="preserve">City / zip code</w:t>
+      </w:r>
+    </w:p>
+    <w:p>
+      <w:pPr>
+        <w:pStyle w:val="ListParagraph"/>
+        <w:numPr>
+          <w:ilvl w:val="0"/>
+          <w:numId w:val="2"/>
+        </w:numPr>
+        <w:spacing w:after="80"/>
+      </w:pPr>
+      <w:r>
+        <w:rPr>
+          <w:b w:val="false"/>
+          <w:bCs w:val="false"/>
+        </w:rPr>
+        <w:t xml:space="preserve">LinkedIn profile URL</w:t>
+      </w:r>
+    </w:p>
+    <w:p>
+      <w:pPr>
+        <w:pStyle w:val="ListParagraph"/>
+        <w:numPr>
+          <w:ilvl w:val="0"/>
+          <w:numId w:val="2"/>
+        </w:numPr>
+        <w:spacing w:after="80"/>
+      </w:pPr>
+      <w:r>
+        <w:rPr>
+          <w:b w:val="false"/>
+          <w:bCs w:val="false"/>
+        </w:rPr>
+        <w:t xml:space="preserve">Photo</w:t>
+      </w:r>
+    </w:p>
+    <w:p>
+      <w:r>
+        <w:t xml:space="preserve"/>
+      </w:r>
+    </w:p>
+    <w:p>
+      <w:pPr>
+        <w:pStyle w:val="Heading3"/>
+      </w:pPr>
+      <w:r>
+        <w:t xml:space="preserve">Biographical</w:t>
+      </w:r>
+    </w:p>
+    <w:p>
+      <w:pPr>
+        <w:pStyle w:val="ListParagraph"/>
+        <w:numPr>
+          <w:ilvl w:val="0"/>
+          <w:numId w:val="2"/>
+        </w:numPr>
+        <w:spacing w:after="80"/>
+      </w:pPr>
+      <w:r>
+        <w:rPr>
+          <w:b w:val="false"/>
+          <w:bCs w:val="false"/>
+        </w:rPr>
+        <w:t xml:space="preserve">Birthdate</w:t>
+      </w:r>
+    </w:p>
+    <w:p>
+      <w:pPr>
+        <w:pStyle w:val="ListParagraph"/>
+        <w:numPr>
+          <w:ilvl w:val="0"/>
+          <w:numId w:val="2"/>
+        </w:numPr>
+        <w:spacing w:after="80"/>
+      </w:pPr>
+      <w:r>
+        <w:rPr>
+          <w:b w:val="false"/>
+          <w:bCs w:val="false"/>
+        </w:rPr>
+        <w:t xml:space="preserve">Date joined CBM</w:t>
+      </w:r>
+    </w:p>
+    <w:p>
+      <w:pPr>
+        <w:pStyle w:val="ListParagraph"/>
+        <w:numPr>
+          <w:ilvl w:val="0"/>
+          <w:numId w:val="2"/>
+        </w:numPr>
+        <w:spacing w:after="80"/>
+      </w:pPr>
+      <w:r>
+        <w:rPr>
+          <w:b w:val="false"/>
+          <w:bCs w:val="false"/>
+        </w:rPr>
+        <w:t xml:space="preserve">How they heard about CBM</w:t>
+      </w:r>
+    </w:p>
+    <w:p>
+      <w:r>
+        <w:t xml:space="preserve"/>
+      </w:r>
+    </w:p>
+    <w:p>
+      <w:pPr>
+        <w:pStyle w:val="Heading3"/>
+      </w:pPr>
+      <w:r>
+        <w:t xml:space="preserve">Professional Background</w:t>
+      </w:r>
+    </w:p>
+    <w:p>
+      <w:pPr>
+        <w:pStyle w:val="ListParagraph"/>
+        <w:numPr>
+          <w:ilvl w:val="0"/>
+          <w:numId w:val="2"/>
+        </w:numPr>
+        <w:spacing w:after="80"/>
+      </w:pPr>
+      <w:r>
+        <w:rPr>
+          <w:b w:val="false"/>
+          <w:bCs w:val="false"/>
+        </w:rPr>
+        <w:t xml:space="preserve">Current employer / company</w:t>
+      </w:r>
+    </w:p>
+    <w:p>
+      <w:pPr>
+        <w:pStyle w:val="ListParagraph"/>
+        <w:numPr>
+          <w:ilvl w:val="0"/>
+          <w:numId w:val="2"/>
+        </w:numPr>
+        <w:spacing w:after="80"/>
+      </w:pPr>
+      <w:r>
+        <w:rPr>
+          <w:b w:val="false"/>
+          <w:bCs w:val="false"/>
+        </w:rPr>
+        <w:t xml:space="preserve">Current job title</w:t>
+      </w:r>
+    </w:p>
+    <w:p>
+      <w:pPr>
+        <w:pStyle w:val="ListParagraph"/>
+        <w:numPr>
+          <w:ilvl w:val="0"/>
+          <w:numId w:val="2"/>
+        </w:numPr>
+        <w:spacing w:after="80"/>
+      </w:pPr>
+      <w:r>
+        <w:rPr>
+          <w:b w:val="false"/>
+          <w:bCs w:val="false"/>
+        </w:rPr>
+        <w:t xml:space="preserve">Industry (primary)</w:t>
+      </w:r>
+    </w:p>
+    <w:p>
+      <w:pPr>
+        <w:pStyle w:val="ListParagraph"/>
+        <w:numPr>
+          <w:ilvl w:val="0"/>
+          <w:numId w:val="2"/>
+        </w:numPr>
+        <w:spacing w:after="80"/>
+      </w:pPr>
+      <w:r>
+        <w:rPr>
+          <w:b w:val="false"/>
+          <w:bCs w:val="false"/>
+        </w:rPr>
+        <w:t xml:space="preserve">Years of professional experience</w:t>
+      </w:r>
+    </w:p>
+    <w:p>
+      <w:pPr>
+        <w:pStyle w:val="ListParagraph"/>
+        <w:numPr>
+          <w:ilvl w:val="0"/>
+          <w:numId w:val="2"/>
+        </w:numPr>
+        <w:spacing w:after="80"/>
+      </w:pPr>
+      <w:r>
+        <w:rPr>
+          <w:b w:val="false"/>
+          <w:bCs w:val="false"/>
+        </w:rPr>
+        <w:t xml:space="preserve">Brief bio (free text — used for public profile and funder storytelling)</w:t>
+      </w:r>
+    </w:p>
+    <w:p>
+      <w:r>
+        <w:t xml:space="preserve"/>
+      </w:r>
+    </w:p>
+    <w:p>
+      <w:pPr>
+        <w:pStyle w:val="Heading3"/>
+      </w:pPr>
+      <w:r>
+        <w:t xml:space="preserve">Skills &amp; Expertise (for matching)</w:t>
+      </w:r>
+    </w:p>
+    <w:p>
+      <w:pPr>
+        <w:pStyle w:val="ListParagraph"/>
+        <w:numPr>
+          <w:ilvl w:val="0"/>
+          <w:numId w:val="2"/>
+        </w:numPr>
+        <w:spacing w:after="80"/>
+      </w:pPr>
+      <w:r>
+        <w:rPr>
+          <w:b w:val="false"/>
+          <w:bCs w:val="false"/>
+        </w:rPr>
+        <w:t xml:space="preserve">Industry expertise tags (e.g., retail, manufacturing, nonprofit, tech, food service, healthcare, real estate, legal)</w:t>
+      </w:r>
+    </w:p>
+    <w:p>
+      <w:pPr>
+        <w:pStyle w:val="ListParagraph"/>
+        <w:numPr>
+          <w:ilvl w:val="0"/>
+          <w:numId w:val="2"/>
+        </w:numPr>
+        <w:spacing w:after="80"/>
+      </w:pPr>
+      <w:r>
+        <w:rPr>
+          <w:b w:val="false"/>
+          <w:bCs w:val="false"/>
+        </w:rPr>
+        <w:t xml:space="preserve">Functional skill tags (e.g., marketing, finance, operations, HR, fundraising, governance, legal, technology, sales)</w:t>
+      </w:r>
+    </w:p>
+    <w:p>
+      <w:pPr>
+        <w:pStyle w:val="ListParagraph"/>
+        <w:numPr>
+          <w:ilvl w:val="0"/>
+          <w:numId w:val="2"/>
+        </w:numPr>
+        <w:spacing w:after="80"/>
+      </w:pPr>
+      <w:r>
+        <w:rPr>
+          <w:b w:val="false"/>
+          <w:bCs w:val="false"/>
+        </w:rPr>
+        <w:t xml:space="preserve">SME topic/skill tags — granular areas of deep expertise</w:t>
+      </w:r>
+    </w:p>
+    <w:p>
+      <w:r>
+        <w:t xml:space="preserve"/>
+      </w:r>
+    </w:p>
+    <w:p>
+      <w:pPr>
+        <w:pStyle w:val="Heading3"/>
+      </w:pPr>
+      <w:r>
+        <w:t xml:space="preserve">Interests</w:t>
+      </w:r>
+    </w:p>
+    <w:p>
+      <w:pPr>
+        <w:pStyle w:val="ListParagraph"/>
+        <w:numPr>
+          <w:ilvl w:val="0"/>
+          <w:numId w:val="2"/>
+        </w:numPr>
+        <w:spacing w:after="80"/>
+      </w:pPr>
+      <w:r>
+        <w:rPr>
+          <w:b w:val="false"/>
+          <w:bCs w:val="false"/>
+        </w:rPr>
+        <w:t xml:space="preserve">Personal interests / hobbies (free text or tags)</w:t>
+      </w:r>
+    </w:p>
+    <w:p>
+      <w:pPr>
+        <w:pStyle w:val="ListParagraph"/>
+        <w:numPr>
+          <w:ilvl w:val="0"/>
+          <w:numId w:val="2"/>
+        </w:numPr>
+        <w:spacing w:after="80"/>
+      </w:pPr>
+      <w:r>
+        <w:rPr>
+          <w:b w:val="false"/>
+          <w:bCs w:val="false"/>
+        </w:rPr>
+        <w:t xml:space="preserve">Causes they care about</w:t>
+      </w:r>
+    </w:p>
+    <w:p>
+      <w:pPr>
+        <w:pStyle w:val="ListParagraph"/>
+        <w:numPr>
+          <w:ilvl w:val="0"/>
+          <w:numId w:val="2"/>
+        </w:numPr>
+        <w:spacing w:after="80"/>
+      </w:pPr>
+      <w:r>
+        <w:rPr>
+          <w:b w:val="false"/>
+          <w:bCs w:val="false"/>
+        </w:rPr>
+        <w:t xml:space="preserve">Willingness to speak at events (yes/no toggle)</w:t>
+      </w:r>
+    </w:p>
+    <w:p>
+      <w:pPr>
+        <w:pStyle w:val="ListParagraph"/>
+        <w:numPr>
+          <w:ilvl w:val="0"/>
+          <w:numId w:val="2"/>
+        </w:numPr>
+        <w:spacing w:after="80"/>
+      </w:pPr>
+      <w:r>
+        <w:rPr>
+          <w:b w:val="false"/>
+          <w:bCs w:val="false"/>
+        </w:rPr>
+        <w:t xml:space="preserve">Willingness to be featured in marketing/funder materials (yes/no toggle)</w:t>
+      </w:r>
+    </w:p>
+    <w:p>
+      <w:r>
+        <w:t xml:space="preserve"/>
+      </w:r>
+    </w:p>
+    <w:p>
+      <w:pPr>
+        <w:pStyle w:val="Heading3"/>
+      </w:pPr>
+      <w:r>
+        <w:t xml:space="preserve">Role &amp; Capacity</w:t>
+      </w:r>
+    </w:p>
+    <w:p>
+      <w:pPr>
+        <w:pStyle w:val="ListParagraph"/>
+        <w:numPr>
+          <w:ilvl w:val="0"/>
+          <w:numId w:val="2"/>
+        </w:numPr>
+        <w:spacing w:after="80"/>
+      </w:pPr>
+      <w:r>
+        <w:rPr>
+          <w:b w:val="false"/>
+          <w:bCs w:val="false"/>
+        </w:rPr>
+        <w:t xml:space="preserve">Role(s) — mentor, co-mentor, SME (additive)</w:t>
       </w:r>
     </w:p>
     <w:p>
@@ -1396,24 +1805,203 @@
           <w:b w:val="false"/>
           <w:bCs w:val="false"/>
         </w:rPr>
-        <w:t xml:space="preserve">SME availability toggle with topic/skill tags</w:t>
-      </w:r>
-    </w:p>
-    <w:p>
-      <w:pPr>
-        <w:pStyle w:val="ListParagraph"/>
-        <w:numPr>
-          <w:ilvl w:val="0"/>
-          <w:numId w:val="2"/>
-        </w:numPr>
-        <w:spacing w:after="80"/>
-      </w:pPr>
-      <w:r>
-        <w:rPr>
-          <w:b w:val="false"/>
-          <w:bCs w:val="false"/>
-        </w:rPr>
-        <w:t xml:space="preserve">Membership dues status</w:t>
+        <w:t xml:space="preserve">SME availability toggle</w:t>
+      </w:r>
+    </w:p>
+    <w:p>
+      <w:r>
+        <w:t xml:space="preserve"/>
+      </w:r>
+    </w:p>
+    <w:p>
+      <w:pPr>
+        <w:pStyle w:val="Heading3"/>
+      </w:pPr>
+      <w:r>
+        <w:t xml:space="preserve">Administrative</w:t>
+      </w:r>
+    </w:p>
+    <w:p>
+      <w:pPr>
+        <w:pStyle w:val="ListParagraph"/>
+        <w:numPr>
+          <w:ilvl w:val="0"/>
+          <w:numId w:val="2"/>
+        </w:numPr>
+        <w:spacing w:after="80"/>
+      </w:pPr>
+      <w:r>
+        <w:rPr>
+          <w:b w:val="false"/>
+          <w:bCs w:val="false"/>
+        </w:rPr>
+        <w:t xml:space="preserve">Membership dues status — current / waived / unpaid</w:t>
+      </w:r>
+    </w:p>
+    <w:p>
+      <w:pPr>
+        <w:pStyle w:val="ListParagraph"/>
+        <w:numPr>
+          <w:ilvl w:val="0"/>
+          <w:numId w:val="2"/>
+        </w:numPr>
+        <w:spacing w:after="80"/>
+      </w:pPr>
+      <w:r>
+        <w:rPr>
+          <w:b w:val="false"/>
+          <w:bCs w:val="false"/>
+        </w:rPr>
+        <w:t xml:space="preserve">Moodle onboarding completion date (system-populated)</w:t>
+      </w:r>
+    </w:p>
+    <w:p>
+      <w:pPr>
+        <w:pStyle w:val="ListParagraph"/>
+        <w:numPr>
+          <w:ilvl w:val="0"/>
+          <w:numId w:val="2"/>
+        </w:numPr>
+        <w:spacing w:after="80"/>
+      </w:pPr>
+      <w:r>
+        <w:rPr>
+          <w:b w:val="false"/>
+          <w:bCs w:val="false"/>
+        </w:rPr>
+        <w:t xml:space="preserve">Ethics sign-off date (system-populated from Moodle)</w:t>
+      </w:r>
+    </w:p>
+    <w:p>
+      <w:pPr>
+        <w:pStyle w:val="ListParagraph"/>
+        <w:numPr>
+          <w:ilvl w:val="0"/>
+          <w:numId w:val="2"/>
+        </w:numPr>
+        <w:spacing w:after="80"/>
+      </w:pPr>
+      <w:r>
+        <w:rPr>
+          <w:b w:val="false"/>
+          <w:bCs w:val="false"/>
+        </w:rPr>
+        <w:t xml:space="preserve">Volunteer status — active / inactive / departed</w:t>
+      </w:r>
+    </w:p>
+    <w:p>
+      <w:pPr>
+        <w:pStyle w:val="ListParagraph"/>
+        <w:numPr>
+          <w:ilvl w:val="0"/>
+          <w:numId w:val="2"/>
+        </w:numPr>
+        <w:spacing w:after="80"/>
+      </w:pPr>
+      <w:r>
+        <w:rPr>
+          <w:b w:val="false"/>
+          <w:bCs w:val="false"/>
+        </w:rPr>
+        <w:t xml:space="preserve">Departure date and reason (if applicable)</w:t>
+      </w:r>
+    </w:p>
+    <w:p>
+      <w:r>
+        <w:t xml:space="preserve"/>
+      </w:r>
+    </w:p>
+    <w:p>
+      <w:pPr>
+        <w:pStyle w:val="Heading3"/>
+      </w:pPr>
+      <w:r>
+        <w:t xml:space="preserve">KPIs (system-calculated)</w:t>
+      </w:r>
+    </w:p>
+    <w:p>
+      <w:pPr>
+        <w:pStyle w:val="ListParagraph"/>
+        <w:numPr>
+          <w:ilvl w:val="0"/>
+          <w:numId w:val="2"/>
+        </w:numPr>
+        <w:spacing w:after="80"/>
+      </w:pPr>
+      <w:r>
+        <w:rPr>
+          <w:b w:val="false"/>
+          <w:bCs w:val="false"/>
+        </w:rPr>
+        <w:t xml:space="preserve">Total clients served — lifetime and per year</w:t>
+      </w:r>
+    </w:p>
+    <w:p>
+      <w:pPr>
+        <w:pStyle w:val="ListParagraph"/>
+        <w:numPr>
+          <w:ilvl w:val="0"/>
+          <w:numId w:val="2"/>
+        </w:numPr>
+        <w:spacing w:after="80"/>
+      </w:pPr>
+      <w:r>
+        <w:rPr>
+          <w:b w:val="false"/>
+          <w:bCs w:val="false"/>
+        </w:rPr>
+        <w:t xml:space="preserve">Total mentoring hours contributed</w:t>
+      </w:r>
+    </w:p>
+    <w:p>
+      <w:pPr>
+        <w:pStyle w:val="ListParagraph"/>
+        <w:numPr>
+          <w:ilvl w:val="0"/>
+          <w:numId w:val="2"/>
+        </w:numPr>
+        <w:spacing w:after="80"/>
+      </w:pPr>
+      <w:r>
+        <w:rPr>
+          <w:b w:val="false"/>
+          <w:bCs w:val="false"/>
+        </w:rPr>
+        <w:t xml:space="preserve">Workshop presentations delivered</w:t>
+      </w:r>
+    </w:p>
+    <w:p>
+      <w:pPr>
+        <w:pStyle w:val="ListParagraph"/>
+        <w:numPr>
+          <w:ilvl w:val="0"/>
+          <w:numId w:val="2"/>
+        </w:numPr>
+        <w:spacing w:after="80"/>
+      </w:pPr>
+      <w:r>
+        <w:rPr>
+          <w:b w:val="false"/>
+          <w:bCs w:val="false"/>
+        </w:rPr>
+        <w:t xml:space="preserve">Years of service with CBM</w:t>
+      </w:r>
+    </w:p>
+    <w:p>
+      <w:pPr>
+        <w:pStyle w:val="ListParagraph"/>
+        <w:numPr>
+          <w:ilvl w:val="0"/>
+          <w:numId w:val="2"/>
+        </w:numPr>
+        <w:spacing w:after="80"/>
+      </w:pPr>
+      <w:r>
+        <w:rPr>
+          <w:b w:val="false"/>
+          <w:bCs w:val="false"/>
+        </w:rPr>
+        <w:t xml:space="preserve">NPS scores received from clients</w:t>
       </w:r>
     </w:p>
     <w:p>

</xml_diff>

<commit_message>
Update CRM PRD v0.4 — NPS trigger cadence refined
Updated Section 12 NPS Tracking:
- After 2nd session: first NPS survey
- Every 5 sessions thereafter: recurring pulse check
- At engagement close: final NPS survey
Previously: trigger only at engagement close with optional mid-engagement trigger
</commit_message>
<xml_diff>
--- a/PRDs/CBM-PRD-CRM.docx
+++ b/PRDs/CBM-PRD-CRM.docx
@@ -3528,104 +3528,134 @@
     </w:p>
     <w:p>
       <w:pPr>
-        <w:pStyle w:val="ListParagraph"/>
-        <w:numPr>
-          <w:ilvl w:val="0"/>
-          <w:numId w:val="2"/>
-        </w:numPr>
-        <w:spacing w:after="80"/>
-      </w:pPr>
-      <w:r>
-        <w:rPr>
-          <w:b w:val="false"/>
-          <w:bCs w:val="false"/>
-        </w:rPr>
-        <w:t xml:space="preserve">NPS survey triggered automatically at engagement close</w:t>
-      </w:r>
-    </w:p>
-    <w:p>
-      <w:pPr>
-        <w:pStyle w:val="ListParagraph"/>
-        <w:numPr>
-          <w:ilvl w:val="0"/>
-          <w:numId w:val="2"/>
-        </w:numPr>
-        <w:spacing w:after="80"/>
-      </w:pPr>
-      <w:r>
-        <w:rPr>
-          <w:b w:val="false"/>
-          <w:bCs w:val="false"/>
-        </w:rPr>
-        <w:t xml:space="preserve">Optional mid-engagement trigger for longer engagements (configurable threshold)</w:t>
-      </w:r>
-    </w:p>
-    <w:p>
-      <w:pPr>
-        <w:pStyle w:val="ListParagraph"/>
-        <w:numPr>
-          <w:ilvl w:val="0"/>
-          <w:numId w:val="2"/>
-        </w:numPr>
-        <w:spacing w:after="80"/>
-      </w:pPr>
-      <w:r>
-        <w:rPr>
-          <w:b w:val="false"/>
-          <w:bCs w:val="false"/>
-        </w:rPr>
-        <w:t xml:space="preserve">Survey delivered via CRM-generated email with link to embedded form</w:t>
-      </w:r>
-    </w:p>
-    <w:p>
-      <w:pPr>
-        <w:pStyle w:val="ListParagraph"/>
-        <w:numPr>
-          <w:ilvl w:val="0"/>
-          <w:numId w:val="2"/>
-        </w:numPr>
-        <w:spacing w:after="80"/>
-      </w:pPr>
-      <w:r>
-        <w:rPr>
-          <w:b w:val="false"/>
-          <w:bCs w:val="false"/>
-        </w:rPr>
-        <w:t xml:space="preserve">Client submits score (0–10) and optional comment — no login required</w:t>
-      </w:r>
-    </w:p>
-    <w:p>
-      <w:pPr>
-        <w:pStyle w:val="ListParagraph"/>
-        <w:numPr>
-          <w:ilvl w:val="0"/>
-          <w:numId w:val="2"/>
-        </w:numPr>
-        <w:spacing w:after="80"/>
-      </w:pPr>
-      <w:r>
-        <w:rPr>
-          <w:b w:val="false"/>
-          <w:bCs w:val="false"/>
-        </w:rPr>
-        <w:t xml:space="preserve">Score recorded against client record in CRM</w:t>
-      </w:r>
-    </w:p>
-    <w:p>
-      <w:pPr>
-        <w:pStyle w:val="ListParagraph"/>
-        <w:numPr>
-          <w:ilvl w:val="0"/>
-          <w:numId w:val="2"/>
-        </w:numPr>
-        <w:spacing w:after="80"/>
-      </w:pPr>
-      <w:r>
-        <w:rPr>
-          <w:b w:val="false"/>
-          <w:bCs w:val="false"/>
-        </w:rPr>
-        <w:t xml:space="preserve">Aggregate NPS scores available in impact reporting dashboard</w:t>
+        <w:spacing w:after="120"/>
+      </w:pPr>
+      <w:r>
+        <w:t xml:space="preserve">NPS surveys are triggered automatically by EspoCRM workflow based on session count per engagement. This provides ongoing feedback throughout the relationship rather than a single end-point data point.</w:t>
+      </w:r>
+    </w:p>
+    <w:p>
+      <w:r>
+        <w:t xml:space="preserve"/>
+      </w:r>
+    </w:p>
+    <w:p>
+      <w:pPr>
+        <w:pStyle w:val="ListParagraph"/>
+        <w:numPr>
+          <w:ilvl w:val="0"/>
+          <w:numId w:val="2"/>
+        </w:numPr>
+        <w:spacing w:after="80"/>
+      </w:pPr>
+      <w:r>
+        <w:rPr>
+          <w:b w:val="false"/>
+          <w:bCs w:val="false"/>
+        </w:rPr>
+        <w:t xml:space="preserve">After 2nd session — first NPS survey triggered (sufficient sessions to form a meaningful impression)</w:t>
+      </w:r>
+    </w:p>
+    <w:p>
+      <w:pPr>
+        <w:pStyle w:val="ListParagraph"/>
+        <w:numPr>
+          <w:ilvl w:val="0"/>
+          <w:numId w:val="2"/>
+        </w:numPr>
+        <w:spacing w:after="80"/>
+      </w:pPr>
+      <w:r>
+        <w:rPr>
+          <w:b w:val="false"/>
+          <w:bCs w:val="false"/>
+        </w:rPr>
+        <w:t xml:space="preserve">Every 5 sessions thereafter — recurring pulse check (sessions 7, 12, 17, etc.)</w:t>
+      </w:r>
+    </w:p>
+    <w:p>
+      <w:pPr>
+        <w:pStyle w:val="ListParagraph"/>
+        <w:numPr>
+          <w:ilvl w:val="0"/>
+          <w:numId w:val="2"/>
+        </w:numPr>
+        <w:spacing w:after="80"/>
+      </w:pPr>
+      <w:r>
+        <w:rPr>
+          <w:b w:val="false"/>
+          <w:bCs w:val="false"/>
+        </w:rPr>
+        <w:t xml:space="preserve">At engagement close — final NPS survey</w:t>
+      </w:r>
+    </w:p>
+    <w:p>
+      <w:pPr>
+        <w:pStyle w:val="ListParagraph"/>
+        <w:numPr>
+          <w:ilvl w:val="0"/>
+          <w:numId w:val="2"/>
+        </w:numPr>
+        <w:spacing w:after="80"/>
+      </w:pPr>
+      <w:r>
+        <w:rPr>
+          <w:b w:val="false"/>
+          <w:bCs w:val="false"/>
+        </w:rPr>
+        <w:t xml:space="preserve">Survey delivered via CRM-generated email with link to embedded form — no client login required</w:t>
+      </w:r>
+    </w:p>
+    <w:p>
+      <w:pPr>
+        <w:pStyle w:val="ListParagraph"/>
+        <w:numPr>
+          <w:ilvl w:val="0"/>
+          <w:numId w:val="2"/>
+        </w:numPr>
+        <w:spacing w:after="80"/>
+      </w:pPr>
+      <w:r>
+        <w:rPr>
+          <w:b w:val="false"/>
+          <w:bCs w:val="false"/>
+        </w:rPr>
+        <w:t xml:space="preserve">Client submits score (0–10) and optional comment</w:t>
+      </w:r>
+    </w:p>
+    <w:p>
+      <w:pPr>
+        <w:pStyle w:val="ListParagraph"/>
+        <w:numPr>
+          <w:ilvl w:val="0"/>
+          <w:numId w:val="2"/>
+        </w:numPr>
+        <w:spacing w:after="80"/>
+      </w:pPr>
+      <w:r>
+        <w:rPr>
+          <w:b w:val="false"/>
+          <w:bCs w:val="false"/>
+        </w:rPr>
+        <w:t xml:space="preserve">Score and comment recorded against client engagement record in CRM</w:t>
+      </w:r>
+    </w:p>
+    <w:p>
+      <w:pPr>
+        <w:pStyle w:val="ListParagraph"/>
+        <w:numPr>
+          <w:ilvl w:val="0"/>
+          <w:numId w:val="2"/>
+        </w:numPr>
+        <w:spacing w:after="80"/>
+      </w:pPr>
+      <w:r>
+        <w:rPr>
+          <w:b w:val="false"/>
+          <w:bCs w:val="false"/>
+        </w:rPr>
+        <w:t xml:space="preserve">Aggregate NPS scores and trends available in impact reporting dashboard</w:t>
       </w:r>
     </w:p>
     <w:p>
@@ -3638,7 +3668,7 @@
           <w:iCs/>
           <w:color w:val="595959"/>
         </w:rPr>
-        <w:t xml:space="preserve">Note: If CRM-native NPS is insufficient, integrate LimeSurvey (FOSS) to post results back to CRM via API.</w:t>
+        <w:t xml:space="preserve">Note: If CRM-native NPS workflow is insufficient, integrate LimeSurvey (FOSS) to post results back to CRM via API.</w:t>
       </w:r>
     </w:p>
     <w:p>

</xml_diff>

<commit_message>
Update CRM PRD v0.4 — mentor email architecture defined
Replaced Section 9 Communication Requirements with full email architecture:
- Each mentor provisioned john.smith@clevelandbusinessmentors.org via Google Workspace
- Gmail connected to EspoCRM via OAuth (Google Integration extension)
- Personal Email Accounts per mentor — fully isolated inboxes
- Role permissions enforce privacy — mentors cannot see each other's email
- Bidirectional sync — mentor can use Gmail or EspoCRM interchangeably
- All emails auto-linked to client engagement records (single source of truth)
- Admin retains oversight visibility via elevated role permissions
- OAuth connection and signature setup added to mentor onboarding checklist
</commit_message>
<xml_diff>
--- a/PRDs/CBM-PRD-CRM.docx
+++ b/PRDs/CBM-PRD-CRM.docx
@@ -3215,87 +3215,244 @@
     </w:p>
     <w:p>
       <w:pPr>
-        <w:pStyle w:val="ListParagraph"/>
-        <w:numPr>
-          <w:ilvl w:val="0"/>
-          <w:numId w:val="2"/>
-        </w:numPr>
-        <w:spacing w:after="80"/>
-      </w:pPr>
-      <w:r>
-        <w:rPr>
-          <w:b w:val="false"/>
-          <w:bCs w:val="false"/>
-        </w:rPr>
-        <w:t xml:space="preserve">All mentor-client communication flows through CRM — no personal email accounts</w:t>
-      </w:r>
-    </w:p>
-    <w:p>
-      <w:pPr>
-        <w:pStyle w:val="ListParagraph"/>
-        <w:numPr>
-          <w:ilvl w:val="0"/>
-          <w:numId w:val="2"/>
-        </w:numPr>
-        <w:spacing w:after="80"/>
-      </w:pPr>
-      <w:r>
-        <w:rPr>
-          <w:b w:val="false"/>
-          <w:bCs w:val="false"/>
-        </w:rPr>
-        <w:t xml:space="preserve">Outbound emails sent from CRM with unique reply-to address per engagement</w:t>
-      </w:r>
-    </w:p>
-    <w:p>
-      <w:pPr>
-        <w:pStyle w:val="ListParagraph"/>
-        <w:numPr>
-          <w:ilvl w:val="0"/>
-          <w:numId w:val="2"/>
-        </w:numPr>
-        <w:spacing w:after="80"/>
-      </w:pPr>
-      <w:r>
-        <w:rPr>
-          <w:b w:val="false"/>
-          <w:bCs w:val="false"/>
-        </w:rPr>
-        <w:t xml:space="preserve">Inbound client replies captured automatically against engagement record (email threading)</w:t>
-      </w:r>
-    </w:p>
-    <w:p>
-      <w:pPr>
-        <w:pStyle w:val="ListParagraph"/>
-        <w:numPr>
-          <w:ilvl w:val="0"/>
-          <w:numId w:val="2"/>
-        </w:numPr>
-        <w:spacing w:after="80"/>
-      </w:pPr>
-      <w:r>
-        <w:rPr>
-          <w:b w:val="false"/>
-          <w:bCs w:val="false"/>
-        </w:rPr>
-        <w:t xml:space="preserve">Clients interact via normal email reply or email link to CRM form — no login required</w:t>
-      </w:r>
-    </w:p>
-    <w:p>
-      <w:pPr>
-        <w:pStyle w:val="ListParagraph"/>
-        <w:numPr>
-          <w:ilvl w:val="0"/>
-          <w:numId w:val="2"/>
-        </w:numPr>
-        <w:spacing w:after="80"/>
-      </w:pPr>
-      <w:r>
-        <w:rPr>
-          <w:b w:val="false"/>
-          <w:bCs w:val="false"/>
-        </w:rPr>
-        <w:t xml:space="preserve">Full communication history visible to assigned mentor and admin</w:t>
+        <w:pStyle w:val="Heading2"/>
+      </w:pPr>
+      <w:r>
+        <w:t xml:space="preserve">9.1 Mentor Email Architecture</w:t>
+      </w:r>
+    </w:p>
+    <w:p>
+      <w:pPr>
+        <w:spacing w:after="120"/>
+      </w:pPr>
+      <w:r>
+        <w:t xml:space="preserve">Each mentor is provisioned a personalized CBM email address (e.g., john.smith@clevelandbusinessmentors.org) via Google Workspace for Nonprofits. This address is connected to EspoCRM via OAuth using EspoCRM's official Google Integration extension, enabling bidirectional email sync while maintaining full privacy isolation between mentors.</w:t>
+      </w:r>
+    </w:p>
+    <w:p>
+      <w:r>
+        <w:t xml:space="preserve"/>
+      </w:r>
+    </w:p>
+    <w:p>
+      <w:pPr>
+        <w:pStyle w:val="Heading3"/>
+      </w:pPr>
+      <w:r>
+        <w:t xml:space="preserve">Provisioning</w:t>
+      </w:r>
+    </w:p>
+    <w:p>
+      <w:pPr>
+        <w:pStyle w:val="ListParagraph"/>
+        <w:numPr>
+          <w:ilvl w:val="0"/>
+          <w:numId w:val="2"/>
+        </w:numPr>
+        <w:spacing w:after="80"/>
+      </w:pPr>
+      <w:r>
+        <w:rPr>
+          <w:b w:val="false"/>
+          <w:bCs w:val="false"/>
+        </w:rPr>
+        <w:t xml:space="preserve">Each mentor receives a personalized john.smith@clevelandbusinessmentors.org Gmail account via Google Workspace for Nonprofits</w:t>
+      </w:r>
+    </w:p>
+    <w:p>
+      <w:pPr>
+        <w:pStyle w:val="ListParagraph"/>
+        <w:numPr>
+          <w:ilvl w:val="0"/>
+          <w:numId w:val="2"/>
+        </w:numPr>
+        <w:spacing w:after="80"/>
+      </w:pPr>
+      <w:r>
+        <w:rPr>
+          <w:b w:val="false"/>
+          <w:bCs w:val="false"/>
+        </w:rPr>
+        <w:t xml:space="preserve">EspoCRM Google Integration extension installed and configured by admin at setup</w:t>
+      </w:r>
+    </w:p>
+    <w:p>
+      <w:pPr>
+        <w:pStyle w:val="ListParagraph"/>
+        <w:numPr>
+          <w:ilvl w:val="0"/>
+          <w:numId w:val="2"/>
+        </w:numPr>
+        <w:spacing w:after="80"/>
+      </w:pPr>
+      <w:r>
+        <w:rPr>
+          <w:b w:val="false"/>
+          <w:bCs w:val="false"/>
+        </w:rPr>
+        <w:t xml:space="preserve">Each mentor completes OAuth connection during onboarding — connects their Gmail account to their EspoCRM Personal Email Account</w:t>
+      </w:r>
+    </w:p>
+    <w:p>
+      <w:pPr>
+        <w:pStyle w:val="ListParagraph"/>
+        <w:numPr>
+          <w:ilvl w:val="0"/>
+          <w:numId w:val="2"/>
+        </w:numPr>
+        <w:spacing w:after="80"/>
+      </w:pPr>
+      <w:r>
+        <w:rPr>
+          <w:b w:val="false"/>
+          <w:bCs w:val="false"/>
+        </w:rPr>
+        <w:t xml:space="preserve">Personalized signature block configured in both Gmail preferences and EspoCRM preferences during onboarding</w:t>
+      </w:r>
+    </w:p>
+    <w:p>
+      <w:r>
+        <w:t xml:space="preserve"/>
+      </w:r>
+    </w:p>
+    <w:p>
+      <w:pPr>
+        <w:pStyle w:val="Heading3"/>
+      </w:pPr>
+      <w:r>
+        <w:t xml:space="preserve">Email Flow</w:t>
+      </w:r>
+    </w:p>
+    <w:p>
+      <w:pPr>
+        <w:pStyle w:val="ListParagraph"/>
+        <w:numPr>
+          <w:ilvl w:val="0"/>
+          <w:numId w:val="2"/>
+        </w:numPr>
+        <w:spacing w:after="80"/>
+      </w:pPr>
+      <w:r>
+        <w:rPr>
+          <w:b w:val="false"/>
+          <w:bCs w:val="false"/>
+        </w:rPr>
+        <w:t xml:space="preserve">Mentors may compose and reply from either Gmail or EspoCRM — both are valid interfaces</w:t>
+      </w:r>
+    </w:p>
+    <w:p>
+      <w:pPr>
+        <w:pStyle w:val="ListParagraph"/>
+        <w:numPr>
+          <w:ilvl w:val="0"/>
+          <w:numId w:val="2"/>
+        </w:numPr>
+        <w:spacing w:after="80"/>
+      </w:pPr>
+      <w:r>
+        <w:rPr>
+          <w:b w:val="false"/>
+          <w:bCs w:val="false"/>
+        </w:rPr>
+        <w:t xml:space="preserve">All mentor-client emails automatically synced into EspoCRM and linked to the client engagement record</w:t>
+      </w:r>
+    </w:p>
+    <w:p>
+      <w:pPr>
+        <w:pStyle w:val="ListParagraph"/>
+        <w:numPr>
+          <w:ilvl w:val="0"/>
+          <w:numId w:val="2"/>
+        </w:numPr>
+        <w:spacing w:after="80"/>
+      </w:pPr>
+      <w:r>
+        <w:rPr>
+          <w:b w:val="false"/>
+          <w:bCs w:val="false"/>
+        </w:rPr>
+        <w:t xml:space="preserve">Inbound client replies captured automatically against the engagement record</w:t>
+      </w:r>
+    </w:p>
+    <w:p>
+      <w:pPr>
+        <w:pStyle w:val="ListParagraph"/>
+        <w:numPr>
+          <w:ilvl w:val="0"/>
+          <w:numId w:val="2"/>
+        </w:numPr>
+        <w:spacing w:after="80"/>
+      </w:pPr>
+      <w:r>
+        <w:rPr>
+          <w:b w:val="false"/>
+          <w:bCs w:val="false"/>
+        </w:rPr>
+        <w:t xml:space="preserve">Clients interact via normal email reply — no login required</w:t>
+      </w:r>
+    </w:p>
+    <w:p>
+      <w:pPr>
+        <w:pStyle w:val="ListParagraph"/>
+        <w:numPr>
+          <w:ilvl w:val="0"/>
+          <w:numId w:val="2"/>
+        </w:numPr>
+        <w:spacing w:after="80"/>
+      </w:pPr>
+      <w:r>
+        <w:rPr>
+          <w:b w:val="false"/>
+          <w:bCs w:val="false"/>
+        </w:rPr>
+        <w:t xml:space="preserve">Full communication history maintained in EspoCRM against each engagement record — single source of truth</w:t>
+      </w:r>
+    </w:p>
+    <w:p>
+      <w:r>
+        <w:t xml:space="preserve"/>
+      </w:r>
+    </w:p>
+    <w:p>
+      <w:pPr>
+        <w:pStyle w:val="Heading3"/>
+      </w:pPr>
+      <w:r>
+        <w:t xml:space="preserve">Privacy &amp; Access</w:t>
+      </w:r>
+    </w:p>
+    <w:p>
+      <w:pPr>
+        <w:pStyle w:val="ListParagraph"/>
+        <w:numPr>
+          <w:ilvl w:val="0"/>
+          <w:numId w:val="2"/>
+        </w:numPr>
+        <w:spacing w:after="80"/>
+      </w:pPr>
+      <w:r>
+        <w:rPr>
+          <w:b w:val="false"/>
+          <w:bCs w:val="false"/>
+        </w:rPr>
+        <w:t xml:space="preserve">Each mentor's inbox is fully isolated — Personal Email Accounts are per-user by design</w:t>
+      </w:r>
+    </w:p>
+    <w:p>
+      <w:pPr>
+        <w:pStyle w:val="ListParagraph"/>
+        <w:numPr>
+          <w:ilvl w:val="0"/>
+          <w:numId w:val="2"/>
+        </w:numPr>
+        <w:spacing w:after="80"/>
+      </w:pPr>
+      <w:r>
+        <w:rPr>
+          <w:b w:val="false"/>
+          <w:bCs w:val="false"/>
+        </w:rPr>
+        <w:t xml:space="preserve">Role permissions prevent mentors from viewing other mentors' emails</w:t>
       </w:r>
     </w:p>
     <w:p>
@@ -3313,6 +3470,87 @@
           <w:bCs w:val="false"/>
         </w:rPr>
         <w:t xml:space="preserve">Mentor access scoped to own clients only — cannot see other engagements</w:t>
+      </w:r>
+    </w:p>
+    <w:p>
+      <w:pPr>
+        <w:pStyle w:val="ListParagraph"/>
+        <w:numPr>
+          <w:ilvl w:val="0"/>
+          <w:numId w:val="2"/>
+        </w:numPr>
+        <w:spacing w:after="80"/>
+      </w:pPr>
+      <w:r>
+        <w:rPr>
+          <w:b w:val="false"/>
+          <w:bCs w:val="false"/>
+        </w:rPr>
+        <w:t xml:space="preserve">Admin retains visibility into all communications via elevated role permissions for oversight</w:t>
+      </w:r>
+    </w:p>
+    <w:p>
+      <w:r>
+        <w:t xml:space="preserve"/>
+      </w:r>
+    </w:p>
+    <w:p>
+      <w:pPr>
+        <w:pStyle w:val="Heading3"/>
+      </w:pPr>
+      <w:r>
+        <w:t xml:space="preserve">Onboarding Checklist Addition</w:t>
+      </w:r>
+    </w:p>
+    <w:p>
+      <w:pPr>
+        <w:pStyle w:val="ListParagraph"/>
+        <w:numPr>
+          <w:ilvl w:val="0"/>
+          <w:numId w:val="2"/>
+        </w:numPr>
+        <w:spacing w:after="80"/>
+      </w:pPr>
+      <w:r>
+        <w:rPr>
+          <w:b w:val="false"/>
+          <w:bCs w:val="false"/>
+        </w:rPr>
+        <w:t xml:space="preserve">Gmail account provisioned and Google Workspace setup completed</w:t>
+      </w:r>
+    </w:p>
+    <w:p>
+      <w:pPr>
+        <w:pStyle w:val="ListParagraph"/>
+        <w:numPr>
+          <w:ilvl w:val="0"/>
+          <w:numId w:val="2"/>
+        </w:numPr>
+        <w:spacing w:after="80"/>
+      </w:pPr>
+      <w:r>
+        <w:rPr>
+          <w:b w:val="false"/>
+          <w:bCs w:val="false"/>
+        </w:rPr>
+        <w:t xml:space="preserve">OAuth connection between Gmail and EspoCRM completed by mentor during onboarding</w:t>
+      </w:r>
+    </w:p>
+    <w:p>
+      <w:pPr>
+        <w:pStyle w:val="ListParagraph"/>
+        <w:numPr>
+          <w:ilvl w:val="0"/>
+          <w:numId w:val="2"/>
+        </w:numPr>
+        <w:spacing w:after="80"/>
+      </w:pPr>
+      <w:r>
+        <w:rPr>
+          <w:b w:val="false"/>
+          <w:bCs w:val="false"/>
+        </w:rPr>
+        <w:t xml:space="preserve">Personalized signature block configured in Gmail and EspoCRM</w:t>
       </w:r>
     </w:p>
     <w:p>

</xml_diff>

<commit_message>
Update CRM PRD v0.4 — add provisional mentor state and activation workflow
Added Section 6 Volunteer Status Lifecycle:
- Four states: provisional / active / inactive / departed
- Status table with client assignment eligibility per state
- 7-step Provisional → Active activation workflow
- Manual admin activation step required after Moodle completion
- Note: automated activation deferred to future phase

Updated Section 5.1 volunteer status field: active/inactive/departed → provisional/active/inactive/departed

Renumbered all subsequent sections (6→7 through 16→17) to accommodate new section.
</commit_message>
<xml_diff>
--- a/PRDs/CBM-PRD-CRM.docx
+++ b/PRDs/CBM-PRD-CRM.docx
@@ -1886,7 +1886,7 @@
           <w:b w:val="false"/>
           <w:bCs w:val="false"/>
         </w:rPr>
-        <w:t xml:space="preserve">Volunteer status — active / inactive / departed</w:t>
+        <w:t xml:space="preserve">Volunteer status — provisional / active / inactive / departed</w:t>
       </w:r>
     </w:p>
     <w:p>
@@ -2014,7 +2014,485 @@
         <w:pStyle w:val="Heading1"/>
       </w:pPr>
       <w:r>
-        <w:t xml:space="preserve">6. Mentor-Client Matching</w:t>
+        <w:t xml:space="preserve">6. Volunteer Status Lifecycle</w:t>
+      </w:r>
+    </w:p>
+    <w:p>
+      <w:pPr>
+        <w:spacing w:after="120"/>
+      </w:pPr>
+      <w:r>
+        <w:t xml:space="preserve">Volunteer status progresses through four states. Only Active mentors are eligible for client assignment.</w:t>
+      </w:r>
+    </w:p>
+    <w:p>
+      <w:r>
+        <w:t xml:space="preserve"/>
+      </w:r>
+    </w:p>
+    <w:tbl>
+      <w:tblPr>
+        <w:tblW w:type="dxa" w:w="8000"/>
+        <w:tblBorders>
+          <w:top w:val="single" w:color="auto" w:sz="4"/>
+          <w:left w:val="single" w:color="auto" w:sz="4"/>
+          <w:bottom w:val="single" w:color="auto" w:sz="4"/>
+          <w:right w:val="single" w:color="auto" w:sz="4"/>
+          <w:insideH w:val="single" w:color="auto" w:sz="4"/>
+          <w:insideV w:val="single" w:color="auto" w:sz="4"/>
+        </w:tblBorders>
+      </w:tblPr>
+      <w:tblGrid>
+        <w:gridCol w:w="1800"/>
+        <w:gridCol w:w="3800"/>
+        <w:gridCol w:w="2400"/>
+      </w:tblGrid>
+      <w:tr>
+        <w:trPr>
+          <w:tblHeader/>
+        </w:trPr>
+        <w:tc>
+          <w:tcPr>
+            <w:tcW w:type="dxa" w:w="1800"/>
+            <w:tcBorders>
+              <w:top w:val="single" w:color="CCCCCC" w:sz="1"/>
+              <w:left w:val="single" w:color="CCCCCC" w:sz="1"/>
+              <w:bottom w:val="single" w:color="CCCCCC" w:sz="1"/>
+              <w:right w:val="single" w:color="CCCCCC" w:sz="1"/>
+            </w:tcBorders>
+            <w:shd w:fill="1F4E79" w:val="clear"/>
+            <w:tcMar>
+              <w:top w:type="dxa" w:w="80"/>
+              <w:left w:type="dxa" w:w="120"/>
+              <w:bottom w:type="dxa" w:w="80"/>
+              <w:right w:type="dxa" w:w="120"/>
+            </w:tcMar>
+          </w:tcPr>
+          <w:p>
+            <w:r>
+              <w:rPr>
+                <w:rFonts w:ascii="Arial" w:cs="Arial" w:eastAsia="Arial" w:hAnsi="Arial"/>
+                <w:b/>
+                <w:bCs/>
+                <w:color w:val="FFFFFF"/>
+                <w:sz w:val="20"/>
+                <w:szCs w:val="20"/>
+              </w:rPr>
+              <w:t xml:space="preserve">Status</w:t>
+            </w:r>
+          </w:p>
+        </w:tc>
+        <w:tc>
+          <w:tcPr>
+            <w:tcW w:type="dxa" w:w="3800"/>
+            <w:tcBorders>
+              <w:top w:val="single" w:color="CCCCCC" w:sz="1"/>
+              <w:left w:val="single" w:color="CCCCCC" w:sz="1"/>
+              <w:bottom w:val="single" w:color="CCCCCC" w:sz="1"/>
+              <w:right w:val="single" w:color="CCCCCC" w:sz="1"/>
+            </w:tcBorders>
+            <w:shd w:fill="1F4E79" w:val="clear"/>
+            <w:tcMar>
+              <w:top w:type="dxa" w:w="80"/>
+              <w:left w:type="dxa" w:w="120"/>
+              <w:bottom w:type="dxa" w:w="80"/>
+              <w:right w:type="dxa" w:w="120"/>
+            </w:tcMar>
+          </w:tcPr>
+          <w:p>
+            <w:r>
+              <w:rPr>
+                <w:rFonts w:ascii="Arial" w:cs="Arial" w:eastAsia="Arial" w:hAnsi="Arial"/>
+                <w:b/>
+                <w:bCs/>
+                <w:color w:val="FFFFFF"/>
+                <w:sz w:val="20"/>
+                <w:szCs w:val="20"/>
+              </w:rPr>
+              <w:t xml:space="preserve">Description</w:t>
+            </w:r>
+          </w:p>
+        </w:tc>
+        <w:tc>
+          <w:tcPr>
+            <w:tcW w:type="dxa" w:w="2400"/>
+            <w:tcBorders>
+              <w:top w:val="single" w:color="CCCCCC" w:sz="1"/>
+              <w:left w:val="single" w:color="CCCCCC" w:sz="1"/>
+              <w:bottom w:val="single" w:color="CCCCCC" w:sz="1"/>
+              <w:right w:val="single" w:color="CCCCCC" w:sz="1"/>
+            </w:tcBorders>
+            <w:shd w:fill="1F4E79" w:val="clear"/>
+            <w:tcMar>
+              <w:top w:type="dxa" w:w="80"/>
+              <w:left w:type="dxa" w:w="120"/>
+              <w:bottom w:type="dxa" w:w="80"/>
+              <w:right w:type="dxa" w:w="120"/>
+            </w:tcMar>
+          </w:tcPr>
+          <w:p>
+            <w:r>
+              <w:rPr>
+                <w:rFonts w:ascii="Arial" w:cs="Arial" w:eastAsia="Arial" w:hAnsi="Arial"/>
+                <w:b/>
+                <w:bCs/>
+                <w:color w:val="FFFFFF"/>
+                <w:sz w:val="20"/>
+                <w:szCs w:val="20"/>
+              </w:rPr>
+              <w:t xml:space="preserve">Client Assignment Eligible?</w:t>
+            </w:r>
+          </w:p>
+        </w:tc>
+      </w:tr>
+      <w:tr>
+        <w:tc>
+          <w:tcPr>
+            <w:tcW w:type="dxa" w:w="1800"/>
+            <w:tcBorders>
+              <w:top w:val="single" w:color="CCCCCC" w:sz="1"/>
+              <w:left w:val="single" w:color="CCCCCC" w:sz="1"/>
+              <w:bottom w:val="single" w:color="CCCCCC" w:sz="1"/>
+              <w:right w:val="single" w:color="CCCCCC" w:sz="1"/>
+            </w:tcBorders>
+            <w:shd w:fill="FFFFFF" w:val="clear"/>
+            <w:tcMar>
+              <w:top w:type="dxa" w:w="80"/>
+              <w:left w:type="dxa" w:w="120"/>
+              <w:bottom w:type="dxa" w:w="80"/>
+              <w:right w:type="dxa" w:w="120"/>
+            </w:tcMar>
+          </w:tcPr>
+          <w:p>
+            <w:r>
+              <w:rPr>
+                <w:rFonts w:ascii="Arial" w:cs="Arial" w:eastAsia="Arial" w:hAnsi="Arial"/>
+                <w:sz w:val="20"/>
+                <w:szCs w:val="20"/>
+              </w:rPr>
+              <w:t xml:space="preserve">Provisional</w:t>
+            </w:r>
+          </w:p>
+        </w:tc>
+        <w:tc>
+          <w:tcPr>
+            <w:tcW w:type="dxa" w:w="3800"/>
+            <w:tcBorders>
+              <w:top w:val="single" w:color="CCCCCC" w:sz="1"/>
+              <w:left w:val="single" w:color="CCCCCC" w:sz="1"/>
+              <w:bottom w:val="single" w:color="CCCCCC" w:sz="1"/>
+              <w:right w:val="single" w:color="CCCCCC" w:sz="1"/>
+            </w:tcBorders>
+            <w:shd w:fill="FFFFFF" w:val="clear"/>
+            <w:tcMar>
+              <w:top w:type="dxa" w:w="80"/>
+              <w:left w:type="dxa" w:w="120"/>
+              <w:bottom w:type="dxa" w:w="80"/>
+              <w:right w:type="dxa" w:w="120"/>
+            </w:tcMar>
+          </w:tcPr>
+          <w:p>
+            <w:r>
+              <w:rPr>
+                <w:rFonts w:ascii="Arial" w:cs="Arial" w:eastAsia="Arial" w:hAnsi="Arial"/>
+                <w:sz w:val="20"/>
+                <w:szCs w:val="20"/>
+              </w:rPr>
+              <w:t xml:space="preserve">Registered but training not yet complete. Awaiting admin approval.</w:t>
+            </w:r>
+          </w:p>
+        </w:tc>
+        <w:tc>
+          <w:tcPr>
+            <w:tcW w:type="dxa" w:w="2400"/>
+            <w:tcBorders>
+              <w:top w:val="single" w:color="CCCCCC" w:sz="1"/>
+              <w:left w:val="single" w:color="CCCCCC" w:sz="1"/>
+              <w:bottom w:val="single" w:color="CCCCCC" w:sz="1"/>
+              <w:right w:val="single" w:color="CCCCCC" w:sz="1"/>
+            </w:tcBorders>
+            <w:shd w:fill="FFFFFF" w:val="clear"/>
+            <w:tcMar>
+              <w:top w:type="dxa" w:w="80"/>
+              <w:left w:type="dxa" w:w="120"/>
+              <w:bottom w:type="dxa" w:w="80"/>
+              <w:right w:type="dxa" w:w="120"/>
+            </w:tcMar>
+          </w:tcPr>
+          <w:p>
+            <w:r>
+              <w:rPr>
+                <w:rFonts w:ascii="Arial" w:cs="Arial" w:eastAsia="Arial" w:hAnsi="Arial"/>
+                <w:sz w:val="20"/>
+                <w:szCs w:val="20"/>
+              </w:rPr>
+              <w:t xml:space="preserve">No</w:t>
+            </w:r>
+          </w:p>
+        </w:tc>
+      </w:tr>
+      <w:tr>
+        <w:tc>
+          <w:tcPr>
+            <w:tcW w:type="dxa" w:w="1800"/>
+            <w:tcBorders>
+              <w:top w:val="single" w:color="CCCCCC" w:sz="1"/>
+              <w:left w:val="single" w:color="CCCCCC" w:sz="1"/>
+              <w:bottom w:val="single" w:color="CCCCCC" w:sz="1"/>
+              <w:right w:val="single" w:color="CCCCCC" w:sz="1"/>
+            </w:tcBorders>
+            <w:shd w:fill="F2F2F2" w:val="clear"/>
+            <w:tcMar>
+              <w:top w:type="dxa" w:w="80"/>
+              <w:left w:type="dxa" w:w="120"/>
+              <w:bottom w:type="dxa" w:w="80"/>
+              <w:right w:type="dxa" w:w="120"/>
+            </w:tcMar>
+          </w:tcPr>
+          <w:p>
+            <w:r>
+              <w:rPr>
+                <w:rFonts w:ascii="Arial" w:cs="Arial" w:eastAsia="Arial" w:hAnsi="Arial"/>
+                <w:sz w:val="20"/>
+                <w:szCs w:val="20"/>
+              </w:rPr>
+              <w:t xml:space="preserve">Active</w:t>
+            </w:r>
+          </w:p>
+        </w:tc>
+        <w:tc>
+          <w:tcPr>
+            <w:tcW w:type="dxa" w:w="3800"/>
+            <w:tcBorders>
+              <w:top w:val="single" w:color="CCCCCC" w:sz="1"/>
+              <w:left w:val="single" w:color="CCCCCC" w:sz="1"/>
+              <w:bottom w:val="single" w:color="CCCCCC" w:sz="1"/>
+              <w:right w:val="single" w:color="CCCCCC" w:sz="1"/>
+            </w:tcBorders>
+            <w:shd w:fill="F2F2F2" w:val="clear"/>
+            <w:tcMar>
+              <w:top w:type="dxa" w:w="80"/>
+              <w:left w:type="dxa" w:w="120"/>
+              <w:bottom w:type="dxa" w:w="80"/>
+              <w:right w:type="dxa" w:w="120"/>
+            </w:tcMar>
+          </w:tcPr>
+          <w:p>
+            <w:r>
+              <w:rPr>
+                <w:rFonts w:ascii="Arial" w:cs="Arial" w:eastAsia="Arial" w:hAnsi="Arial"/>
+                <w:sz w:val="20"/>
+                <w:szCs w:val="20"/>
+              </w:rPr>
+              <w:t xml:space="preserve">Training complete, ethics sign-off recorded, admin approved. Eligible for clients.</w:t>
+            </w:r>
+          </w:p>
+        </w:tc>
+        <w:tc>
+          <w:tcPr>
+            <w:tcW w:type="dxa" w:w="2400"/>
+            <w:tcBorders>
+              <w:top w:val="single" w:color="CCCCCC" w:sz="1"/>
+              <w:left w:val="single" w:color="CCCCCC" w:sz="1"/>
+              <w:bottom w:val="single" w:color="CCCCCC" w:sz="1"/>
+              <w:right w:val="single" w:color="CCCCCC" w:sz="1"/>
+            </w:tcBorders>
+            <w:shd w:fill="F2F2F2" w:val="clear"/>
+            <w:tcMar>
+              <w:top w:type="dxa" w:w="80"/>
+              <w:left w:type="dxa" w:w="120"/>
+              <w:bottom w:type="dxa" w:w="80"/>
+              <w:right w:type="dxa" w:w="120"/>
+            </w:tcMar>
+          </w:tcPr>
+          <w:p>
+            <w:r>
+              <w:rPr>
+                <w:rFonts w:ascii="Arial" w:cs="Arial" w:eastAsia="Arial" w:hAnsi="Arial"/>
+                <w:sz w:val="20"/>
+                <w:szCs w:val="20"/>
+              </w:rPr>
+              <w:t xml:space="preserve">Yes</w:t>
+            </w:r>
+          </w:p>
+        </w:tc>
+      </w:tr>
+      <w:tr>
+        <w:tc>
+          <w:tcPr>
+            <w:tcW w:type="dxa" w:w="1800"/>
+            <w:tcBorders>
+              <w:top w:val="single" w:color="CCCCCC" w:sz="1"/>
+              <w:left w:val="single" w:color="CCCCCC" w:sz="1"/>
+              <w:bottom w:val="single" w:color="CCCCCC" w:sz="1"/>
+              <w:right w:val="single" w:color="CCCCCC" w:sz="1"/>
+            </w:tcBorders>
+            <w:shd w:fill="FFFFFF" w:val="clear"/>
+            <w:tcMar>
+              <w:top w:type="dxa" w:w="80"/>
+              <w:left w:type="dxa" w:w="120"/>
+              <w:bottom w:type="dxa" w:w="80"/>
+              <w:right w:type="dxa" w:w="120"/>
+            </w:tcMar>
+          </w:tcPr>
+          <w:p>
+            <w:r>
+              <w:rPr>
+                <w:rFonts w:ascii="Arial" w:cs="Arial" w:eastAsia="Arial" w:hAnsi="Arial"/>
+                <w:sz w:val="20"/>
+                <w:szCs w:val="20"/>
+              </w:rPr>
+              <w:t xml:space="preserve">Inactive</w:t>
+            </w:r>
+          </w:p>
+        </w:tc>
+        <w:tc>
+          <w:tcPr>
+            <w:tcW w:type="dxa" w:w="3800"/>
+            <w:tcBorders>
+              <w:top w:val="single" w:color="CCCCCC" w:sz="1"/>
+              <w:left w:val="single" w:color="CCCCCC" w:sz="1"/>
+              <w:bottom w:val="single" w:color="CCCCCC" w:sz="1"/>
+              <w:right w:val="single" w:color="CCCCCC" w:sz="1"/>
+            </w:tcBorders>
+            <w:shd w:fill="FFFFFF" w:val="clear"/>
+            <w:tcMar>
+              <w:top w:type="dxa" w:w="80"/>
+              <w:left w:type="dxa" w:w="120"/>
+              <w:bottom w:type="dxa" w:w="80"/>
+              <w:right w:type="dxa" w:w="120"/>
+            </w:tcMar>
+          </w:tcPr>
+          <w:p>
+            <w:r>
+              <w:rPr>
+                <w:rFonts w:ascii="Arial" w:cs="Arial" w:eastAsia="Arial" w:hAnsi="Arial"/>
+                <w:sz w:val="20"/>
+                <w:szCs w:val="20"/>
+              </w:rPr>
+              <w:t xml:space="preserve">Temporarily not accepting clients but still affiliated with CBM.</w:t>
+            </w:r>
+          </w:p>
+        </w:tc>
+        <w:tc>
+          <w:tcPr>
+            <w:tcW w:type="dxa" w:w="2400"/>
+            <w:tcBorders>
+              <w:top w:val="single" w:color="CCCCCC" w:sz="1"/>
+              <w:left w:val="single" w:color="CCCCCC" w:sz="1"/>
+              <w:bottom w:val="single" w:color="CCCCCC" w:sz="1"/>
+              <w:right w:val="single" w:color="CCCCCC" w:sz="1"/>
+            </w:tcBorders>
+            <w:shd w:fill="FFFFFF" w:val="clear"/>
+            <w:tcMar>
+              <w:top w:type="dxa" w:w="80"/>
+              <w:left w:type="dxa" w:w="120"/>
+              <w:bottom w:type="dxa" w:w="80"/>
+              <w:right w:type="dxa" w:w="120"/>
+            </w:tcMar>
+          </w:tcPr>
+          <w:p>
+            <w:r>
+              <w:rPr>
+                <w:rFonts w:ascii="Arial" w:cs="Arial" w:eastAsia="Arial" w:hAnsi="Arial"/>
+                <w:sz w:val="20"/>
+                <w:szCs w:val="20"/>
+              </w:rPr>
+              <w:t xml:space="preserve">No</w:t>
+            </w:r>
+          </w:p>
+        </w:tc>
+      </w:tr>
+      <w:tr>
+        <w:tc>
+          <w:tcPr>
+            <w:tcW w:type="dxa" w:w="1800"/>
+            <w:tcBorders>
+              <w:top w:val="single" w:color="CCCCCC" w:sz="1"/>
+              <w:left w:val="single" w:color="CCCCCC" w:sz="1"/>
+              <w:bottom w:val="single" w:color="CCCCCC" w:sz="1"/>
+              <w:right w:val="single" w:color="CCCCCC" w:sz="1"/>
+            </w:tcBorders>
+            <w:shd w:fill="F2F2F2" w:val="clear"/>
+            <w:tcMar>
+              <w:top w:type="dxa" w:w="80"/>
+              <w:left w:type="dxa" w:w="120"/>
+              <w:bottom w:type="dxa" w:w="80"/>
+              <w:right w:type="dxa" w:w="120"/>
+            </w:tcMar>
+          </w:tcPr>
+          <w:p>
+            <w:r>
+              <w:rPr>
+                <w:rFonts w:ascii="Arial" w:cs="Arial" w:eastAsia="Arial" w:hAnsi="Arial"/>
+                <w:sz w:val="20"/>
+                <w:szCs w:val="20"/>
+              </w:rPr>
+              <w:t xml:space="preserve">Departed</w:t>
+            </w:r>
+          </w:p>
+        </w:tc>
+        <w:tc>
+          <w:tcPr>
+            <w:tcW w:type="dxa" w:w="3800"/>
+            <w:tcBorders>
+              <w:top w:val="single" w:color="CCCCCC" w:sz="1"/>
+              <w:left w:val="single" w:color="CCCCCC" w:sz="1"/>
+              <w:bottom w:val="single" w:color="CCCCCC" w:sz="1"/>
+              <w:right w:val="single" w:color="CCCCCC" w:sz="1"/>
+            </w:tcBorders>
+            <w:shd w:fill="F2F2F2" w:val="clear"/>
+            <w:tcMar>
+              <w:top w:type="dxa" w:w="80"/>
+              <w:left w:type="dxa" w:w="120"/>
+              <w:bottom w:type="dxa" w:w="80"/>
+              <w:right w:type="dxa" w:w="120"/>
+            </w:tcMar>
+          </w:tcPr>
+          <w:p>
+            <w:r>
+              <w:rPr>
+                <w:rFonts w:ascii="Arial" w:cs="Arial" w:eastAsia="Arial" w:hAnsi="Arial"/>
+                <w:sz w:val="20"/>
+                <w:szCs w:val="20"/>
+              </w:rPr>
+              <w:t xml:space="preserve">No longer with CBM. Profile retained per data retention policy.</w:t>
+            </w:r>
+          </w:p>
+        </w:tc>
+        <w:tc>
+          <w:tcPr>
+            <w:tcW w:type="dxa" w:w="2400"/>
+            <w:tcBorders>
+              <w:top w:val="single" w:color="CCCCCC" w:sz="1"/>
+              <w:left w:val="single" w:color="CCCCCC" w:sz="1"/>
+              <w:bottom w:val="single" w:color="CCCCCC" w:sz="1"/>
+              <w:right w:val="single" w:color="CCCCCC" w:sz="1"/>
+            </w:tcBorders>
+            <w:shd w:fill="F2F2F2" w:val="clear"/>
+            <w:tcMar>
+              <w:top w:type="dxa" w:w="80"/>
+              <w:left w:type="dxa" w:w="120"/>
+              <w:bottom w:type="dxa" w:w="80"/>
+              <w:right w:type="dxa" w:w="120"/>
+            </w:tcMar>
+          </w:tcPr>
+          <w:p>
+            <w:r>
+              <w:rPr>
+                <w:rFonts w:ascii="Arial" w:cs="Arial" w:eastAsia="Arial" w:hAnsi="Arial"/>
+                <w:sz w:val="20"/>
+                <w:szCs w:val="20"/>
+              </w:rPr>
+              <w:t xml:space="preserve">No</w:t>
+            </w:r>
+          </w:p>
+        </w:tc>
+      </w:tr>
+    </w:tbl>
+    <w:p>
+      <w:r>
+        <w:t xml:space="preserve"/>
       </w:r>
     </w:p>
     <w:p>
@@ -2022,7 +2500,137 @@
         <w:pStyle w:val="Heading2"/>
       </w:pPr>
       <w:r>
-        <w:t xml:space="preserve">6.1 Phase 1 — Manual Assignment (Launch)</w:t>
+        <w:t xml:space="preserve">6.1 Provisional → Active Activation Workflow</w:t>
+      </w:r>
+    </w:p>
+    <w:p>
+      <w:pPr>
+        <w:pStyle w:val="ListParagraph"/>
+        <w:numPr>
+          <w:ilvl w:val="0"/>
+          <w:numId w:val="3"/>
+        </w:numPr>
+        <w:spacing w:after="80"/>
+      </w:pPr>
+      <w:r>
+        <w:t xml:space="preserve">Mentor submits registration — EspoCRM profile created with status set to Provisional automatically</w:t>
+      </w:r>
+    </w:p>
+    <w:p>
+      <w:pPr>
+        <w:pStyle w:val="ListParagraph"/>
+        <w:numPr>
+          <w:ilvl w:val="0"/>
+          <w:numId w:val="3"/>
+        </w:numPr>
+        <w:spacing w:after="80"/>
+      </w:pPr>
+      <w:r>
+        <w:t xml:space="preserve">Mentor enrolled in Moodle onboarding curriculum — required modules assigned</w:t>
+      </w:r>
+    </w:p>
+    <w:p>
+      <w:pPr>
+        <w:pStyle w:val="ListParagraph"/>
+        <w:numPr>
+          <w:ilvl w:val="0"/>
+          <w:numId w:val="3"/>
+        </w:numPr>
+        <w:spacing w:after="80"/>
+      </w:pPr>
+      <w:r>
+        <w:t xml:space="preserve">Mentor completes all required modules including ethics sign-off checkbox</w:t>
+      </w:r>
+    </w:p>
+    <w:p>
+      <w:pPr>
+        <w:pStyle w:val="ListParagraph"/>
+        <w:numPr>
+          <w:ilvl w:val="0"/>
+          <w:numId w:val="3"/>
+        </w:numPr>
+        <w:spacing w:after="80"/>
+      </w:pPr>
+      <w:r>
+        <w:t xml:space="preserve">Moodle completion triggers notification to admin — status does NOT change automatically</w:t>
+      </w:r>
+    </w:p>
+    <w:p>
+      <w:pPr>
+        <w:pStyle w:val="ListParagraph"/>
+        <w:numPr>
+          <w:ilvl w:val="0"/>
+          <w:numId w:val="3"/>
+        </w:numPr>
+        <w:spacing w:after="80"/>
+      </w:pPr>
+      <w:r>
+        <w:t xml:space="preserve">Admin reviews completion record, conducts any final vetting</w:t>
+      </w:r>
+    </w:p>
+    <w:p>
+      <w:pPr>
+        <w:pStyle w:val="ListParagraph"/>
+        <w:numPr>
+          <w:ilvl w:val="0"/>
+          <w:numId w:val="3"/>
+        </w:numPr>
+        <w:spacing w:after="80"/>
+      </w:pPr>
+      <w:r>
+        <w:t xml:space="preserve">Admin manually sets status to Active in EspoCRM</w:t>
+      </w:r>
+    </w:p>
+    <w:p>
+      <w:pPr>
+        <w:pStyle w:val="ListParagraph"/>
+        <w:numPr>
+          <w:ilvl w:val="0"/>
+          <w:numId w:val="3"/>
+        </w:numPr>
+        <w:spacing w:after="80"/>
+      </w:pPr>
+      <w:r>
+        <w:t xml:space="preserve">Mentor profile becomes eligible for client assignment — accepting clients toggle becomes available</w:t>
+      </w:r>
+    </w:p>
+    <w:p>
+      <w:r>
+        <w:t xml:space="preserve"/>
+      </w:r>
+    </w:p>
+    <w:p>
+      <w:pPr>
+        <w:spacing w:after="120"/>
+      </w:pPr>
+      <w:r>
+        <w:rPr>
+          <w:i/>
+          <w:iCs/>
+          <w:color w:val="595959"/>
+        </w:rPr>
+        <w:t xml:space="preserve">Note: The manual activation step ensures CBM retains control over who represents the organization as a mentor. Automated activation may be considered in a future phase once processes are mature.</w:t>
+      </w:r>
+    </w:p>
+    <w:p>
+      <w:r>
+        <w:t xml:space="preserve"/>
+      </w:r>
+    </w:p>
+    <w:p>
+      <w:pPr>
+        <w:pStyle w:val="Heading1"/>
+      </w:pPr>
+      <w:r>
+        <w:t xml:space="preserve">7. Mentor-Client Matching</w:t>
+      </w:r>
+    </w:p>
+    <w:p>
+      <w:pPr>
+        <w:pStyle w:val="Heading2"/>
+      </w:pPr>
+      <w:r>
+        <w:t xml:space="preserve">7.1 Phase 1 — Manual Assignment (Launch)</w:t>
       </w:r>
     </w:p>
     <w:p>
@@ -2103,7 +2711,7 @@
         <w:pStyle w:val="Heading2"/>
       </w:pPr>
       <w:r>
-        <w:t xml:space="preserve">6.2 Phase 2 — Automated Suggestion (Future)</w:t>
+        <w:t xml:space="preserve">7.2 Phase 2 — Automated Suggestion (Future)</w:t>
       </w:r>
     </w:p>
     <w:p>
@@ -2184,7 +2792,7 @@
         <w:pStyle w:val="Heading1"/>
       </w:pPr>
       <w:r>
-        <w:t xml:space="preserve">7. Scheduling</w:t>
+        <w:t xml:space="preserve">8. Scheduling</w:t>
       </w:r>
     </w:p>
     <w:p>
@@ -2192,7 +2800,7 @@
         <w:pStyle w:val="Heading2"/>
       </w:pPr>
       <w:r>
-        <w:t xml:space="preserve">7.1 Scheduling Modes</w:t>
+        <w:t xml:space="preserve">8.1 Scheduling Modes</w:t>
       </w:r>
     </w:p>
     <w:p>
@@ -2594,7 +3202,7 @@
         <w:pStyle w:val="Heading2"/>
       </w:pPr>
       <w:r>
-        <w:t xml:space="preserve">7.2 Cal.com Integration</w:t>
+        <w:t xml:space="preserve">8.2 Cal.com Integration</w:t>
       </w:r>
     </w:p>
     <w:p>
@@ -2692,7 +3300,7 @@
         <w:pStyle w:val="Heading1"/>
       </w:pPr>
       <w:r>
-        <w:t xml:space="preserve">8. Video Platform</w:t>
+        <w:t xml:space="preserve">9. Video Platform</w:t>
       </w:r>
     </w:p>
     <w:p>
@@ -2700,7 +3308,7 @@
         <w:pStyle w:val="Heading2"/>
       </w:pPr>
       <w:r>
-        <w:t xml:space="preserve">8.1 Platform Split by Use Case</w:t>
+        <w:t xml:space="preserve">9.1 Platform Split by Use Case</w:t>
       </w:r>
     </w:p>
     <w:tbl>
@@ -3001,7 +3609,7 @@
         <w:pStyle w:val="Heading2"/>
       </w:pPr>
       <w:r>
-        <w:t xml:space="preserve">8.2 Google Meet Notes</w:t>
+        <w:t xml:space="preserve">9.2 Google Meet Notes</w:t>
       </w:r>
     </w:p>
     <w:p>
@@ -3112,7 +3720,7 @@
         <w:pStyle w:val="Heading2"/>
       </w:pPr>
       <w:r>
-        <w:t xml:space="preserve">8.3 Jitsi Meet Notes</w:t>
+        <w:t xml:space="preserve">9.3 Jitsi Meet Notes</w:t>
       </w:r>
     </w:p>
     <w:p>
@@ -3210,7 +3818,7 @@
         <w:pStyle w:val="Heading1"/>
       </w:pPr>
       <w:r>
-        <w:t xml:space="preserve">9. Communication Requirements</w:t>
+        <w:t xml:space="preserve">10. Communication Requirements</w:t>
       </w:r>
     </w:p>
     <w:p>
@@ -3218,7 +3826,7 @@
         <w:pStyle w:val="Heading2"/>
       </w:pPr>
       <w:r>
-        <w:t xml:space="preserve">9.1 Mentor Email Architecture</w:t>
+        <w:t xml:space="preserve">10.1 Mentor Email Architecture</w:t>
       </w:r>
     </w:p>
     <w:p>
@@ -3563,7 +4171,7 @@
         <w:pStyle w:val="Heading1"/>
       </w:pPr>
       <w:r>
-        <w:t xml:space="preserve">10. Inactivity Tracking &amp; Follow-Up</w:t>
+        <w:t xml:space="preserve">11. Inactivity Tracking &amp; Follow-Up</w:t>
       </w:r>
     </w:p>
     <w:p>
@@ -3644,7 +4252,7 @@
         <w:pStyle w:val="Heading1"/>
       </w:pPr>
       <w:r>
-        <w:t xml:space="preserve">11. SME Request Workflow</w:t>
+        <w:t xml:space="preserve">12. SME Request Workflow</w:t>
       </w:r>
     </w:p>
     <w:p>
@@ -3761,7 +4369,7 @@
         <w:pStyle w:val="Heading1"/>
       </w:pPr>
       <w:r>
-        <w:t xml:space="preserve">12. NPS Tracking</w:t>
+        <w:t xml:space="preserve">13. NPS Tracking</w:t>
       </w:r>
     </w:p>
     <w:p>
@@ -3919,7 +4527,7 @@
         <w:pStyle w:val="Heading1"/>
       </w:pPr>
       <w:r>
-        <w:t xml:space="preserve">13. Workshop &amp; Event Management</w:t>
+        <w:t xml:space="preserve">14. Workshop &amp; Event Management</w:t>
       </w:r>
     </w:p>
     <w:p>
@@ -4034,7 +4642,7 @@
         <w:pStyle w:val="Heading1"/>
       </w:pPr>
       <w:r>
-        <w:t xml:space="preserve">14. Functional Requirements Summary</w:t>
+        <w:t xml:space="preserve">15. Functional Requirements Summary</w:t>
       </w:r>
     </w:p>
     <w:tbl>
@@ -5883,7 +6491,7 @@
         <w:pStyle w:val="Heading1"/>
       </w:pPr>
       <w:r>
-        <w:t xml:space="preserve">15. Open Questions</w:t>
+        <w:t xml:space="preserve">16. Open Questions</w:t>
       </w:r>
     </w:p>
     <w:p>
@@ -5961,7 +6569,7 @@
         <w:pStyle w:val="Heading1"/>
       </w:pPr>
       <w:r>
-        <w:t xml:space="preserve">16. Document Control</w:t>
+        <w:t xml:space="preserve">17. Document Control</w:t>
       </w:r>
     </w:p>
     <w:tbl>

</xml_diff>

<commit_message>
Update CRM PRD v0.4 — add glossary (Section 17)
Added Section 17 Glossary with four subsections:
- Organization & People: Admin, CBM, Client, Co-Mentor, Funder, Mentor/Primary Mentor, Partner, SME, Sponsor, Vendor, Volunteer, Workshop Presenter
- CRM & Technology: AWS, Cal.com, CRM, EspoCRM, FOSS, Google Integration Extension, Google Workspace for Nonprofits, Jitsi Meet, LimeSurvey, Moodle, OAuth, REST API
- Process & Workflow: Engagement, Ethics Sign-Off, Inactivity Threshold, Intake, KPI, NPS, Onboarding, Session, Single Source of Truth
- Volunteer Status: Provisional, Active, Inactive, Departed

Renumbered Document Control from Section 17 to Section 18.
</commit_message>
<xml_diff>
--- a/PRDs/CBM-PRD-CRM.docx
+++ b/PRDs/CBM-PRD-CRM.docx
@@ -6569,7 +6569,2562 @@
         <w:pStyle w:val="Heading1"/>
       </w:pPr>
       <w:r>
-        <w:t xml:space="preserve">17. Document Control</w:t>
+        <w:t xml:space="preserve">17. Glossary</w:t>
+      </w:r>
+    </w:p>
+    <w:p>
+      <w:pPr>
+        <w:spacing w:after="120"/>
+      </w:pPr>
+      <w:r>
+        <w:t xml:space="preserve">The following terms are used throughout this document and across CBM's technology planning materials.</w:t>
+      </w:r>
+    </w:p>
+    <w:p>
+      <w:r>
+        <w:t xml:space="preserve"/>
+      </w:r>
+    </w:p>
+    <w:p>
+      <w:pPr>
+        <w:pStyle w:val="Heading2"/>
+      </w:pPr>
+      <w:r>
+        <w:t xml:space="preserve">Organization &amp; People</w:t>
+      </w:r>
+    </w:p>
+    <w:tbl>
+      <w:tblPr>
+        <w:tblW w:type="dxa" w:w="9360"/>
+        <w:tblBorders>
+          <w:top w:val="single" w:color="auto" w:sz="4"/>
+          <w:left w:val="single" w:color="auto" w:sz="4"/>
+          <w:bottom w:val="single" w:color="auto" w:sz="4"/>
+          <w:right w:val="single" w:color="auto" w:sz="4"/>
+          <w:insideH w:val="single" w:color="auto" w:sz="4"/>
+          <w:insideV w:val="single" w:color="auto" w:sz="4"/>
+        </w:tblBorders>
+      </w:tblPr>
+      <w:tblGrid>
+        <w:gridCol w:w="2500"/>
+        <w:gridCol w:w="6860"/>
+      </w:tblGrid>
+      <w:tr>
+        <w:trPr>
+          <w:tblHeader/>
+        </w:trPr>
+        <w:tc>
+          <w:tcPr>
+            <w:tcW w:type="dxa" w:w="2500"/>
+            <w:tcBorders>
+              <w:top w:val="single" w:color="CCCCCC" w:sz="1"/>
+              <w:left w:val="single" w:color="CCCCCC" w:sz="1"/>
+              <w:bottom w:val="single" w:color="CCCCCC" w:sz="1"/>
+              <w:right w:val="single" w:color="CCCCCC" w:sz="1"/>
+            </w:tcBorders>
+            <w:shd w:fill="1F4E79" w:val="clear"/>
+            <w:tcMar>
+              <w:top w:type="dxa" w:w="80"/>
+              <w:left w:type="dxa" w:w="120"/>
+              <w:bottom w:type="dxa" w:w="80"/>
+              <w:right w:type="dxa" w:w="120"/>
+            </w:tcMar>
+          </w:tcPr>
+          <w:p>
+            <w:r>
+              <w:rPr>
+                <w:rFonts w:ascii="Arial" w:cs="Arial" w:eastAsia="Arial" w:hAnsi="Arial"/>
+                <w:b/>
+                <w:bCs/>
+                <w:color w:val="FFFFFF"/>
+                <w:sz w:val="20"/>
+                <w:szCs w:val="20"/>
+              </w:rPr>
+              <w:t xml:space="preserve">Term</w:t>
+            </w:r>
+          </w:p>
+        </w:tc>
+        <w:tc>
+          <w:tcPr>
+            <w:tcW w:type="dxa" w:w="6860"/>
+            <w:tcBorders>
+              <w:top w:val="single" w:color="CCCCCC" w:sz="1"/>
+              <w:left w:val="single" w:color="CCCCCC" w:sz="1"/>
+              <w:bottom w:val="single" w:color="CCCCCC" w:sz="1"/>
+              <w:right w:val="single" w:color="CCCCCC" w:sz="1"/>
+            </w:tcBorders>
+            <w:shd w:fill="1F4E79" w:val="clear"/>
+            <w:tcMar>
+              <w:top w:type="dxa" w:w="80"/>
+              <w:left w:type="dxa" w:w="120"/>
+              <w:bottom w:type="dxa" w:w="80"/>
+              <w:right w:type="dxa" w:w="120"/>
+            </w:tcMar>
+          </w:tcPr>
+          <w:p>
+            <w:r>
+              <w:rPr>
+                <w:rFonts w:ascii="Arial" w:cs="Arial" w:eastAsia="Arial" w:hAnsi="Arial"/>
+                <w:b/>
+                <w:bCs/>
+                <w:color w:val="FFFFFF"/>
+                <w:sz w:val="20"/>
+                <w:szCs w:val="20"/>
+              </w:rPr>
+              <w:t xml:space="preserve">Definition</w:t>
+            </w:r>
+          </w:p>
+        </w:tc>
+      </w:tr>
+      <w:tr>
+        <w:tc>
+          <w:tcPr>
+            <w:tcW w:type="dxa" w:w="2500"/>
+            <w:tcBorders>
+              <w:top w:val="single" w:color="CCCCCC" w:sz="1"/>
+              <w:left w:val="single" w:color="CCCCCC" w:sz="1"/>
+              <w:bottom w:val="single" w:color="CCCCCC" w:sz="1"/>
+              <w:right w:val="single" w:color="CCCCCC" w:sz="1"/>
+            </w:tcBorders>
+            <w:shd w:fill="FFFFFF" w:val="clear"/>
+            <w:tcMar>
+              <w:top w:type="dxa" w:w="80"/>
+              <w:left w:type="dxa" w:w="120"/>
+              <w:bottom w:type="dxa" w:w="80"/>
+              <w:right w:type="dxa" w:w="120"/>
+            </w:tcMar>
+          </w:tcPr>
+          <w:p>
+            <w:r>
+              <w:rPr>
+                <w:rFonts w:ascii="Arial" w:cs="Arial" w:eastAsia="Arial" w:hAnsi="Arial"/>
+                <w:sz w:val="20"/>
+                <w:szCs w:val="20"/>
+              </w:rPr>
+              <w:t xml:space="preserve">Admin</w:t>
+            </w:r>
+          </w:p>
+        </w:tc>
+        <w:tc>
+          <w:tcPr>
+            <w:tcW w:type="dxa" w:w="6860"/>
+            <w:tcBorders>
+              <w:top w:val="single" w:color="CCCCCC" w:sz="1"/>
+              <w:left w:val="single" w:color="CCCCCC" w:sz="1"/>
+              <w:bottom w:val="single" w:color="CCCCCC" w:sz="1"/>
+              <w:right w:val="single" w:color="CCCCCC" w:sz="1"/>
+            </w:tcBorders>
+            <w:shd w:fill="FFFFFF" w:val="clear"/>
+            <w:tcMar>
+              <w:top w:type="dxa" w:w="80"/>
+              <w:left w:type="dxa" w:w="120"/>
+              <w:bottom w:type="dxa" w:w="80"/>
+              <w:right w:type="dxa" w:w="120"/>
+            </w:tcMar>
+          </w:tcPr>
+          <w:p>
+            <w:r>
+              <w:rPr>
+                <w:rFonts w:ascii="Arial" w:cs="Arial" w:eastAsia="Arial" w:hAnsi="Arial"/>
+                <w:sz w:val="20"/>
+                <w:szCs w:val="20"/>
+              </w:rPr>
+              <w:t xml:space="preserve">CBM staff or technical administrator responsible for managing the CRM, provisioning user accounts, and overseeing day-to-day platform operations.</w:t>
+            </w:r>
+          </w:p>
+        </w:tc>
+      </w:tr>
+      <w:tr>
+        <w:tc>
+          <w:tcPr>
+            <w:tcW w:type="dxa" w:w="2500"/>
+            <w:tcBorders>
+              <w:top w:val="single" w:color="CCCCCC" w:sz="1"/>
+              <w:left w:val="single" w:color="CCCCCC" w:sz="1"/>
+              <w:bottom w:val="single" w:color="CCCCCC" w:sz="1"/>
+              <w:right w:val="single" w:color="CCCCCC" w:sz="1"/>
+            </w:tcBorders>
+            <w:shd w:fill="F2F2F2" w:val="clear"/>
+            <w:tcMar>
+              <w:top w:type="dxa" w:w="80"/>
+              <w:left w:type="dxa" w:w="120"/>
+              <w:bottom w:type="dxa" w:w="80"/>
+              <w:right w:type="dxa" w:w="120"/>
+            </w:tcMar>
+          </w:tcPr>
+          <w:p>
+            <w:r>
+              <w:rPr>
+                <w:rFonts w:ascii="Arial" w:cs="Arial" w:eastAsia="Arial" w:hAnsi="Arial"/>
+                <w:sz w:val="20"/>
+                <w:szCs w:val="20"/>
+              </w:rPr>
+              <w:t xml:space="preserve">CBM</w:t>
+            </w:r>
+          </w:p>
+        </w:tc>
+        <w:tc>
+          <w:tcPr>
+            <w:tcW w:type="dxa" w:w="6860"/>
+            <w:tcBorders>
+              <w:top w:val="single" w:color="CCCCCC" w:sz="1"/>
+              <w:left w:val="single" w:color="CCCCCC" w:sz="1"/>
+              <w:bottom w:val="single" w:color="CCCCCC" w:sz="1"/>
+              <w:right w:val="single" w:color="CCCCCC" w:sz="1"/>
+            </w:tcBorders>
+            <w:shd w:fill="F2F2F2" w:val="clear"/>
+            <w:tcMar>
+              <w:top w:type="dxa" w:w="80"/>
+              <w:left w:type="dxa" w:w="120"/>
+              <w:bottom w:type="dxa" w:w="80"/>
+              <w:right w:type="dxa" w:w="120"/>
+            </w:tcMar>
+          </w:tcPr>
+          <w:p>
+            <w:r>
+              <w:rPr>
+                <w:rFonts w:ascii="Arial" w:cs="Arial" w:eastAsia="Arial" w:hAnsi="Arial"/>
+                <w:sz w:val="20"/>
+                <w:szCs w:val="20"/>
+              </w:rPr>
+              <w:t xml:space="preserve">Cleveland Business Mentors — a nonprofit organization providing free mentoring services to entrepreneurs and small businesses in Northeast Ohio.</w:t>
+            </w:r>
+          </w:p>
+        </w:tc>
+      </w:tr>
+      <w:tr>
+        <w:tc>
+          <w:tcPr>
+            <w:tcW w:type="dxa" w:w="2500"/>
+            <w:tcBorders>
+              <w:top w:val="single" w:color="CCCCCC" w:sz="1"/>
+              <w:left w:val="single" w:color="CCCCCC" w:sz="1"/>
+              <w:bottom w:val="single" w:color="CCCCCC" w:sz="1"/>
+              <w:right w:val="single" w:color="CCCCCC" w:sz="1"/>
+            </w:tcBorders>
+            <w:shd w:fill="FFFFFF" w:val="clear"/>
+            <w:tcMar>
+              <w:top w:type="dxa" w:w="80"/>
+              <w:left w:type="dxa" w:w="120"/>
+              <w:bottom w:type="dxa" w:w="80"/>
+              <w:right w:type="dxa" w:w="120"/>
+            </w:tcMar>
+          </w:tcPr>
+          <w:p>
+            <w:r>
+              <w:rPr>
+                <w:rFonts w:ascii="Arial" w:cs="Arial" w:eastAsia="Arial" w:hAnsi="Arial"/>
+                <w:sz w:val="20"/>
+                <w:szCs w:val="20"/>
+              </w:rPr>
+              <w:t xml:space="preserve">Client</w:t>
+            </w:r>
+          </w:p>
+        </w:tc>
+        <w:tc>
+          <w:tcPr>
+            <w:tcW w:type="dxa" w:w="6860"/>
+            <w:tcBorders>
+              <w:top w:val="single" w:color="CCCCCC" w:sz="1"/>
+              <w:left w:val="single" w:color="CCCCCC" w:sz="1"/>
+              <w:bottom w:val="single" w:color="CCCCCC" w:sz="1"/>
+              <w:right w:val="single" w:color="CCCCCC" w:sz="1"/>
+            </w:tcBorders>
+            <w:shd w:fill="FFFFFF" w:val="clear"/>
+            <w:tcMar>
+              <w:top w:type="dxa" w:w="80"/>
+              <w:left w:type="dxa" w:w="120"/>
+              <w:bottom w:type="dxa" w:w="80"/>
+              <w:right w:type="dxa" w:w="120"/>
+            </w:tcMar>
+          </w:tcPr>
+          <w:p>
+            <w:r>
+              <w:rPr>
+                <w:rFonts w:ascii="Arial" w:cs="Arial" w:eastAsia="Arial" w:hAnsi="Arial"/>
+                <w:sz w:val="20"/>
+                <w:szCs w:val="20"/>
+              </w:rPr>
+              <w:t xml:space="preserve">An entrepreneur, small business owner, or nonprofit founder who has applied for and been accepted into CBM's mentoring program.</w:t>
+            </w:r>
+          </w:p>
+        </w:tc>
+      </w:tr>
+      <w:tr>
+        <w:tc>
+          <w:tcPr>
+            <w:tcW w:type="dxa" w:w="2500"/>
+            <w:tcBorders>
+              <w:top w:val="single" w:color="CCCCCC" w:sz="1"/>
+              <w:left w:val="single" w:color="CCCCCC" w:sz="1"/>
+              <w:bottom w:val="single" w:color="CCCCCC" w:sz="1"/>
+              <w:right w:val="single" w:color="CCCCCC" w:sz="1"/>
+            </w:tcBorders>
+            <w:shd w:fill="F2F2F2" w:val="clear"/>
+            <w:tcMar>
+              <w:top w:type="dxa" w:w="80"/>
+              <w:left w:type="dxa" w:w="120"/>
+              <w:bottom w:type="dxa" w:w="80"/>
+              <w:right w:type="dxa" w:w="120"/>
+            </w:tcMar>
+          </w:tcPr>
+          <w:p>
+            <w:r>
+              <w:rPr>
+                <w:rFonts w:ascii="Arial" w:cs="Arial" w:eastAsia="Arial" w:hAnsi="Arial"/>
+                <w:sz w:val="20"/>
+                <w:szCs w:val="20"/>
+              </w:rPr>
+              <w:t xml:space="preserve">Co-Mentor</w:t>
+            </w:r>
+          </w:p>
+        </w:tc>
+        <w:tc>
+          <w:tcPr>
+            <w:tcW w:type="dxa" w:w="6860"/>
+            <w:tcBorders>
+              <w:top w:val="single" w:color="CCCCCC" w:sz="1"/>
+              <w:left w:val="single" w:color="CCCCCC" w:sz="1"/>
+              <w:bottom w:val="single" w:color="CCCCCC" w:sz="1"/>
+              <w:right w:val="single" w:color="CCCCCC" w:sz="1"/>
+            </w:tcBorders>
+            <w:shd w:fill="F2F2F2" w:val="clear"/>
+            <w:tcMar>
+              <w:top w:type="dxa" w:w="80"/>
+              <w:left w:type="dxa" w:w="120"/>
+              <w:bottom w:type="dxa" w:w="80"/>
+              <w:right w:type="dxa" w:w="120"/>
+            </w:tcMar>
+          </w:tcPr>
+          <w:p>
+            <w:r>
+              <w:rPr>
+                <w:rFonts w:ascii="Arial" w:cs="Arial" w:eastAsia="Arial" w:hAnsi="Arial"/>
+                <w:sz w:val="20"/>
+                <w:szCs w:val="20"/>
+              </w:rPr>
+              <w:t xml:space="preserve">A volunteer paired with a Primary Mentor to provide additional support to a client. Co-mentors carry a lower capacity commitment and are always paired with a Primary Mentor.</w:t>
+            </w:r>
+          </w:p>
+        </w:tc>
+      </w:tr>
+      <w:tr>
+        <w:tc>
+          <w:tcPr>
+            <w:tcW w:type="dxa" w:w="2500"/>
+            <w:tcBorders>
+              <w:top w:val="single" w:color="CCCCCC" w:sz="1"/>
+              <w:left w:val="single" w:color="CCCCCC" w:sz="1"/>
+              <w:bottom w:val="single" w:color="CCCCCC" w:sz="1"/>
+              <w:right w:val="single" w:color="CCCCCC" w:sz="1"/>
+            </w:tcBorders>
+            <w:shd w:fill="FFFFFF" w:val="clear"/>
+            <w:tcMar>
+              <w:top w:type="dxa" w:w="80"/>
+              <w:left w:type="dxa" w:w="120"/>
+              <w:bottom w:type="dxa" w:w="80"/>
+              <w:right w:type="dxa" w:w="120"/>
+            </w:tcMar>
+          </w:tcPr>
+          <w:p>
+            <w:r>
+              <w:rPr>
+                <w:rFonts w:ascii="Arial" w:cs="Arial" w:eastAsia="Arial" w:hAnsi="Arial"/>
+                <w:sz w:val="20"/>
+                <w:szCs w:val="20"/>
+              </w:rPr>
+              <w:t xml:space="preserve">Funder</w:t>
+            </w:r>
+          </w:p>
+        </w:tc>
+        <w:tc>
+          <w:tcPr>
+            <w:tcW w:type="dxa" w:w="6860"/>
+            <w:tcBorders>
+              <w:top w:val="single" w:color="CCCCCC" w:sz="1"/>
+              <w:left w:val="single" w:color="CCCCCC" w:sz="1"/>
+              <w:bottom w:val="single" w:color="CCCCCC" w:sz="1"/>
+              <w:right w:val="single" w:color="CCCCCC" w:sz="1"/>
+            </w:tcBorders>
+            <w:shd w:fill="FFFFFF" w:val="clear"/>
+            <w:tcMar>
+              <w:top w:type="dxa" w:w="80"/>
+              <w:left w:type="dxa" w:w="120"/>
+              <w:bottom w:type="dxa" w:w="80"/>
+              <w:right w:type="dxa" w:w="120"/>
+            </w:tcMar>
+          </w:tcPr>
+          <w:p>
+            <w:r>
+              <w:rPr>
+                <w:rFonts w:ascii="Arial" w:cs="Arial" w:eastAsia="Arial" w:hAnsi="Arial"/>
+                <w:sz w:val="20"/>
+                <w:szCs w:val="20"/>
+              </w:rPr>
+              <w:t xml:space="preserve">An organization that provides financial support to CBM through grants or contributions to support CBM's mission and operations.</w:t>
+            </w:r>
+          </w:p>
+        </w:tc>
+      </w:tr>
+      <w:tr>
+        <w:tc>
+          <w:tcPr>
+            <w:tcW w:type="dxa" w:w="2500"/>
+            <w:tcBorders>
+              <w:top w:val="single" w:color="CCCCCC" w:sz="1"/>
+              <w:left w:val="single" w:color="CCCCCC" w:sz="1"/>
+              <w:bottom w:val="single" w:color="CCCCCC" w:sz="1"/>
+              <w:right w:val="single" w:color="CCCCCC" w:sz="1"/>
+            </w:tcBorders>
+            <w:shd w:fill="F2F2F2" w:val="clear"/>
+            <w:tcMar>
+              <w:top w:type="dxa" w:w="80"/>
+              <w:left w:type="dxa" w:w="120"/>
+              <w:bottom w:type="dxa" w:w="80"/>
+              <w:right w:type="dxa" w:w="120"/>
+            </w:tcMar>
+          </w:tcPr>
+          <w:p>
+            <w:r>
+              <w:rPr>
+                <w:rFonts w:ascii="Arial" w:cs="Arial" w:eastAsia="Arial" w:hAnsi="Arial"/>
+                <w:sz w:val="20"/>
+                <w:szCs w:val="20"/>
+              </w:rPr>
+              <w:t xml:space="preserve">Mentor / Primary Mentor</w:t>
+            </w:r>
+          </w:p>
+        </w:tc>
+        <w:tc>
+          <w:tcPr>
+            <w:tcW w:type="dxa" w:w="6860"/>
+            <w:tcBorders>
+              <w:top w:val="single" w:color="CCCCCC" w:sz="1"/>
+              <w:left w:val="single" w:color="CCCCCC" w:sz="1"/>
+              <w:bottom w:val="single" w:color="CCCCCC" w:sz="1"/>
+              <w:right w:val="single" w:color="CCCCCC" w:sz="1"/>
+            </w:tcBorders>
+            <w:shd w:fill="F2F2F2" w:val="clear"/>
+            <w:tcMar>
+              <w:top w:type="dxa" w:w="80"/>
+              <w:left w:type="dxa" w:w="120"/>
+              <w:bottom w:type="dxa" w:w="80"/>
+              <w:right w:type="dxa" w:w="120"/>
+            </w:tcMar>
+          </w:tcPr>
+          <w:p>
+            <w:r>
+              <w:rPr>
+                <w:rFonts w:ascii="Arial" w:cs="Arial" w:eastAsia="Arial" w:hAnsi="Arial"/>
+                <w:sz w:val="20"/>
+                <w:szCs w:val="20"/>
+              </w:rPr>
+              <w:t xml:space="preserve">A volunteer who owns the client relationship and is responsible for the ongoing one-to-one mentoring engagement. Primary mentors are the main point of contact for their assigned clients.</w:t>
+            </w:r>
+          </w:p>
+        </w:tc>
+      </w:tr>
+      <w:tr>
+        <w:tc>
+          <w:tcPr>
+            <w:tcW w:type="dxa" w:w="2500"/>
+            <w:tcBorders>
+              <w:top w:val="single" w:color="CCCCCC" w:sz="1"/>
+              <w:left w:val="single" w:color="CCCCCC" w:sz="1"/>
+              <w:bottom w:val="single" w:color="CCCCCC" w:sz="1"/>
+              <w:right w:val="single" w:color="CCCCCC" w:sz="1"/>
+            </w:tcBorders>
+            <w:shd w:fill="FFFFFF" w:val="clear"/>
+            <w:tcMar>
+              <w:top w:type="dxa" w:w="80"/>
+              <w:left w:type="dxa" w:w="120"/>
+              <w:bottom w:type="dxa" w:w="80"/>
+              <w:right w:type="dxa" w:w="120"/>
+            </w:tcMar>
+          </w:tcPr>
+          <w:p>
+            <w:r>
+              <w:rPr>
+                <w:rFonts w:ascii="Arial" w:cs="Arial" w:eastAsia="Arial" w:hAnsi="Arial"/>
+                <w:sz w:val="20"/>
+                <w:szCs w:val="20"/>
+              </w:rPr>
+              <w:t xml:space="preserve">Partner</w:t>
+            </w:r>
+          </w:p>
+        </w:tc>
+        <w:tc>
+          <w:tcPr>
+            <w:tcW w:type="dxa" w:w="6860"/>
+            <w:tcBorders>
+              <w:top w:val="single" w:color="CCCCCC" w:sz="1"/>
+              <w:left w:val="single" w:color="CCCCCC" w:sz="1"/>
+              <w:bottom w:val="single" w:color="CCCCCC" w:sz="1"/>
+              <w:right w:val="single" w:color="CCCCCC" w:sz="1"/>
+            </w:tcBorders>
+            <w:shd w:fill="FFFFFF" w:val="clear"/>
+            <w:tcMar>
+              <w:top w:type="dxa" w:w="80"/>
+              <w:left w:type="dxa" w:w="120"/>
+              <w:bottom w:type="dxa" w:w="80"/>
+              <w:right w:type="dxa" w:w="120"/>
+            </w:tcMar>
+          </w:tcPr>
+          <w:p>
+            <w:r>
+              <w:rPr>
+                <w:rFonts w:ascii="Arial" w:cs="Arial" w:eastAsia="Arial" w:hAnsi="Arial"/>
+                <w:sz w:val="20"/>
+                <w:szCs w:val="20"/>
+              </w:rPr>
+              <w:t xml:space="preserve">An organization with a mission similar or complementary to CBM's that collaborates with CBM on programs, referrals, or community initiatives.</w:t>
+            </w:r>
+          </w:p>
+        </w:tc>
+      </w:tr>
+      <w:tr>
+        <w:tc>
+          <w:tcPr>
+            <w:tcW w:type="dxa" w:w="2500"/>
+            <w:tcBorders>
+              <w:top w:val="single" w:color="CCCCCC" w:sz="1"/>
+              <w:left w:val="single" w:color="CCCCCC" w:sz="1"/>
+              <w:bottom w:val="single" w:color="CCCCCC" w:sz="1"/>
+              <w:right w:val="single" w:color="CCCCCC" w:sz="1"/>
+            </w:tcBorders>
+            <w:shd w:fill="F2F2F2" w:val="clear"/>
+            <w:tcMar>
+              <w:top w:type="dxa" w:w="80"/>
+              <w:left w:type="dxa" w:w="120"/>
+              <w:bottom w:type="dxa" w:w="80"/>
+              <w:right w:type="dxa" w:w="120"/>
+            </w:tcMar>
+          </w:tcPr>
+          <w:p>
+            <w:r>
+              <w:rPr>
+                <w:rFonts w:ascii="Arial" w:cs="Arial" w:eastAsia="Arial" w:hAnsi="Arial"/>
+                <w:sz w:val="20"/>
+                <w:szCs w:val="20"/>
+              </w:rPr>
+              <w:t xml:space="preserve">SME (Subject Matter Expert)</w:t>
+            </w:r>
+          </w:p>
+        </w:tc>
+        <w:tc>
+          <w:tcPr>
+            <w:tcW w:type="dxa" w:w="6860"/>
+            <w:tcBorders>
+              <w:top w:val="single" w:color="CCCCCC" w:sz="1"/>
+              <w:left w:val="single" w:color="CCCCCC" w:sz="1"/>
+              <w:bottom w:val="single" w:color="CCCCCC" w:sz="1"/>
+              <w:right w:val="single" w:color="CCCCCC" w:sz="1"/>
+            </w:tcBorders>
+            <w:shd w:fill="F2F2F2" w:val="clear"/>
+            <w:tcMar>
+              <w:top w:type="dxa" w:w="80"/>
+              <w:left w:type="dxa" w:w="120"/>
+              <w:bottom w:type="dxa" w:w="80"/>
+              <w:right w:type="dxa" w:w="120"/>
+            </w:tcMar>
+          </w:tcPr>
+          <w:p>
+            <w:r>
+              <w:rPr>
+                <w:rFonts w:ascii="Arial" w:cs="Arial" w:eastAsia="Arial" w:hAnsi="Arial"/>
+                <w:sz w:val="20"/>
+                <w:szCs w:val="20"/>
+              </w:rPr>
+              <w:t xml:space="preserve">A volunteer with deep expertise in a specific skill or topic area who provides on-demand specialist input to a client engagement at the request of the Primary Mentor.</w:t>
+            </w:r>
+          </w:p>
+        </w:tc>
+      </w:tr>
+      <w:tr>
+        <w:tc>
+          <w:tcPr>
+            <w:tcW w:type="dxa" w:w="2500"/>
+            <w:tcBorders>
+              <w:top w:val="single" w:color="CCCCCC" w:sz="1"/>
+              <w:left w:val="single" w:color="CCCCCC" w:sz="1"/>
+              <w:bottom w:val="single" w:color="CCCCCC" w:sz="1"/>
+              <w:right w:val="single" w:color="CCCCCC" w:sz="1"/>
+            </w:tcBorders>
+            <w:shd w:fill="FFFFFF" w:val="clear"/>
+            <w:tcMar>
+              <w:top w:type="dxa" w:w="80"/>
+              <w:left w:type="dxa" w:w="120"/>
+              <w:bottom w:type="dxa" w:w="80"/>
+              <w:right w:type="dxa" w:w="120"/>
+            </w:tcMar>
+          </w:tcPr>
+          <w:p>
+            <w:r>
+              <w:rPr>
+                <w:rFonts w:ascii="Arial" w:cs="Arial" w:eastAsia="Arial" w:hAnsi="Arial"/>
+                <w:sz w:val="20"/>
+                <w:szCs w:val="20"/>
+              </w:rPr>
+              <w:t xml:space="preserve">Sponsor</w:t>
+            </w:r>
+          </w:p>
+        </w:tc>
+        <w:tc>
+          <w:tcPr>
+            <w:tcW w:type="dxa" w:w="6860"/>
+            <w:tcBorders>
+              <w:top w:val="single" w:color="CCCCCC" w:sz="1"/>
+              <w:left w:val="single" w:color="CCCCCC" w:sz="1"/>
+              <w:bottom w:val="single" w:color="CCCCCC" w:sz="1"/>
+              <w:right w:val="single" w:color="CCCCCC" w:sz="1"/>
+            </w:tcBorders>
+            <w:shd w:fill="FFFFFF" w:val="clear"/>
+            <w:tcMar>
+              <w:top w:type="dxa" w:w="80"/>
+              <w:left w:type="dxa" w:w="120"/>
+              <w:bottom w:type="dxa" w:w="80"/>
+              <w:right w:type="dxa" w:w="120"/>
+            </w:tcMar>
+          </w:tcPr>
+          <w:p>
+            <w:r>
+              <w:rPr>
+                <w:rFonts w:ascii="Arial" w:cs="Arial" w:eastAsia="Arial" w:hAnsi="Arial"/>
+                <w:sz w:val="20"/>
+                <w:szCs w:val="20"/>
+              </w:rPr>
+              <w:t xml:space="preserve">An organization that provides financial or in-kind support for one or more CBM client-facing events or workshops.</w:t>
+            </w:r>
+          </w:p>
+        </w:tc>
+      </w:tr>
+      <w:tr>
+        <w:tc>
+          <w:tcPr>
+            <w:tcW w:type="dxa" w:w="2500"/>
+            <w:tcBorders>
+              <w:top w:val="single" w:color="CCCCCC" w:sz="1"/>
+              <w:left w:val="single" w:color="CCCCCC" w:sz="1"/>
+              <w:bottom w:val="single" w:color="CCCCCC" w:sz="1"/>
+              <w:right w:val="single" w:color="CCCCCC" w:sz="1"/>
+            </w:tcBorders>
+            <w:shd w:fill="F2F2F2" w:val="clear"/>
+            <w:tcMar>
+              <w:top w:type="dxa" w:w="80"/>
+              <w:left w:type="dxa" w:w="120"/>
+              <w:bottom w:type="dxa" w:w="80"/>
+              <w:right w:type="dxa" w:w="120"/>
+            </w:tcMar>
+          </w:tcPr>
+          <w:p>
+            <w:r>
+              <w:rPr>
+                <w:rFonts w:ascii="Arial" w:cs="Arial" w:eastAsia="Arial" w:hAnsi="Arial"/>
+                <w:sz w:val="20"/>
+                <w:szCs w:val="20"/>
+              </w:rPr>
+              <w:t xml:space="preserve">Vendor</w:t>
+            </w:r>
+          </w:p>
+        </w:tc>
+        <w:tc>
+          <w:tcPr>
+            <w:tcW w:type="dxa" w:w="6860"/>
+            <w:tcBorders>
+              <w:top w:val="single" w:color="CCCCCC" w:sz="1"/>
+              <w:left w:val="single" w:color="CCCCCC" w:sz="1"/>
+              <w:bottom w:val="single" w:color="CCCCCC" w:sz="1"/>
+              <w:right w:val="single" w:color="CCCCCC" w:sz="1"/>
+            </w:tcBorders>
+            <w:shd w:fill="F2F2F2" w:val="clear"/>
+            <w:tcMar>
+              <w:top w:type="dxa" w:w="80"/>
+              <w:left w:type="dxa" w:w="120"/>
+              <w:bottom w:type="dxa" w:w="80"/>
+              <w:right w:type="dxa" w:w="120"/>
+            </w:tcMar>
+          </w:tcPr>
+          <w:p>
+            <w:r>
+              <w:rPr>
+                <w:rFonts w:ascii="Arial" w:cs="Arial" w:eastAsia="Arial" w:hAnsi="Arial"/>
+                <w:sz w:val="20"/>
+                <w:szCs w:val="20"/>
+              </w:rPr>
+              <w:t xml:space="preserve">An organization that provides goods or services to CBM in support of its operations (e.g., software, printing, catering, facilities).</w:t>
+            </w:r>
+          </w:p>
+        </w:tc>
+      </w:tr>
+      <w:tr>
+        <w:tc>
+          <w:tcPr>
+            <w:tcW w:type="dxa" w:w="2500"/>
+            <w:tcBorders>
+              <w:top w:val="single" w:color="CCCCCC" w:sz="1"/>
+              <w:left w:val="single" w:color="CCCCCC" w:sz="1"/>
+              <w:bottom w:val="single" w:color="CCCCCC" w:sz="1"/>
+              <w:right w:val="single" w:color="CCCCCC" w:sz="1"/>
+            </w:tcBorders>
+            <w:shd w:fill="FFFFFF" w:val="clear"/>
+            <w:tcMar>
+              <w:top w:type="dxa" w:w="80"/>
+              <w:left w:type="dxa" w:w="120"/>
+              <w:bottom w:type="dxa" w:w="80"/>
+              <w:right w:type="dxa" w:w="120"/>
+            </w:tcMar>
+          </w:tcPr>
+          <w:p>
+            <w:r>
+              <w:rPr>
+                <w:rFonts w:ascii="Arial" w:cs="Arial" w:eastAsia="Arial" w:hAnsi="Arial"/>
+                <w:sz w:val="20"/>
+                <w:szCs w:val="20"/>
+              </w:rPr>
+              <w:t xml:space="preserve">Volunteer</w:t>
+            </w:r>
+          </w:p>
+        </w:tc>
+        <w:tc>
+          <w:tcPr>
+            <w:tcW w:type="dxa" w:w="6860"/>
+            <w:tcBorders>
+              <w:top w:val="single" w:color="CCCCCC" w:sz="1"/>
+              <w:left w:val="single" w:color="CCCCCC" w:sz="1"/>
+              <w:bottom w:val="single" w:color="CCCCCC" w:sz="1"/>
+              <w:right w:val="single" w:color="CCCCCC" w:sz="1"/>
+            </w:tcBorders>
+            <w:shd w:fill="FFFFFF" w:val="clear"/>
+            <w:tcMar>
+              <w:top w:type="dxa" w:w="80"/>
+              <w:left w:type="dxa" w:w="120"/>
+              <w:bottom w:type="dxa" w:w="80"/>
+              <w:right w:type="dxa" w:w="120"/>
+            </w:tcMar>
+          </w:tcPr>
+          <w:p>
+            <w:r>
+              <w:rPr>
+                <w:rFonts w:ascii="Arial" w:cs="Arial" w:eastAsia="Arial" w:hAnsi="Arial"/>
+                <w:sz w:val="20"/>
+                <w:szCs w:val="20"/>
+              </w:rPr>
+              <w:t xml:space="preserve">Any individual who donates their time to CBM in a mentoring or advisory capacity, including Primary Mentors, Co-Mentors, and SMEs.</w:t>
+            </w:r>
+          </w:p>
+        </w:tc>
+      </w:tr>
+      <w:tr>
+        <w:tc>
+          <w:tcPr>
+            <w:tcW w:type="dxa" w:w="2500"/>
+            <w:tcBorders>
+              <w:top w:val="single" w:color="CCCCCC" w:sz="1"/>
+              <w:left w:val="single" w:color="CCCCCC" w:sz="1"/>
+              <w:bottom w:val="single" w:color="CCCCCC" w:sz="1"/>
+              <w:right w:val="single" w:color="CCCCCC" w:sz="1"/>
+            </w:tcBorders>
+            <w:shd w:fill="F2F2F2" w:val="clear"/>
+            <w:tcMar>
+              <w:top w:type="dxa" w:w="80"/>
+              <w:left w:type="dxa" w:w="120"/>
+              <w:bottom w:type="dxa" w:w="80"/>
+              <w:right w:type="dxa" w:w="120"/>
+            </w:tcMar>
+          </w:tcPr>
+          <w:p>
+            <w:r>
+              <w:rPr>
+                <w:rFonts w:ascii="Arial" w:cs="Arial" w:eastAsia="Arial" w:hAnsi="Arial"/>
+                <w:sz w:val="20"/>
+                <w:szCs w:val="20"/>
+              </w:rPr>
+              <w:t xml:space="preserve">Workshop Presenter</w:t>
+            </w:r>
+          </w:p>
+        </w:tc>
+        <w:tc>
+          <w:tcPr>
+            <w:tcW w:type="dxa" w:w="6860"/>
+            <w:tcBorders>
+              <w:top w:val="single" w:color="CCCCCC" w:sz="1"/>
+              <w:left w:val="single" w:color="CCCCCC" w:sz="1"/>
+              <w:bottom w:val="single" w:color="CCCCCC" w:sz="1"/>
+              <w:right w:val="single" w:color="CCCCCC" w:sz="1"/>
+            </w:tcBorders>
+            <w:shd w:fill="F2F2F2" w:val="clear"/>
+            <w:tcMar>
+              <w:top w:type="dxa" w:w="80"/>
+              <w:left w:type="dxa" w:w="120"/>
+              <w:bottom w:type="dxa" w:w="80"/>
+              <w:right w:type="dxa" w:w="120"/>
+            </w:tcMar>
+          </w:tcPr>
+          <w:p>
+            <w:r>
+              <w:rPr>
+                <w:rFonts w:ascii="Arial" w:cs="Arial" w:eastAsia="Arial" w:hAnsi="Arial"/>
+                <w:sz w:val="20"/>
+                <w:szCs w:val="20"/>
+              </w:rPr>
+              <w:t xml:space="preserve">A person who provides content and presentation services at a CBM workshop or event. May be a CBM volunteer or an external expert.</w:t>
+            </w:r>
+          </w:p>
+        </w:tc>
+      </w:tr>
+    </w:tbl>
+    <w:p>
+      <w:r>
+        <w:t xml:space="preserve"/>
+      </w:r>
+    </w:p>
+    <w:p>
+      <w:pPr>
+        <w:pStyle w:val="Heading2"/>
+      </w:pPr>
+      <w:r>
+        <w:t xml:space="preserve">CRM &amp; Technology</w:t>
+      </w:r>
+    </w:p>
+    <w:tbl>
+      <w:tblPr>
+        <w:tblW w:type="dxa" w:w="9360"/>
+        <w:tblBorders>
+          <w:top w:val="single" w:color="auto" w:sz="4"/>
+          <w:left w:val="single" w:color="auto" w:sz="4"/>
+          <w:bottom w:val="single" w:color="auto" w:sz="4"/>
+          <w:right w:val="single" w:color="auto" w:sz="4"/>
+          <w:insideH w:val="single" w:color="auto" w:sz="4"/>
+          <w:insideV w:val="single" w:color="auto" w:sz="4"/>
+        </w:tblBorders>
+      </w:tblPr>
+      <w:tblGrid>
+        <w:gridCol w:w="2500"/>
+        <w:gridCol w:w="6860"/>
+      </w:tblGrid>
+      <w:tr>
+        <w:trPr>
+          <w:tblHeader/>
+        </w:trPr>
+        <w:tc>
+          <w:tcPr>
+            <w:tcW w:type="dxa" w:w="2500"/>
+            <w:tcBorders>
+              <w:top w:val="single" w:color="CCCCCC" w:sz="1"/>
+              <w:left w:val="single" w:color="CCCCCC" w:sz="1"/>
+              <w:bottom w:val="single" w:color="CCCCCC" w:sz="1"/>
+              <w:right w:val="single" w:color="CCCCCC" w:sz="1"/>
+            </w:tcBorders>
+            <w:shd w:fill="1F4E79" w:val="clear"/>
+            <w:tcMar>
+              <w:top w:type="dxa" w:w="80"/>
+              <w:left w:type="dxa" w:w="120"/>
+              <w:bottom w:type="dxa" w:w="80"/>
+              <w:right w:type="dxa" w:w="120"/>
+            </w:tcMar>
+          </w:tcPr>
+          <w:p>
+            <w:r>
+              <w:rPr>
+                <w:rFonts w:ascii="Arial" w:cs="Arial" w:eastAsia="Arial" w:hAnsi="Arial"/>
+                <w:b/>
+                <w:bCs/>
+                <w:color w:val="FFFFFF"/>
+                <w:sz w:val="20"/>
+                <w:szCs w:val="20"/>
+              </w:rPr>
+              <w:t xml:space="preserve">Term</w:t>
+            </w:r>
+          </w:p>
+        </w:tc>
+        <w:tc>
+          <w:tcPr>
+            <w:tcW w:type="dxa" w:w="6860"/>
+            <w:tcBorders>
+              <w:top w:val="single" w:color="CCCCCC" w:sz="1"/>
+              <w:left w:val="single" w:color="CCCCCC" w:sz="1"/>
+              <w:bottom w:val="single" w:color="CCCCCC" w:sz="1"/>
+              <w:right w:val="single" w:color="CCCCCC" w:sz="1"/>
+            </w:tcBorders>
+            <w:shd w:fill="1F4E79" w:val="clear"/>
+            <w:tcMar>
+              <w:top w:type="dxa" w:w="80"/>
+              <w:left w:type="dxa" w:w="120"/>
+              <w:bottom w:type="dxa" w:w="80"/>
+              <w:right w:type="dxa" w:w="120"/>
+            </w:tcMar>
+          </w:tcPr>
+          <w:p>
+            <w:r>
+              <w:rPr>
+                <w:rFonts w:ascii="Arial" w:cs="Arial" w:eastAsia="Arial" w:hAnsi="Arial"/>
+                <w:b/>
+                <w:bCs/>
+                <w:color w:val="FFFFFF"/>
+                <w:sz w:val="20"/>
+                <w:szCs w:val="20"/>
+              </w:rPr>
+              <w:t xml:space="preserve">Definition</w:t>
+            </w:r>
+          </w:p>
+        </w:tc>
+      </w:tr>
+      <w:tr>
+        <w:tc>
+          <w:tcPr>
+            <w:tcW w:type="dxa" w:w="2500"/>
+            <w:tcBorders>
+              <w:top w:val="single" w:color="CCCCCC" w:sz="1"/>
+              <w:left w:val="single" w:color="CCCCCC" w:sz="1"/>
+              <w:bottom w:val="single" w:color="CCCCCC" w:sz="1"/>
+              <w:right w:val="single" w:color="CCCCCC" w:sz="1"/>
+            </w:tcBorders>
+            <w:shd w:fill="FFFFFF" w:val="clear"/>
+            <w:tcMar>
+              <w:top w:type="dxa" w:w="80"/>
+              <w:left w:type="dxa" w:w="120"/>
+              <w:bottom w:type="dxa" w:w="80"/>
+              <w:right w:type="dxa" w:w="120"/>
+            </w:tcMar>
+          </w:tcPr>
+          <w:p>
+            <w:r>
+              <w:rPr>
+                <w:rFonts w:ascii="Arial" w:cs="Arial" w:eastAsia="Arial" w:hAnsi="Arial"/>
+                <w:sz w:val="20"/>
+                <w:szCs w:val="20"/>
+              </w:rPr>
+              <w:t xml:space="preserve">AWS (Amazon Web Services)</w:t>
+            </w:r>
+          </w:p>
+        </w:tc>
+        <w:tc>
+          <w:tcPr>
+            <w:tcW w:type="dxa" w:w="6860"/>
+            <w:tcBorders>
+              <w:top w:val="single" w:color="CCCCCC" w:sz="1"/>
+              <w:left w:val="single" w:color="CCCCCC" w:sz="1"/>
+              <w:bottom w:val="single" w:color="CCCCCC" w:sz="1"/>
+              <w:right w:val="single" w:color="CCCCCC" w:sz="1"/>
+            </w:tcBorders>
+            <w:shd w:fill="FFFFFF" w:val="clear"/>
+            <w:tcMar>
+              <w:top w:type="dxa" w:w="80"/>
+              <w:left w:type="dxa" w:w="120"/>
+              <w:bottom w:type="dxa" w:w="80"/>
+              <w:right w:type="dxa" w:w="120"/>
+            </w:tcMar>
+          </w:tcPr>
+          <w:p>
+            <w:r>
+              <w:rPr>
+                <w:rFonts w:ascii="Arial" w:cs="Arial" w:eastAsia="Arial" w:hAnsi="Arial"/>
+                <w:sz w:val="20"/>
+                <w:szCs w:val="20"/>
+              </w:rPr>
+              <w:t xml:space="preserve">The cloud hosting platform used to host CBM's self-hosted applications including EspoCRM, Moodle, Cal.com, Jitsi Meet, and the CBM website.</w:t>
+            </w:r>
+          </w:p>
+        </w:tc>
+      </w:tr>
+      <w:tr>
+        <w:tc>
+          <w:tcPr>
+            <w:tcW w:type="dxa" w:w="2500"/>
+            <w:tcBorders>
+              <w:top w:val="single" w:color="CCCCCC" w:sz="1"/>
+              <w:left w:val="single" w:color="CCCCCC" w:sz="1"/>
+              <w:bottom w:val="single" w:color="CCCCCC" w:sz="1"/>
+              <w:right w:val="single" w:color="CCCCCC" w:sz="1"/>
+            </w:tcBorders>
+            <w:shd w:fill="F2F2F2" w:val="clear"/>
+            <w:tcMar>
+              <w:top w:type="dxa" w:w="80"/>
+              <w:left w:type="dxa" w:w="120"/>
+              <w:bottom w:type="dxa" w:w="80"/>
+              <w:right w:type="dxa" w:w="120"/>
+            </w:tcMar>
+          </w:tcPr>
+          <w:p>
+            <w:r>
+              <w:rPr>
+                <w:rFonts w:ascii="Arial" w:cs="Arial" w:eastAsia="Arial" w:hAnsi="Arial"/>
+                <w:sz w:val="20"/>
+                <w:szCs w:val="20"/>
+              </w:rPr>
+              <w:t xml:space="preserve">Cal.com</w:t>
+            </w:r>
+          </w:p>
+        </w:tc>
+        <w:tc>
+          <w:tcPr>
+            <w:tcW w:type="dxa" w:w="6860"/>
+            <w:tcBorders>
+              <w:top w:val="single" w:color="CCCCCC" w:sz="1"/>
+              <w:left w:val="single" w:color="CCCCCC" w:sz="1"/>
+              <w:bottom w:val="single" w:color="CCCCCC" w:sz="1"/>
+              <w:right w:val="single" w:color="CCCCCC" w:sz="1"/>
+            </w:tcBorders>
+            <w:shd w:fill="F2F2F2" w:val="clear"/>
+            <w:tcMar>
+              <w:top w:type="dxa" w:w="80"/>
+              <w:left w:type="dxa" w:w="120"/>
+              <w:bottom w:type="dxa" w:w="80"/>
+              <w:right w:type="dxa" w:w="120"/>
+            </w:tcMar>
+          </w:tcPr>
+          <w:p>
+            <w:r>
+              <w:rPr>
+                <w:rFonts w:ascii="Arial" w:cs="Arial" w:eastAsia="Arial" w:hAnsi="Arial"/>
+                <w:sz w:val="20"/>
+                <w:szCs w:val="20"/>
+              </w:rPr>
+              <w:t xml:space="preserve">An open-source self-scheduling tool optionally used by mentors to allow clients to book sessions directly. Bookings sync back to EspoCRM.</w:t>
+            </w:r>
+          </w:p>
+        </w:tc>
+      </w:tr>
+      <w:tr>
+        <w:tc>
+          <w:tcPr>
+            <w:tcW w:type="dxa" w:w="2500"/>
+            <w:tcBorders>
+              <w:top w:val="single" w:color="CCCCCC" w:sz="1"/>
+              <w:left w:val="single" w:color="CCCCCC" w:sz="1"/>
+              <w:bottom w:val="single" w:color="CCCCCC" w:sz="1"/>
+              <w:right w:val="single" w:color="CCCCCC" w:sz="1"/>
+            </w:tcBorders>
+            <w:shd w:fill="FFFFFF" w:val="clear"/>
+            <w:tcMar>
+              <w:top w:type="dxa" w:w="80"/>
+              <w:left w:type="dxa" w:w="120"/>
+              <w:bottom w:type="dxa" w:w="80"/>
+              <w:right w:type="dxa" w:w="120"/>
+            </w:tcMar>
+          </w:tcPr>
+          <w:p>
+            <w:r>
+              <w:rPr>
+                <w:rFonts w:ascii="Arial" w:cs="Arial" w:eastAsia="Arial" w:hAnsi="Arial"/>
+                <w:sz w:val="20"/>
+                <w:szCs w:val="20"/>
+              </w:rPr>
+              <w:t xml:space="preserve">CRM (Customer Relationship Management)</w:t>
+            </w:r>
+          </w:p>
+        </w:tc>
+        <w:tc>
+          <w:tcPr>
+            <w:tcW w:type="dxa" w:w="6860"/>
+            <w:tcBorders>
+              <w:top w:val="single" w:color="CCCCCC" w:sz="1"/>
+              <w:left w:val="single" w:color="CCCCCC" w:sz="1"/>
+              <w:bottom w:val="single" w:color="CCCCCC" w:sz="1"/>
+              <w:right w:val="single" w:color="CCCCCC" w:sz="1"/>
+            </w:tcBorders>
+            <w:shd w:fill="FFFFFF" w:val="clear"/>
+            <w:tcMar>
+              <w:top w:type="dxa" w:w="80"/>
+              <w:left w:type="dxa" w:w="120"/>
+              <w:bottom w:type="dxa" w:w="80"/>
+              <w:right w:type="dxa" w:w="120"/>
+            </w:tcMar>
+          </w:tcPr>
+          <w:p>
+            <w:r>
+              <w:rPr>
+                <w:rFonts w:ascii="Arial" w:cs="Arial" w:eastAsia="Arial" w:hAnsi="Arial"/>
+                <w:sz w:val="20"/>
+                <w:szCs w:val="20"/>
+              </w:rPr>
+              <w:t xml:space="preserve">The central system used to manage all client, volunteer, donor, and organizational data. CBM uses EspoCRM as its CRM platform.</w:t>
+            </w:r>
+          </w:p>
+        </w:tc>
+      </w:tr>
+      <w:tr>
+        <w:tc>
+          <w:tcPr>
+            <w:tcW w:type="dxa" w:w="2500"/>
+            <w:tcBorders>
+              <w:top w:val="single" w:color="CCCCCC" w:sz="1"/>
+              <w:left w:val="single" w:color="CCCCCC" w:sz="1"/>
+              <w:bottom w:val="single" w:color="CCCCCC" w:sz="1"/>
+              <w:right w:val="single" w:color="CCCCCC" w:sz="1"/>
+            </w:tcBorders>
+            <w:shd w:fill="F2F2F2" w:val="clear"/>
+            <w:tcMar>
+              <w:top w:type="dxa" w:w="80"/>
+              <w:left w:type="dxa" w:w="120"/>
+              <w:bottom w:type="dxa" w:w="80"/>
+              <w:right w:type="dxa" w:w="120"/>
+            </w:tcMar>
+          </w:tcPr>
+          <w:p>
+            <w:r>
+              <w:rPr>
+                <w:rFonts w:ascii="Arial" w:cs="Arial" w:eastAsia="Arial" w:hAnsi="Arial"/>
+                <w:sz w:val="20"/>
+                <w:szCs w:val="20"/>
+              </w:rPr>
+              <w:t xml:space="preserve">EspoCRM</w:t>
+            </w:r>
+          </w:p>
+        </w:tc>
+        <w:tc>
+          <w:tcPr>
+            <w:tcW w:type="dxa" w:w="6860"/>
+            <w:tcBorders>
+              <w:top w:val="single" w:color="CCCCCC" w:sz="1"/>
+              <w:left w:val="single" w:color="CCCCCC" w:sz="1"/>
+              <w:bottom w:val="single" w:color="CCCCCC" w:sz="1"/>
+              <w:right w:val="single" w:color="CCCCCC" w:sz="1"/>
+            </w:tcBorders>
+            <w:shd w:fill="F2F2F2" w:val="clear"/>
+            <w:tcMar>
+              <w:top w:type="dxa" w:w="80"/>
+              <w:left w:type="dxa" w:w="120"/>
+              <w:bottom w:type="dxa" w:w="80"/>
+              <w:right w:type="dxa" w:w="120"/>
+            </w:tcMar>
+          </w:tcPr>
+          <w:p>
+            <w:r>
+              <w:rPr>
+                <w:rFonts w:ascii="Arial" w:cs="Arial" w:eastAsia="Arial" w:hAnsi="Arial"/>
+                <w:sz w:val="20"/>
+                <w:szCs w:val="20"/>
+              </w:rPr>
+              <w:t xml:space="preserve">The selected CRM platform for CBM. Free and open-source, self-hosted on AWS, with a customizable data model, workflow automation, email threading, and REST API.</w:t>
+            </w:r>
+          </w:p>
+        </w:tc>
+      </w:tr>
+      <w:tr>
+        <w:tc>
+          <w:tcPr>
+            <w:tcW w:type="dxa" w:w="2500"/>
+            <w:tcBorders>
+              <w:top w:val="single" w:color="CCCCCC" w:sz="1"/>
+              <w:left w:val="single" w:color="CCCCCC" w:sz="1"/>
+              <w:bottom w:val="single" w:color="CCCCCC" w:sz="1"/>
+              <w:right w:val="single" w:color="CCCCCC" w:sz="1"/>
+            </w:tcBorders>
+            <w:shd w:fill="FFFFFF" w:val="clear"/>
+            <w:tcMar>
+              <w:top w:type="dxa" w:w="80"/>
+              <w:left w:type="dxa" w:w="120"/>
+              <w:bottom w:type="dxa" w:w="80"/>
+              <w:right w:type="dxa" w:w="120"/>
+            </w:tcMar>
+          </w:tcPr>
+          <w:p>
+            <w:r>
+              <w:rPr>
+                <w:rFonts w:ascii="Arial" w:cs="Arial" w:eastAsia="Arial" w:hAnsi="Arial"/>
+                <w:sz w:val="20"/>
+                <w:szCs w:val="20"/>
+              </w:rPr>
+              <w:t xml:space="preserve">FOSS (Free and Open Source Software)</w:t>
+            </w:r>
+          </w:p>
+        </w:tc>
+        <w:tc>
+          <w:tcPr>
+            <w:tcW w:type="dxa" w:w="6860"/>
+            <w:tcBorders>
+              <w:top w:val="single" w:color="CCCCCC" w:sz="1"/>
+              <w:left w:val="single" w:color="CCCCCC" w:sz="1"/>
+              <w:bottom w:val="single" w:color="CCCCCC" w:sz="1"/>
+              <w:right w:val="single" w:color="CCCCCC" w:sz="1"/>
+            </w:tcBorders>
+            <w:shd w:fill="FFFFFF" w:val="clear"/>
+            <w:tcMar>
+              <w:top w:type="dxa" w:w="80"/>
+              <w:left w:type="dxa" w:w="120"/>
+              <w:bottom w:type="dxa" w:w="80"/>
+              <w:right w:type="dxa" w:w="120"/>
+            </w:tcMar>
+          </w:tcPr>
+          <w:p>
+            <w:r>
+              <w:rPr>
+                <w:rFonts w:ascii="Arial" w:cs="Arial" w:eastAsia="Arial" w:hAnsi="Arial"/>
+                <w:sz w:val="20"/>
+                <w:szCs w:val="20"/>
+              </w:rPr>
+              <w:t xml:space="preserve">Software that is freely available and whose source code can be inspected, modified, and distributed. CBM's technology stack prioritizes FOSS to minimize licensing costs.</w:t>
+            </w:r>
+          </w:p>
+        </w:tc>
+      </w:tr>
+      <w:tr>
+        <w:tc>
+          <w:tcPr>
+            <w:tcW w:type="dxa" w:w="2500"/>
+            <w:tcBorders>
+              <w:top w:val="single" w:color="CCCCCC" w:sz="1"/>
+              <w:left w:val="single" w:color="CCCCCC" w:sz="1"/>
+              <w:bottom w:val="single" w:color="CCCCCC" w:sz="1"/>
+              <w:right w:val="single" w:color="CCCCCC" w:sz="1"/>
+            </w:tcBorders>
+            <w:shd w:fill="F2F2F2" w:val="clear"/>
+            <w:tcMar>
+              <w:top w:type="dxa" w:w="80"/>
+              <w:left w:type="dxa" w:w="120"/>
+              <w:bottom w:type="dxa" w:w="80"/>
+              <w:right w:type="dxa" w:w="120"/>
+            </w:tcMar>
+          </w:tcPr>
+          <w:p>
+            <w:r>
+              <w:rPr>
+                <w:rFonts w:ascii="Arial" w:cs="Arial" w:eastAsia="Arial" w:hAnsi="Arial"/>
+                <w:sz w:val="20"/>
+                <w:szCs w:val="20"/>
+              </w:rPr>
+              <w:t xml:space="preserve">Google Integration Extension</w:t>
+            </w:r>
+          </w:p>
+        </w:tc>
+        <w:tc>
+          <w:tcPr>
+            <w:tcW w:type="dxa" w:w="6860"/>
+            <w:tcBorders>
+              <w:top w:val="single" w:color="CCCCCC" w:sz="1"/>
+              <w:left w:val="single" w:color="CCCCCC" w:sz="1"/>
+              <w:bottom w:val="single" w:color="CCCCCC" w:sz="1"/>
+              <w:right w:val="single" w:color="CCCCCC" w:sz="1"/>
+            </w:tcBorders>
+            <w:shd w:fill="F2F2F2" w:val="clear"/>
+            <w:tcMar>
+              <w:top w:type="dxa" w:w="80"/>
+              <w:left w:type="dxa" w:w="120"/>
+              <w:bottom w:type="dxa" w:w="80"/>
+              <w:right w:type="dxa" w:w="120"/>
+            </w:tcMar>
+          </w:tcPr>
+          <w:p>
+            <w:r>
+              <w:rPr>
+                <w:rFonts w:ascii="Arial" w:cs="Arial" w:eastAsia="Arial" w:hAnsi="Arial"/>
+                <w:sz w:val="20"/>
+                <w:szCs w:val="20"/>
+              </w:rPr>
+              <w:t xml:space="preserve">An official EspoCRM extension that enables OAuth-based Gmail authentication, Google Calendar sync, and Google Contacts integration.</w:t>
+            </w:r>
+          </w:p>
+        </w:tc>
+      </w:tr>
+      <w:tr>
+        <w:tc>
+          <w:tcPr>
+            <w:tcW w:type="dxa" w:w="2500"/>
+            <w:tcBorders>
+              <w:top w:val="single" w:color="CCCCCC" w:sz="1"/>
+              <w:left w:val="single" w:color="CCCCCC" w:sz="1"/>
+              <w:bottom w:val="single" w:color="CCCCCC" w:sz="1"/>
+              <w:right w:val="single" w:color="CCCCCC" w:sz="1"/>
+            </w:tcBorders>
+            <w:shd w:fill="FFFFFF" w:val="clear"/>
+            <w:tcMar>
+              <w:top w:type="dxa" w:w="80"/>
+              <w:left w:type="dxa" w:w="120"/>
+              <w:bottom w:type="dxa" w:w="80"/>
+              <w:right w:type="dxa" w:w="120"/>
+            </w:tcMar>
+          </w:tcPr>
+          <w:p>
+            <w:r>
+              <w:rPr>
+                <w:rFonts w:ascii="Arial" w:cs="Arial" w:eastAsia="Arial" w:hAnsi="Arial"/>
+                <w:sz w:val="20"/>
+                <w:szCs w:val="20"/>
+              </w:rPr>
+              <w:t xml:space="preserve">Google Workspace for Nonprofits</w:t>
+            </w:r>
+          </w:p>
+        </w:tc>
+        <w:tc>
+          <w:tcPr>
+            <w:tcW w:type="dxa" w:w="6860"/>
+            <w:tcBorders>
+              <w:top w:val="single" w:color="CCCCCC" w:sz="1"/>
+              <w:left w:val="single" w:color="CCCCCC" w:sz="1"/>
+              <w:bottom w:val="single" w:color="CCCCCC" w:sz="1"/>
+              <w:right w:val="single" w:color="CCCCCC" w:sz="1"/>
+            </w:tcBorders>
+            <w:shd w:fill="FFFFFF" w:val="clear"/>
+            <w:tcMar>
+              <w:top w:type="dxa" w:w="80"/>
+              <w:left w:type="dxa" w:w="120"/>
+              <w:bottom w:type="dxa" w:w="80"/>
+              <w:right w:type="dxa" w:w="120"/>
+            </w:tcMar>
+          </w:tcPr>
+          <w:p>
+            <w:r>
+              <w:rPr>
+                <w:rFonts w:ascii="Arial" w:cs="Arial" w:eastAsia="Arial" w:hAnsi="Arial"/>
+                <w:sz w:val="20"/>
+                <w:szCs w:val="20"/>
+              </w:rPr>
+              <w:t xml:space="preserve">Google's suite of productivity tools provided at no cost to eligible nonprofits. CBM uses it for Gmail, Google Meet, and Google Drive.</w:t>
+            </w:r>
+          </w:p>
+        </w:tc>
+      </w:tr>
+      <w:tr>
+        <w:tc>
+          <w:tcPr>
+            <w:tcW w:type="dxa" w:w="2500"/>
+            <w:tcBorders>
+              <w:top w:val="single" w:color="CCCCCC" w:sz="1"/>
+              <w:left w:val="single" w:color="CCCCCC" w:sz="1"/>
+              <w:bottom w:val="single" w:color="CCCCCC" w:sz="1"/>
+              <w:right w:val="single" w:color="CCCCCC" w:sz="1"/>
+            </w:tcBorders>
+            <w:shd w:fill="F2F2F2" w:val="clear"/>
+            <w:tcMar>
+              <w:top w:type="dxa" w:w="80"/>
+              <w:left w:type="dxa" w:w="120"/>
+              <w:bottom w:type="dxa" w:w="80"/>
+              <w:right w:type="dxa" w:w="120"/>
+            </w:tcMar>
+          </w:tcPr>
+          <w:p>
+            <w:r>
+              <w:rPr>
+                <w:rFonts w:ascii="Arial" w:cs="Arial" w:eastAsia="Arial" w:hAnsi="Arial"/>
+                <w:sz w:val="20"/>
+                <w:szCs w:val="20"/>
+              </w:rPr>
+              <w:t xml:space="preserve">Jitsi Meet</w:t>
+            </w:r>
+          </w:p>
+        </w:tc>
+        <w:tc>
+          <w:tcPr>
+            <w:tcW w:type="dxa" w:w="6860"/>
+            <w:tcBorders>
+              <w:top w:val="single" w:color="CCCCCC" w:sz="1"/>
+              <w:left w:val="single" w:color="CCCCCC" w:sz="1"/>
+              <w:bottom w:val="single" w:color="CCCCCC" w:sz="1"/>
+              <w:right w:val="single" w:color="CCCCCC" w:sz="1"/>
+            </w:tcBorders>
+            <w:shd w:fill="F2F2F2" w:val="clear"/>
+            <w:tcMar>
+              <w:top w:type="dxa" w:w="80"/>
+              <w:left w:type="dxa" w:w="120"/>
+              <w:bottom w:type="dxa" w:w="80"/>
+              <w:right w:type="dxa" w:w="120"/>
+            </w:tcMar>
+          </w:tcPr>
+          <w:p>
+            <w:r>
+              <w:rPr>
+                <w:rFonts w:ascii="Arial" w:cs="Arial" w:eastAsia="Arial" w:hAnsi="Arial"/>
+                <w:sz w:val="20"/>
+                <w:szCs w:val="20"/>
+              </w:rPr>
+              <w:t xml:space="preserve">An open-source video conferencing tool self-hosted on AWS and used for CBM internal meetings such as board meetings, mentor training, and committee calls.</w:t>
+            </w:r>
+          </w:p>
+        </w:tc>
+      </w:tr>
+      <w:tr>
+        <w:tc>
+          <w:tcPr>
+            <w:tcW w:type="dxa" w:w="2500"/>
+            <w:tcBorders>
+              <w:top w:val="single" w:color="CCCCCC" w:sz="1"/>
+              <w:left w:val="single" w:color="CCCCCC" w:sz="1"/>
+              <w:bottom w:val="single" w:color="CCCCCC" w:sz="1"/>
+              <w:right w:val="single" w:color="CCCCCC" w:sz="1"/>
+            </w:tcBorders>
+            <w:shd w:fill="FFFFFF" w:val="clear"/>
+            <w:tcMar>
+              <w:top w:type="dxa" w:w="80"/>
+              <w:left w:type="dxa" w:w="120"/>
+              <w:bottom w:type="dxa" w:w="80"/>
+              <w:right w:type="dxa" w:w="120"/>
+            </w:tcMar>
+          </w:tcPr>
+          <w:p>
+            <w:r>
+              <w:rPr>
+                <w:rFonts w:ascii="Arial" w:cs="Arial" w:eastAsia="Arial" w:hAnsi="Arial"/>
+                <w:sz w:val="20"/>
+                <w:szCs w:val="20"/>
+              </w:rPr>
+              <w:t xml:space="preserve">LimeSurvey</w:t>
+            </w:r>
+          </w:p>
+        </w:tc>
+        <w:tc>
+          <w:tcPr>
+            <w:tcW w:type="dxa" w:w="6860"/>
+            <w:tcBorders>
+              <w:top w:val="single" w:color="CCCCCC" w:sz="1"/>
+              <w:left w:val="single" w:color="CCCCCC" w:sz="1"/>
+              <w:bottom w:val="single" w:color="CCCCCC" w:sz="1"/>
+              <w:right w:val="single" w:color="CCCCCC" w:sz="1"/>
+            </w:tcBorders>
+            <w:shd w:fill="FFFFFF" w:val="clear"/>
+            <w:tcMar>
+              <w:top w:type="dxa" w:w="80"/>
+              <w:left w:type="dxa" w:w="120"/>
+              <w:bottom w:type="dxa" w:w="80"/>
+              <w:right w:type="dxa" w:w="120"/>
+            </w:tcMar>
+          </w:tcPr>
+          <w:p>
+            <w:r>
+              <w:rPr>
+                <w:rFonts w:ascii="Arial" w:cs="Arial" w:eastAsia="Arial" w:hAnsi="Arial"/>
+                <w:sz w:val="20"/>
+                <w:szCs w:val="20"/>
+              </w:rPr>
+              <w:t xml:space="preserve">An open-source survey tool designated as the fallback integration if EspoCRM's native NPS workflow is insufficient.</w:t>
+            </w:r>
+          </w:p>
+        </w:tc>
+      </w:tr>
+      <w:tr>
+        <w:tc>
+          <w:tcPr>
+            <w:tcW w:type="dxa" w:w="2500"/>
+            <w:tcBorders>
+              <w:top w:val="single" w:color="CCCCCC" w:sz="1"/>
+              <w:left w:val="single" w:color="CCCCCC" w:sz="1"/>
+              <w:bottom w:val="single" w:color="CCCCCC" w:sz="1"/>
+              <w:right w:val="single" w:color="CCCCCC" w:sz="1"/>
+            </w:tcBorders>
+            <w:shd w:fill="F2F2F2" w:val="clear"/>
+            <w:tcMar>
+              <w:top w:type="dxa" w:w="80"/>
+              <w:left w:type="dxa" w:w="120"/>
+              <w:bottom w:type="dxa" w:w="80"/>
+              <w:right w:type="dxa" w:w="120"/>
+            </w:tcMar>
+          </w:tcPr>
+          <w:p>
+            <w:r>
+              <w:rPr>
+                <w:rFonts w:ascii="Arial" w:cs="Arial" w:eastAsia="Arial" w:hAnsi="Arial"/>
+                <w:sz w:val="20"/>
+                <w:szCs w:val="20"/>
+              </w:rPr>
+              <w:t xml:space="preserve">Moodle</w:t>
+            </w:r>
+          </w:p>
+        </w:tc>
+        <w:tc>
+          <w:tcPr>
+            <w:tcW w:type="dxa" w:w="6860"/>
+            <w:tcBorders>
+              <w:top w:val="single" w:color="CCCCCC" w:sz="1"/>
+              <w:left w:val="single" w:color="CCCCCC" w:sz="1"/>
+              <w:bottom w:val="single" w:color="CCCCCC" w:sz="1"/>
+              <w:right w:val="single" w:color="CCCCCC" w:sz="1"/>
+            </w:tcBorders>
+            <w:shd w:fill="F2F2F2" w:val="clear"/>
+            <w:tcMar>
+              <w:top w:type="dxa" w:w="80"/>
+              <w:left w:type="dxa" w:w="120"/>
+              <w:bottom w:type="dxa" w:w="80"/>
+              <w:right w:type="dxa" w:w="120"/>
+            </w:tcMar>
+          </w:tcPr>
+          <w:p>
+            <w:r>
+              <w:rPr>
+                <w:rFonts w:ascii="Arial" w:cs="Arial" w:eastAsia="Arial" w:hAnsi="Arial"/>
+                <w:sz w:val="20"/>
+                <w:szCs w:val="20"/>
+              </w:rPr>
+              <w:t xml:space="preserve">The open-source learning management system (LMS) used for mentor onboarding training and client education content.</w:t>
+            </w:r>
+          </w:p>
+        </w:tc>
+      </w:tr>
+      <w:tr>
+        <w:tc>
+          <w:tcPr>
+            <w:tcW w:type="dxa" w:w="2500"/>
+            <w:tcBorders>
+              <w:top w:val="single" w:color="CCCCCC" w:sz="1"/>
+              <w:left w:val="single" w:color="CCCCCC" w:sz="1"/>
+              <w:bottom w:val="single" w:color="CCCCCC" w:sz="1"/>
+              <w:right w:val="single" w:color="CCCCCC" w:sz="1"/>
+            </w:tcBorders>
+            <w:shd w:fill="FFFFFF" w:val="clear"/>
+            <w:tcMar>
+              <w:top w:type="dxa" w:w="80"/>
+              <w:left w:type="dxa" w:w="120"/>
+              <w:bottom w:type="dxa" w:w="80"/>
+              <w:right w:type="dxa" w:w="120"/>
+            </w:tcMar>
+          </w:tcPr>
+          <w:p>
+            <w:r>
+              <w:rPr>
+                <w:rFonts w:ascii="Arial" w:cs="Arial" w:eastAsia="Arial" w:hAnsi="Arial"/>
+                <w:sz w:val="20"/>
+                <w:szCs w:val="20"/>
+              </w:rPr>
+              <w:t xml:space="preserve">OAuth</w:t>
+            </w:r>
+          </w:p>
+        </w:tc>
+        <w:tc>
+          <w:tcPr>
+            <w:tcW w:type="dxa" w:w="6860"/>
+            <w:tcBorders>
+              <w:top w:val="single" w:color="CCCCCC" w:sz="1"/>
+              <w:left w:val="single" w:color="CCCCCC" w:sz="1"/>
+              <w:bottom w:val="single" w:color="CCCCCC" w:sz="1"/>
+              <w:right w:val="single" w:color="CCCCCC" w:sz="1"/>
+            </w:tcBorders>
+            <w:shd w:fill="FFFFFF" w:val="clear"/>
+            <w:tcMar>
+              <w:top w:type="dxa" w:w="80"/>
+              <w:left w:type="dxa" w:w="120"/>
+              <w:bottom w:type="dxa" w:w="80"/>
+              <w:right w:type="dxa" w:w="120"/>
+            </w:tcMar>
+          </w:tcPr>
+          <w:p>
+            <w:r>
+              <w:rPr>
+                <w:rFonts w:ascii="Arial" w:cs="Arial" w:eastAsia="Arial" w:hAnsi="Arial"/>
+                <w:sz w:val="20"/>
+                <w:szCs w:val="20"/>
+              </w:rPr>
+              <w:t xml:space="preserve">An industry-standard authentication protocol used to securely connect Gmail accounts to EspoCRM without storing passwords.</w:t>
+            </w:r>
+          </w:p>
+        </w:tc>
+      </w:tr>
+      <w:tr>
+        <w:tc>
+          <w:tcPr>
+            <w:tcW w:type="dxa" w:w="2500"/>
+            <w:tcBorders>
+              <w:top w:val="single" w:color="CCCCCC" w:sz="1"/>
+              <w:left w:val="single" w:color="CCCCCC" w:sz="1"/>
+              <w:bottom w:val="single" w:color="CCCCCC" w:sz="1"/>
+              <w:right w:val="single" w:color="CCCCCC" w:sz="1"/>
+            </w:tcBorders>
+            <w:shd w:fill="F2F2F2" w:val="clear"/>
+            <w:tcMar>
+              <w:top w:type="dxa" w:w="80"/>
+              <w:left w:type="dxa" w:w="120"/>
+              <w:bottom w:type="dxa" w:w="80"/>
+              <w:right w:type="dxa" w:w="120"/>
+            </w:tcMar>
+          </w:tcPr>
+          <w:p>
+            <w:r>
+              <w:rPr>
+                <w:rFonts w:ascii="Arial" w:cs="Arial" w:eastAsia="Arial" w:hAnsi="Arial"/>
+                <w:sz w:val="20"/>
+                <w:szCs w:val="20"/>
+              </w:rPr>
+              <w:t xml:space="preserve">REST API</w:t>
+            </w:r>
+          </w:p>
+        </w:tc>
+        <w:tc>
+          <w:tcPr>
+            <w:tcW w:type="dxa" w:w="6860"/>
+            <w:tcBorders>
+              <w:top w:val="single" w:color="CCCCCC" w:sz="1"/>
+              <w:left w:val="single" w:color="CCCCCC" w:sz="1"/>
+              <w:bottom w:val="single" w:color="CCCCCC" w:sz="1"/>
+              <w:right w:val="single" w:color="CCCCCC" w:sz="1"/>
+            </w:tcBorders>
+            <w:shd w:fill="F2F2F2" w:val="clear"/>
+            <w:tcMar>
+              <w:top w:type="dxa" w:w="80"/>
+              <w:left w:type="dxa" w:w="120"/>
+              <w:bottom w:type="dxa" w:w="80"/>
+              <w:right w:type="dxa" w:w="120"/>
+            </w:tcMar>
+          </w:tcPr>
+          <w:p>
+            <w:r>
+              <w:rPr>
+                <w:rFonts w:ascii="Arial" w:cs="Arial" w:eastAsia="Arial" w:hAnsi="Arial"/>
+                <w:sz w:val="20"/>
+                <w:szCs w:val="20"/>
+              </w:rPr>
+              <w:t xml:space="preserve">A standard web interface provided by EspoCRM that allows external tools and systems to exchange data with the CRM programmatically.</w:t>
+            </w:r>
+          </w:p>
+        </w:tc>
+      </w:tr>
+    </w:tbl>
+    <w:p>
+      <w:r>
+        <w:t xml:space="preserve"/>
+      </w:r>
+    </w:p>
+    <w:p>
+      <w:pPr>
+        <w:pStyle w:val="Heading2"/>
+      </w:pPr>
+      <w:r>
+        <w:t xml:space="preserve">Process &amp; Workflow</w:t>
+      </w:r>
+    </w:p>
+    <w:tbl>
+      <w:tblPr>
+        <w:tblW w:type="dxa" w:w="9360"/>
+        <w:tblBorders>
+          <w:top w:val="single" w:color="auto" w:sz="4"/>
+          <w:left w:val="single" w:color="auto" w:sz="4"/>
+          <w:bottom w:val="single" w:color="auto" w:sz="4"/>
+          <w:right w:val="single" w:color="auto" w:sz="4"/>
+          <w:insideH w:val="single" w:color="auto" w:sz="4"/>
+          <w:insideV w:val="single" w:color="auto" w:sz="4"/>
+        </w:tblBorders>
+      </w:tblPr>
+      <w:tblGrid>
+        <w:gridCol w:w="2500"/>
+        <w:gridCol w:w="6860"/>
+      </w:tblGrid>
+      <w:tr>
+        <w:trPr>
+          <w:tblHeader/>
+        </w:trPr>
+        <w:tc>
+          <w:tcPr>
+            <w:tcW w:type="dxa" w:w="2500"/>
+            <w:tcBorders>
+              <w:top w:val="single" w:color="CCCCCC" w:sz="1"/>
+              <w:left w:val="single" w:color="CCCCCC" w:sz="1"/>
+              <w:bottom w:val="single" w:color="CCCCCC" w:sz="1"/>
+              <w:right w:val="single" w:color="CCCCCC" w:sz="1"/>
+            </w:tcBorders>
+            <w:shd w:fill="1F4E79" w:val="clear"/>
+            <w:tcMar>
+              <w:top w:type="dxa" w:w="80"/>
+              <w:left w:type="dxa" w:w="120"/>
+              <w:bottom w:type="dxa" w:w="80"/>
+              <w:right w:type="dxa" w:w="120"/>
+            </w:tcMar>
+          </w:tcPr>
+          <w:p>
+            <w:r>
+              <w:rPr>
+                <w:rFonts w:ascii="Arial" w:cs="Arial" w:eastAsia="Arial" w:hAnsi="Arial"/>
+                <w:b/>
+                <w:bCs/>
+                <w:color w:val="FFFFFF"/>
+                <w:sz w:val="20"/>
+                <w:szCs w:val="20"/>
+              </w:rPr>
+              <w:t xml:space="preserve">Term</w:t>
+            </w:r>
+          </w:p>
+        </w:tc>
+        <w:tc>
+          <w:tcPr>
+            <w:tcW w:type="dxa" w:w="6860"/>
+            <w:tcBorders>
+              <w:top w:val="single" w:color="CCCCCC" w:sz="1"/>
+              <w:left w:val="single" w:color="CCCCCC" w:sz="1"/>
+              <w:bottom w:val="single" w:color="CCCCCC" w:sz="1"/>
+              <w:right w:val="single" w:color="CCCCCC" w:sz="1"/>
+            </w:tcBorders>
+            <w:shd w:fill="1F4E79" w:val="clear"/>
+            <w:tcMar>
+              <w:top w:type="dxa" w:w="80"/>
+              <w:left w:type="dxa" w:w="120"/>
+              <w:bottom w:type="dxa" w:w="80"/>
+              <w:right w:type="dxa" w:w="120"/>
+            </w:tcMar>
+          </w:tcPr>
+          <w:p>
+            <w:r>
+              <w:rPr>
+                <w:rFonts w:ascii="Arial" w:cs="Arial" w:eastAsia="Arial" w:hAnsi="Arial"/>
+                <w:b/>
+                <w:bCs/>
+                <w:color w:val="FFFFFF"/>
+                <w:sz w:val="20"/>
+                <w:szCs w:val="20"/>
+              </w:rPr>
+              <w:t xml:space="preserve">Definition</w:t>
+            </w:r>
+          </w:p>
+        </w:tc>
+      </w:tr>
+      <w:tr>
+        <w:tc>
+          <w:tcPr>
+            <w:tcW w:type="dxa" w:w="2500"/>
+            <w:tcBorders>
+              <w:top w:val="single" w:color="CCCCCC" w:sz="1"/>
+              <w:left w:val="single" w:color="CCCCCC" w:sz="1"/>
+              <w:bottom w:val="single" w:color="CCCCCC" w:sz="1"/>
+              <w:right w:val="single" w:color="CCCCCC" w:sz="1"/>
+            </w:tcBorders>
+            <w:shd w:fill="FFFFFF" w:val="clear"/>
+            <w:tcMar>
+              <w:top w:type="dxa" w:w="80"/>
+              <w:left w:type="dxa" w:w="120"/>
+              <w:bottom w:type="dxa" w:w="80"/>
+              <w:right w:type="dxa" w:w="120"/>
+            </w:tcMar>
+          </w:tcPr>
+          <w:p>
+            <w:r>
+              <w:rPr>
+                <w:rFonts w:ascii="Arial" w:cs="Arial" w:eastAsia="Arial" w:hAnsi="Arial"/>
+                <w:sz w:val="20"/>
+                <w:szCs w:val="20"/>
+              </w:rPr>
+              <w:t xml:space="preserve">Engagement</w:t>
+            </w:r>
+          </w:p>
+        </w:tc>
+        <w:tc>
+          <w:tcPr>
+            <w:tcW w:type="dxa" w:w="6860"/>
+            <w:tcBorders>
+              <w:top w:val="single" w:color="CCCCCC" w:sz="1"/>
+              <w:left w:val="single" w:color="CCCCCC" w:sz="1"/>
+              <w:bottom w:val="single" w:color="CCCCCC" w:sz="1"/>
+              <w:right w:val="single" w:color="CCCCCC" w:sz="1"/>
+            </w:tcBorders>
+            <w:shd w:fill="FFFFFF" w:val="clear"/>
+            <w:tcMar>
+              <w:top w:type="dxa" w:w="80"/>
+              <w:left w:type="dxa" w:w="120"/>
+              <w:bottom w:type="dxa" w:w="80"/>
+              <w:right w:type="dxa" w:w="120"/>
+            </w:tcMar>
+          </w:tcPr>
+          <w:p>
+            <w:r>
+              <w:rPr>
+                <w:rFonts w:ascii="Arial" w:cs="Arial" w:eastAsia="Arial" w:hAnsi="Arial"/>
+                <w:sz w:val="20"/>
+                <w:szCs w:val="20"/>
+              </w:rPr>
+              <w:t xml:space="preserve">The formal mentoring relationship between a Primary Mentor and a client. An engagement has a defined start, ongoing session history, and a conclusion with recorded outcomes.</w:t>
+            </w:r>
+          </w:p>
+        </w:tc>
+      </w:tr>
+      <w:tr>
+        <w:tc>
+          <w:tcPr>
+            <w:tcW w:type="dxa" w:w="2500"/>
+            <w:tcBorders>
+              <w:top w:val="single" w:color="CCCCCC" w:sz="1"/>
+              <w:left w:val="single" w:color="CCCCCC" w:sz="1"/>
+              <w:bottom w:val="single" w:color="CCCCCC" w:sz="1"/>
+              <w:right w:val="single" w:color="CCCCCC" w:sz="1"/>
+            </w:tcBorders>
+            <w:shd w:fill="F2F2F2" w:val="clear"/>
+            <w:tcMar>
+              <w:top w:type="dxa" w:w="80"/>
+              <w:left w:type="dxa" w:w="120"/>
+              <w:bottom w:type="dxa" w:w="80"/>
+              <w:right w:type="dxa" w:w="120"/>
+            </w:tcMar>
+          </w:tcPr>
+          <w:p>
+            <w:r>
+              <w:rPr>
+                <w:rFonts w:ascii="Arial" w:cs="Arial" w:eastAsia="Arial" w:hAnsi="Arial"/>
+                <w:sz w:val="20"/>
+                <w:szCs w:val="20"/>
+              </w:rPr>
+              <w:t xml:space="preserve">Ethics Sign-Off</w:t>
+            </w:r>
+          </w:p>
+        </w:tc>
+        <w:tc>
+          <w:tcPr>
+            <w:tcW w:type="dxa" w:w="6860"/>
+            <w:tcBorders>
+              <w:top w:val="single" w:color="CCCCCC" w:sz="1"/>
+              <w:left w:val="single" w:color="CCCCCC" w:sz="1"/>
+              <w:bottom w:val="single" w:color="CCCCCC" w:sz="1"/>
+              <w:right w:val="single" w:color="CCCCCC" w:sz="1"/>
+            </w:tcBorders>
+            <w:shd w:fill="F2F2F2" w:val="clear"/>
+            <w:tcMar>
+              <w:top w:type="dxa" w:w="80"/>
+              <w:left w:type="dxa" w:w="120"/>
+              <w:bottom w:type="dxa" w:w="80"/>
+              <w:right w:type="dxa" w:w="120"/>
+            </w:tcMar>
+          </w:tcPr>
+          <w:p>
+            <w:r>
+              <w:rPr>
+                <w:rFonts w:ascii="Arial" w:cs="Arial" w:eastAsia="Arial" w:hAnsi="Arial"/>
+                <w:sz w:val="20"/>
+                <w:szCs w:val="20"/>
+              </w:rPr>
+              <w:t xml:space="preserve">A required checkbox acknowledgment within the Moodle onboarding curriculum confirming the mentor has read and agrees to CBM's code of conduct and confidentiality policy. Completion is timestamped and recorded.</w:t>
+            </w:r>
+          </w:p>
+        </w:tc>
+      </w:tr>
+      <w:tr>
+        <w:tc>
+          <w:tcPr>
+            <w:tcW w:type="dxa" w:w="2500"/>
+            <w:tcBorders>
+              <w:top w:val="single" w:color="CCCCCC" w:sz="1"/>
+              <w:left w:val="single" w:color="CCCCCC" w:sz="1"/>
+              <w:bottom w:val="single" w:color="CCCCCC" w:sz="1"/>
+              <w:right w:val="single" w:color="CCCCCC" w:sz="1"/>
+            </w:tcBorders>
+            <w:shd w:fill="FFFFFF" w:val="clear"/>
+            <w:tcMar>
+              <w:top w:type="dxa" w:w="80"/>
+              <w:left w:type="dxa" w:w="120"/>
+              <w:bottom w:type="dxa" w:w="80"/>
+              <w:right w:type="dxa" w:w="120"/>
+            </w:tcMar>
+          </w:tcPr>
+          <w:p>
+            <w:r>
+              <w:rPr>
+                <w:rFonts w:ascii="Arial" w:cs="Arial" w:eastAsia="Arial" w:hAnsi="Arial"/>
+                <w:sz w:val="20"/>
+                <w:szCs w:val="20"/>
+              </w:rPr>
+              <w:t xml:space="preserve">Inactivity Threshold</w:t>
+            </w:r>
+          </w:p>
+        </w:tc>
+        <w:tc>
+          <w:tcPr>
+            <w:tcW w:type="dxa" w:w="6860"/>
+            <w:tcBorders>
+              <w:top w:val="single" w:color="CCCCCC" w:sz="1"/>
+              <w:left w:val="single" w:color="CCCCCC" w:sz="1"/>
+              <w:bottom w:val="single" w:color="CCCCCC" w:sz="1"/>
+              <w:right w:val="single" w:color="CCCCCC" w:sz="1"/>
+            </w:tcBorders>
+            <w:shd w:fill="FFFFFF" w:val="clear"/>
+            <w:tcMar>
+              <w:top w:type="dxa" w:w="80"/>
+              <w:left w:type="dxa" w:w="120"/>
+              <w:bottom w:type="dxa" w:w="80"/>
+              <w:right w:type="dxa" w:w="120"/>
+            </w:tcMar>
+          </w:tcPr>
+          <w:p>
+            <w:r>
+              <w:rPr>
+                <w:rFonts w:ascii="Arial" w:cs="Arial" w:eastAsia="Arial" w:hAnsi="Arial"/>
+                <w:sz w:val="20"/>
+                <w:szCs w:val="20"/>
+              </w:rPr>
+              <w:t xml:space="preserve">A configurable period of time (e.g., 14 days) after which, if no communication or session activity has been logged for an engagement, the CRM automatically alerts the admin.</w:t>
+            </w:r>
+          </w:p>
+        </w:tc>
+      </w:tr>
+      <w:tr>
+        <w:tc>
+          <w:tcPr>
+            <w:tcW w:type="dxa" w:w="2500"/>
+            <w:tcBorders>
+              <w:top w:val="single" w:color="CCCCCC" w:sz="1"/>
+              <w:left w:val="single" w:color="CCCCCC" w:sz="1"/>
+              <w:bottom w:val="single" w:color="CCCCCC" w:sz="1"/>
+              <w:right w:val="single" w:color="CCCCCC" w:sz="1"/>
+            </w:tcBorders>
+            <w:shd w:fill="F2F2F2" w:val="clear"/>
+            <w:tcMar>
+              <w:top w:type="dxa" w:w="80"/>
+              <w:left w:type="dxa" w:w="120"/>
+              <w:bottom w:type="dxa" w:w="80"/>
+              <w:right w:type="dxa" w:w="120"/>
+            </w:tcMar>
+          </w:tcPr>
+          <w:p>
+            <w:r>
+              <w:rPr>
+                <w:rFonts w:ascii="Arial" w:cs="Arial" w:eastAsia="Arial" w:hAnsi="Arial"/>
+                <w:sz w:val="20"/>
+                <w:szCs w:val="20"/>
+              </w:rPr>
+              <w:t xml:space="preserve">Intake</w:t>
+            </w:r>
+          </w:p>
+        </w:tc>
+        <w:tc>
+          <w:tcPr>
+            <w:tcW w:type="dxa" w:w="6860"/>
+            <w:tcBorders>
+              <w:top w:val="single" w:color="CCCCCC" w:sz="1"/>
+              <w:left w:val="single" w:color="CCCCCC" w:sz="1"/>
+              <w:bottom w:val="single" w:color="CCCCCC" w:sz="1"/>
+              <w:right w:val="single" w:color="CCCCCC" w:sz="1"/>
+            </w:tcBorders>
+            <w:shd w:fill="F2F2F2" w:val="clear"/>
+            <w:tcMar>
+              <w:top w:type="dxa" w:w="80"/>
+              <w:left w:type="dxa" w:w="120"/>
+              <w:bottom w:type="dxa" w:w="80"/>
+              <w:right w:type="dxa" w:w="120"/>
+            </w:tcMar>
+          </w:tcPr>
+          <w:p>
+            <w:r>
+              <w:rPr>
+                <w:rFonts w:ascii="Arial" w:cs="Arial" w:eastAsia="Arial" w:hAnsi="Arial"/>
+                <w:sz w:val="20"/>
+                <w:szCs w:val="20"/>
+              </w:rPr>
+              <w:t xml:space="preserve">The process by which a prospective client applies for CBM mentoring services by submitting a form on the CBM website.</w:t>
+            </w:r>
+          </w:p>
+        </w:tc>
+      </w:tr>
+      <w:tr>
+        <w:tc>
+          <w:tcPr>
+            <w:tcW w:type="dxa" w:w="2500"/>
+            <w:tcBorders>
+              <w:top w:val="single" w:color="CCCCCC" w:sz="1"/>
+              <w:left w:val="single" w:color="CCCCCC" w:sz="1"/>
+              <w:bottom w:val="single" w:color="CCCCCC" w:sz="1"/>
+              <w:right w:val="single" w:color="CCCCCC" w:sz="1"/>
+            </w:tcBorders>
+            <w:shd w:fill="FFFFFF" w:val="clear"/>
+            <w:tcMar>
+              <w:top w:type="dxa" w:w="80"/>
+              <w:left w:type="dxa" w:w="120"/>
+              <w:bottom w:type="dxa" w:w="80"/>
+              <w:right w:type="dxa" w:w="120"/>
+            </w:tcMar>
+          </w:tcPr>
+          <w:p>
+            <w:r>
+              <w:rPr>
+                <w:rFonts w:ascii="Arial" w:cs="Arial" w:eastAsia="Arial" w:hAnsi="Arial"/>
+                <w:sz w:val="20"/>
+                <w:szCs w:val="20"/>
+              </w:rPr>
+              <w:t xml:space="preserve">KPI (Key Performance Indicator)</w:t>
+            </w:r>
+          </w:p>
+        </w:tc>
+        <w:tc>
+          <w:tcPr>
+            <w:tcW w:type="dxa" w:w="6860"/>
+            <w:tcBorders>
+              <w:top w:val="single" w:color="CCCCCC" w:sz="1"/>
+              <w:left w:val="single" w:color="CCCCCC" w:sz="1"/>
+              <w:bottom w:val="single" w:color="CCCCCC" w:sz="1"/>
+              <w:right w:val="single" w:color="CCCCCC" w:sz="1"/>
+            </w:tcBorders>
+            <w:shd w:fill="FFFFFF" w:val="clear"/>
+            <w:tcMar>
+              <w:top w:type="dxa" w:w="80"/>
+              <w:left w:type="dxa" w:w="120"/>
+              <w:bottom w:type="dxa" w:w="80"/>
+              <w:right w:type="dxa" w:w="120"/>
+            </w:tcMar>
+          </w:tcPr>
+          <w:p>
+            <w:r>
+              <w:rPr>
+                <w:rFonts w:ascii="Arial" w:cs="Arial" w:eastAsia="Arial" w:hAnsi="Arial"/>
+                <w:sz w:val="20"/>
+                <w:szCs w:val="20"/>
+              </w:rPr>
+              <w:t xml:space="preserve">A measurable metric used to track volunteer contributions and program outcomes. Examples include total clients served, mentoring hours contributed, and client NPS scores.</w:t>
+            </w:r>
+          </w:p>
+        </w:tc>
+      </w:tr>
+      <w:tr>
+        <w:tc>
+          <w:tcPr>
+            <w:tcW w:type="dxa" w:w="2500"/>
+            <w:tcBorders>
+              <w:top w:val="single" w:color="CCCCCC" w:sz="1"/>
+              <w:left w:val="single" w:color="CCCCCC" w:sz="1"/>
+              <w:bottom w:val="single" w:color="CCCCCC" w:sz="1"/>
+              <w:right w:val="single" w:color="CCCCCC" w:sz="1"/>
+            </w:tcBorders>
+            <w:shd w:fill="F2F2F2" w:val="clear"/>
+            <w:tcMar>
+              <w:top w:type="dxa" w:w="80"/>
+              <w:left w:type="dxa" w:w="120"/>
+              <w:bottom w:type="dxa" w:w="80"/>
+              <w:right w:type="dxa" w:w="120"/>
+            </w:tcMar>
+          </w:tcPr>
+          <w:p>
+            <w:r>
+              <w:rPr>
+                <w:rFonts w:ascii="Arial" w:cs="Arial" w:eastAsia="Arial" w:hAnsi="Arial"/>
+                <w:sz w:val="20"/>
+                <w:szCs w:val="20"/>
+              </w:rPr>
+              <w:t xml:space="preserve">NPS (Net Promoter Score)</w:t>
+            </w:r>
+          </w:p>
+        </w:tc>
+        <w:tc>
+          <w:tcPr>
+            <w:tcW w:type="dxa" w:w="6860"/>
+            <w:tcBorders>
+              <w:top w:val="single" w:color="CCCCCC" w:sz="1"/>
+              <w:left w:val="single" w:color="CCCCCC" w:sz="1"/>
+              <w:bottom w:val="single" w:color="CCCCCC" w:sz="1"/>
+              <w:right w:val="single" w:color="CCCCCC" w:sz="1"/>
+            </w:tcBorders>
+            <w:shd w:fill="F2F2F2" w:val="clear"/>
+            <w:tcMar>
+              <w:top w:type="dxa" w:w="80"/>
+              <w:left w:type="dxa" w:w="120"/>
+              <w:bottom w:type="dxa" w:w="80"/>
+              <w:right w:type="dxa" w:w="120"/>
+            </w:tcMar>
+          </w:tcPr>
+          <w:p>
+            <w:r>
+              <w:rPr>
+                <w:rFonts w:ascii="Arial" w:cs="Arial" w:eastAsia="Arial" w:hAnsi="Arial"/>
+                <w:sz w:val="20"/>
+                <w:szCs w:val="20"/>
+              </w:rPr>
+              <w:t xml:space="preserve">A standardized client satisfaction metric in which clients rate their experience on a scale of 0–10. Used by CBM to measure mentoring quality and inform program improvements.</w:t>
+            </w:r>
+          </w:p>
+        </w:tc>
+      </w:tr>
+      <w:tr>
+        <w:tc>
+          <w:tcPr>
+            <w:tcW w:type="dxa" w:w="2500"/>
+            <w:tcBorders>
+              <w:top w:val="single" w:color="CCCCCC" w:sz="1"/>
+              <w:left w:val="single" w:color="CCCCCC" w:sz="1"/>
+              <w:bottom w:val="single" w:color="CCCCCC" w:sz="1"/>
+              <w:right w:val="single" w:color="CCCCCC" w:sz="1"/>
+            </w:tcBorders>
+            <w:shd w:fill="FFFFFF" w:val="clear"/>
+            <w:tcMar>
+              <w:top w:type="dxa" w:w="80"/>
+              <w:left w:type="dxa" w:w="120"/>
+              <w:bottom w:type="dxa" w:w="80"/>
+              <w:right w:type="dxa" w:w="120"/>
+            </w:tcMar>
+          </w:tcPr>
+          <w:p>
+            <w:r>
+              <w:rPr>
+                <w:rFonts w:ascii="Arial" w:cs="Arial" w:eastAsia="Arial" w:hAnsi="Arial"/>
+                <w:sz w:val="20"/>
+                <w:szCs w:val="20"/>
+              </w:rPr>
+              <w:t xml:space="preserve">Onboarding</w:t>
+            </w:r>
+          </w:p>
+        </w:tc>
+        <w:tc>
+          <w:tcPr>
+            <w:tcW w:type="dxa" w:w="6860"/>
+            <w:tcBorders>
+              <w:top w:val="single" w:color="CCCCCC" w:sz="1"/>
+              <w:left w:val="single" w:color="CCCCCC" w:sz="1"/>
+              <w:bottom w:val="single" w:color="CCCCCC" w:sz="1"/>
+              <w:right w:val="single" w:color="CCCCCC" w:sz="1"/>
+            </w:tcBorders>
+            <w:shd w:fill="FFFFFF" w:val="clear"/>
+            <w:tcMar>
+              <w:top w:type="dxa" w:w="80"/>
+              <w:left w:type="dxa" w:w="120"/>
+              <w:bottom w:type="dxa" w:w="80"/>
+              <w:right w:type="dxa" w:w="120"/>
+            </w:tcMar>
+          </w:tcPr>
+          <w:p>
+            <w:r>
+              <w:rPr>
+                <w:rFonts w:ascii="Arial" w:cs="Arial" w:eastAsia="Arial" w:hAnsi="Arial"/>
+                <w:sz w:val="20"/>
+                <w:szCs w:val="20"/>
+              </w:rPr>
+              <w:t xml:space="preserve">The structured process by which a new mentor completes required training modules in Moodle, provides an ethics sign-off, and is reviewed and activated by admin before being eligible for client assignment.</w:t>
+            </w:r>
+          </w:p>
+        </w:tc>
+      </w:tr>
+      <w:tr>
+        <w:tc>
+          <w:tcPr>
+            <w:tcW w:type="dxa" w:w="2500"/>
+            <w:tcBorders>
+              <w:top w:val="single" w:color="CCCCCC" w:sz="1"/>
+              <w:left w:val="single" w:color="CCCCCC" w:sz="1"/>
+              <w:bottom w:val="single" w:color="CCCCCC" w:sz="1"/>
+              <w:right w:val="single" w:color="CCCCCC" w:sz="1"/>
+            </w:tcBorders>
+            <w:shd w:fill="F2F2F2" w:val="clear"/>
+            <w:tcMar>
+              <w:top w:type="dxa" w:w="80"/>
+              <w:left w:type="dxa" w:w="120"/>
+              <w:bottom w:type="dxa" w:w="80"/>
+              <w:right w:type="dxa" w:w="120"/>
+            </w:tcMar>
+          </w:tcPr>
+          <w:p>
+            <w:r>
+              <w:rPr>
+                <w:rFonts w:ascii="Arial" w:cs="Arial" w:eastAsia="Arial" w:hAnsi="Arial"/>
+                <w:sz w:val="20"/>
+                <w:szCs w:val="20"/>
+              </w:rPr>
+              <w:t xml:space="preserve">Session</w:t>
+            </w:r>
+          </w:p>
+        </w:tc>
+        <w:tc>
+          <w:tcPr>
+            <w:tcW w:type="dxa" w:w="6860"/>
+            <w:tcBorders>
+              <w:top w:val="single" w:color="CCCCCC" w:sz="1"/>
+              <w:left w:val="single" w:color="CCCCCC" w:sz="1"/>
+              <w:bottom w:val="single" w:color="CCCCCC" w:sz="1"/>
+              <w:right w:val="single" w:color="CCCCCC" w:sz="1"/>
+            </w:tcBorders>
+            <w:shd w:fill="F2F2F2" w:val="clear"/>
+            <w:tcMar>
+              <w:top w:type="dxa" w:w="80"/>
+              <w:left w:type="dxa" w:w="120"/>
+              <w:bottom w:type="dxa" w:w="80"/>
+              <w:right w:type="dxa" w:w="120"/>
+            </w:tcMar>
+          </w:tcPr>
+          <w:p>
+            <w:r>
+              <w:rPr>
+                <w:rFonts w:ascii="Arial" w:cs="Arial" w:eastAsia="Arial" w:hAnsi="Arial"/>
+                <w:sz w:val="20"/>
+                <w:szCs w:val="20"/>
+              </w:rPr>
+              <w:t xml:space="preserve">A scheduled meeting between a mentor and a client (or SME and client). Sessions are logged in EspoCRM with notes, duration, and outcomes.</w:t>
+            </w:r>
+          </w:p>
+        </w:tc>
+      </w:tr>
+      <w:tr>
+        <w:tc>
+          <w:tcPr>
+            <w:tcW w:type="dxa" w:w="2500"/>
+            <w:tcBorders>
+              <w:top w:val="single" w:color="CCCCCC" w:sz="1"/>
+              <w:left w:val="single" w:color="CCCCCC" w:sz="1"/>
+              <w:bottom w:val="single" w:color="CCCCCC" w:sz="1"/>
+              <w:right w:val="single" w:color="CCCCCC" w:sz="1"/>
+            </w:tcBorders>
+            <w:shd w:fill="FFFFFF" w:val="clear"/>
+            <w:tcMar>
+              <w:top w:type="dxa" w:w="80"/>
+              <w:left w:type="dxa" w:w="120"/>
+              <w:bottom w:type="dxa" w:w="80"/>
+              <w:right w:type="dxa" w:w="120"/>
+            </w:tcMar>
+          </w:tcPr>
+          <w:p>
+            <w:r>
+              <w:rPr>
+                <w:rFonts w:ascii="Arial" w:cs="Arial" w:eastAsia="Arial" w:hAnsi="Arial"/>
+                <w:sz w:val="20"/>
+                <w:szCs w:val="20"/>
+              </w:rPr>
+              <w:t xml:space="preserve">Single Source of Truth</w:t>
+            </w:r>
+          </w:p>
+        </w:tc>
+        <w:tc>
+          <w:tcPr>
+            <w:tcW w:type="dxa" w:w="6860"/>
+            <w:tcBorders>
+              <w:top w:val="single" w:color="CCCCCC" w:sz="1"/>
+              <w:left w:val="single" w:color="CCCCCC" w:sz="1"/>
+              <w:bottom w:val="single" w:color="CCCCCC" w:sz="1"/>
+              <w:right w:val="single" w:color="CCCCCC" w:sz="1"/>
+            </w:tcBorders>
+            <w:shd w:fill="FFFFFF" w:val="clear"/>
+            <w:tcMar>
+              <w:top w:type="dxa" w:w="80"/>
+              <w:left w:type="dxa" w:w="120"/>
+              <w:bottom w:type="dxa" w:w="80"/>
+              <w:right w:type="dxa" w:w="120"/>
+            </w:tcMar>
+          </w:tcPr>
+          <w:p>
+            <w:r>
+              <w:rPr>
+                <w:rFonts w:ascii="Arial" w:cs="Arial" w:eastAsia="Arial" w:hAnsi="Arial"/>
+                <w:sz w:val="20"/>
+                <w:szCs w:val="20"/>
+              </w:rPr>
+              <w:t xml:space="preserve">A core architectural principle stating that all organizational data originates in or is synced back to EspoCRM, ensuring consistency across all tools and reports.</w:t>
+            </w:r>
+          </w:p>
+        </w:tc>
+      </w:tr>
+    </w:tbl>
+    <w:p>
+      <w:r>
+        <w:t xml:space="preserve"/>
+      </w:r>
+    </w:p>
+    <w:p>
+      <w:pPr>
+        <w:pStyle w:val="Heading2"/>
+      </w:pPr>
+      <w:r>
+        <w:t xml:space="preserve">Volunteer Status</w:t>
+      </w:r>
+    </w:p>
+    <w:tbl>
+      <w:tblPr>
+        <w:tblW w:type="dxa" w:w="9360"/>
+        <w:tblBorders>
+          <w:top w:val="single" w:color="auto" w:sz="4"/>
+          <w:left w:val="single" w:color="auto" w:sz="4"/>
+          <w:bottom w:val="single" w:color="auto" w:sz="4"/>
+          <w:right w:val="single" w:color="auto" w:sz="4"/>
+          <w:insideH w:val="single" w:color="auto" w:sz="4"/>
+          <w:insideV w:val="single" w:color="auto" w:sz="4"/>
+        </w:tblBorders>
+      </w:tblPr>
+      <w:tblGrid>
+        <w:gridCol w:w="2500"/>
+        <w:gridCol w:w="6860"/>
+      </w:tblGrid>
+      <w:tr>
+        <w:trPr>
+          <w:tblHeader/>
+        </w:trPr>
+        <w:tc>
+          <w:tcPr>
+            <w:tcW w:type="dxa" w:w="2500"/>
+            <w:tcBorders>
+              <w:top w:val="single" w:color="CCCCCC" w:sz="1"/>
+              <w:left w:val="single" w:color="CCCCCC" w:sz="1"/>
+              <w:bottom w:val="single" w:color="CCCCCC" w:sz="1"/>
+              <w:right w:val="single" w:color="CCCCCC" w:sz="1"/>
+            </w:tcBorders>
+            <w:shd w:fill="1F4E79" w:val="clear"/>
+            <w:tcMar>
+              <w:top w:type="dxa" w:w="80"/>
+              <w:left w:type="dxa" w:w="120"/>
+              <w:bottom w:type="dxa" w:w="80"/>
+              <w:right w:type="dxa" w:w="120"/>
+            </w:tcMar>
+          </w:tcPr>
+          <w:p>
+            <w:r>
+              <w:rPr>
+                <w:rFonts w:ascii="Arial" w:cs="Arial" w:eastAsia="Arial" w:hAnsi="Arial"/>
+                <w:b/>
+                <w:bCs/>
+                <w:color w:val="FFFFFF"/>
+                <w:sz w:val="20"/>
+                <w:szCs w:val="20"/>
+              </w:rPr>
+              <w:t xml:space="preserve">Term</w:t>
+            </w:r>
+          </w:p>
+        </w:tc>
+        <w:tc>
+          <w:tcPr>
+            <w:tcW w:type="dxa" w:w="6860"/>
+            <w:tcBorders>
+              <w:top w:val="single" w:color="CCCCCC" w:sz="1"/>
+              <w:left w:val="single" w:color="CCCCCC" w:sz="1"/>
+              <w:bottom w:val="single" w:color="CCCCCC" w:sz="1"/>
+              <w:right w:val="single" w:color="CCCCCC" w:sz="1"/>
+            </w:tcBorders>
+            <w:shd w:fill="1F4E79" w:val="clear"/>
+            <w:tcMar>
+              <w:top w:type="dxa" w:w="80"/>
+              <w:left w:type="dxa" w:w="120"/>
+              <w:bottom w:type="dxa" w:w="80"/>
+              <w:right w:type="dxa" w:w="120"/>
+            </w:tcMar>
+          </w:tcPr>
+          <w:p>
+            <w:r>
+              <w:rPr>
+                <w:rFonts w:ascii="Arial" w:cs="Arial" w:eastAsia="Arial" w:hAnsi="Arial"/>
+                <w:b/>
+                <w:bCs/>
+                <w:color w:val="FFFFFF"/>
+                <w:sz w:val="20"/>
+                <w:szCs w:val="20"/>
+              </w:rPr>
+              <w:t xml:space="preserve">Definition</w:t>
+            </w:r>
+          </w:p>
+        </w:tc>
+      </w:tr>
+      <w:tr>
+        <w:tc>
+          <w:tcPr>
+            <w:tcW w:type="dxa" w:w="2500"/>
+            <w:tcBorders>
+              <w:top w:val="single" w:color="CCCCCC" w:sz="1"/>
+              <w:left w:val="single" w:color="CCCCCC" w:sz="1"/>
+              <w:bottom w:val="single" w:color="CCCCCC" w:sz="1"/>
+              <w:right w:val="single" w:color="CCCCCC" w:sz="1"/>
+            </w:tcBorders>
+            <w:shd w:fill="FFFFFF" w:val="clear"/>
+            <w:tcMar>
+              <w:top w:type="dxa" w:w="80"/>
+              <w:left w:type="dxa" w:w="120"/>
+              <w:bottom w:type="dxa" w:w="80"/>
+              <w:right w:type="dxa" w:w="120"/>
+            </w:tcMar>
+          </w:tcPr>
+          <w:p>
+            <w:r>
+              <w:rPr>
+                <w:rFonts w:ascii="Arial" w:cs="Arial" w:eastAsia="Arial" w:hAnsi="Arial"/>
+                <w:sz w:val="20"/>
+                <w:szCs w:val="20"/>
+              </w:rPr>
+              <w:t xml:space="preserve">Provisional</w:t>
+            </w:r>
+          </w:p>
+        </w:tc>
+        <w:tc>
+          <w:tcPr>
+            <w:tcW w:type="dxa" w:w="6860"/>
+            <w:tcBorders>
+              <w:top w:val="single" w:color="CCCCCC" w:sz="1"/>
+              <w:left w:val="single" w:color="CCCCCC" w:sz="1"/>
+              <w:bottom w:val="single" w:color="CCCCCC" w:sz="1"/>
+              <w:right w:val="single" w:color="CCCCCC" w:sz="1"/>
+            </w:tcBorders>
+            <w:shd w:fill="FFFFFF" w:val="clear"/>
+            <w:tcMar>
+              <w:top w:type="dxa" w:w="80"/>
+              <w:left w:type="dxa" w:w="120"/>
+              <w:bottom w:type="dxa" w:w="80"/>
+              <w:right w:type="dxa" w:w="120"/>
+            </w:tcMar>
+          </w:tcPr>
+          <w:p>
+            <w:r>
+              <w:rPr>
+                <w:rFonts w:ascii="Arial" w:cs="Arial" w:eastAsia="Arial" w:hAnsi="Arial"/>
+                <w:sz w:val="20"/>
+                <w:szCs w:val="20"/>
+              </w:rPr>
+              <w:t xml:space="preserve">A volunteer who has registered with CBM but has not yet completed onboarding training or received admin approval. Provisional volunteers are not eligible for client assignment.</w:t>
+            </w:r>
+          </w:p>
+        </w:tc>
+      </w:tr>
+      <w:tr>
+        <w:tc>
+          <w:tcPr>
+            <w:tcW w:type="dxa" w:w="2500"/>
+            <w:tcBorders>
+              <w:top w:val="single" w:color="CCCCCC" w:sz="1"/>
+              <w:left w:val="single" w:color="CCCCCC" w:sz="1"/>
+              <w:bottom w:val="single" w:color="CCCCCC" w:sz="1"/>
+              <w:right w:val="single" w:color="CCCCCC" w:sz="1"/>
+            </w:tcBorders>
+            <w:shd w:fill="F2F2F2" w:val="clear"/>
+            <w:tcMar>
+              <w:top w:type="dxa" w:w="80"/>
+              <w:left w:type="dxa" w:w="120"/>
+              <w:bottom w:type="dxa" w:w="80"/>
+              <w:right w:type="dxa" w:w="120"/>
+            </w:tcMar>
+          </w:tcPr>
+          <w:p>
+            <w:r>
+              <w:rPr>
+                <w:rFonts w:ascii="Arial" w:cs="Arial" w:eastAsia="Arial" w:hAnsi="Arial"/>
+                <w:sz w:val="20"/>
+                <w:szCs w:val="20"/>
+              </w:rPr>
+              <w:t xml:space="preserve">Active</w:t>
+            </w:r>
+          </w:p>
+        </w:tc>
+        <w:tc>
+          <w:tcPr>
+            <w:tcW w:type="dxa" w:w="6860"/>
+            <w:tcBorders>
+              <w:top w:val="single" w:color="CCCCCC" w:sz="1"/>
+              <w:left w:val="single" w:color="CCCCCC" w:sz="1"/>
+              <w:bottom w:val="single" w:color="CCCCCC" w:sz="1"/>
+              <w:right w:val="single" w:color="CCCCCC" w:sz="1"/>
+            </w:tcBorders>
+            <w:shd w:fill="F2F2F2" w:val="clear"/>
+            <w:tcMar>
+              <w:top w:type="dxa" w:w="80"/>
+              <w:left w:type="dxa" w:w="120"/>
+              <w:bottom w:type="dxa" w:w="80"/>
+              <w:right w:type="dxa" w:w="120"/>
+            </w:tcMar>
+          </w:tcPr>
+          <w:p>
+            <w:r>
+              <w:rPr>
+                <w:rFonts w:ascii="Arial" w:cs="Arial" w:eastAsia="Arial" w:hAnsi="Arial"/>
+                <w:sz w:val="20"/>
+                <w:szCs w:val="20"/>
+              </w:rPr>
+              <w:t xml:space="preserve">A volunteer who has completed onboarding, provided an ethics sign-off, and been manually approved by admin. Active mentors are eligible for client assignment.</w:t>
+            </w:r>
+          </w:p>
+        </w:tc>
+      </w:tr>
+      <w:tr>
+        <w:tc>
+          <w:tcPr>
+            <w:tcW w:type="dxa" w:w="2500"/>
+            <w:tcBorders>
+              <w:top w:val="single" w:color="CCCCCC" w:sz="1"/>
+              <w:left w:val="single" w:color="CCCCCC" w:sz="1"/>
+              <w:bottom w:val="single" w:color="CCCCCC" w:sz="1"/>
+              <w:right w:val="single" w:color="CCCCCC" w:sz="1"/>
+            </w:tcBorders>
+            <w:shd w:fill="FFFFFF" w:val="clear"/>
+            <w:tcMar>
+              <w:top w:type="dxa" w:w="80"/>
+              <w:left w:type="dxa" w:w="120"/>
+              <w:bottom w:type="dxa" w:w="80"/>
+              <w:right w:type="dxa" w:w="120"/>
+            </w:tcMar>
+          </w:tcPr>
+          <w:p>
+            <w:r>
+              <w:rPr>
+                <w:rFonts w:ascii="Arial" w:cs="Arial" w:eastAsia="Arial" w:hAnsi="Arial"/>
+                <w:sz w:val="20"/>
+                <w:szCs w:val="20"/>
+              </w:rPr>
+              <w:t xml:space="preserve">Inactive</w:t>
+            </w:r>
+          </w:p>
+        </w:tc>
+        <w:tc>
+          <w:tcPr>
+            <w:tcW w:type="dxa" w:w="6860"/>
+            <w:tcBorders>
+              <w:top w:val="single" w:color="CCCCCC" w:sz="1"/>
+              <w:left w:val="single" w:color="CCCCCC" w:sz="1"/>
+              <w:bottom w:val="single" w:color="CCCCCC" w:sz="1"/>
+              <w:right w:val="single" w:color="CCCCCC" w:sz="1"/>
+            </w:tcBorders>
+            <w:shd w:fill="FFFFFF" w:val="clear"/>
+            <w:tcMar>
+              <w:top w:type="dxa" w:w="80"/>
+              <w:left w:type="dxa" w:w="120"/>
+              <w:bottom w:type="dxa" w:w="80"/>
+              <w:right w:type="dxa" w:w="120"/>
+            </w:tcMar>
+          </w:tcPr>
+          <w:p>
+            <w:r>
+              <w:rPr>
+                <w:rFonts w:ascii="Arial" w:cs="Arial" w:eastAsia="Arial" w:hAnsi="Arial"/>
+                <w:sz w:val="20"/>
+                <w:szCs w:val="20"/>
+              </w:rPr>
+              <w:t xml:space="preserve">A volunteer who remains affiliated with CBM but is temporarily not accepting new clients. Inactive status may be self-requested or admin-assigned.</w:t>
+            </w:r>
+          </w:p>
+        </w:tc>
+      </w:tr>
+      <w:tr>
+        <w:tc>
+          <w:tcPr>
+            <w:tcW w:type="dxa" w:w="2500"/>
+            <w:tcBorders>
+              <w:top w:val="single" w:color="CCCCCC" w:sz="1"/>
+              <w:left w:val="single" w:color="CCCCCC" w:sz="1"/>
+              <w:bottom w:val="single" w:color="CCCCCC" w:sz="1"/>
+              <w:right w:val="single" w:color="CCCCCC" w:sz="1"/>
+            </w:tcBorders>
+            <w:shd w:fill="F2F2F2" w:val="clear"/>
+            <w:tcMar>
+              <w:top w:type="dxa" w:w="80"/>
+              <w:left w:type="dxa" w:w="120"/>
+              <w:bottom w:type="dxa" w:w="80"/>
+              <w:right w:type="dxa" w:w="120"/>
+            </w:tcMar>
+          </w:tcPr>
+          <w:p>
+            <w:r>
+              <w:rPr>
+                <w:rFonts w:ascii="Arial" w:cs="Arial" w:eastAsia="Arial" w:hAnsi="Arial"/>
+                <w:sz w:val="20"/>
+                <w:szCs w:val="20"/>
+              </w:rPr>
+              <w:t xml:space="preserve">Departed</w:t>
+            </w:r>
+          </w:p>
+        </w:tc>
+        <w:tc>
+          <w:tcPr>
+            <w:tcW w:type="dxa" w:w="6860"/>
+            <w:tcBorders>
+              <w:top w:val="single" w:color="CCCCCC" w:sz="1"/>
+              <w:left w:val="single" w:color="CCCCCC" w:sz="1"/>
+              <w:bottom w:val="single" w:color="CCCCCC" w:sz="1"/>
+              <w:right w:val="single" w:color="CCCCCC" w:sz="1"/>
+            </w:tcBorders>
+            <w:shd w:fill="F2F2F2" w:val="clear"/>
+            <w:tcMar>
+              <w:top w:type="dxa" w:w="80"/>
+              <w:left w:type="dxa" w:w="120"/>
+              <w:bottom w:type="dxa" w:w="80"/>
+              <w:right w:type="dxa" w:w="120"/>
+            </w:tcMar>
+          </w:tcPr>
+          <w:p>
+            <w:r>
+              <w:rPr>
+                <w:rFonts w:ascii="Arial" w:cs="Arial" w:eastAsia="Arial" w:hAnsi="Arial"/>
+                <w:sz w:val="20"/>
+                <w:szCs w:val="20"/>
+              </w:rPr>
+              <w:t xml:space="preserve">A volunteer who is no longer affiliated with CBM. Departed volunteer profiles are retained in EspoCRM per CBM's data retention policy but are deactivated.</w:t>
+            </w:r>
+          </w:p>
+        </w:tc>
+      </w:tr>
+    </w:tbl>
+    <w:p>
+      <w:r>
+        <w:t xml:space="preserve"/>
+      </w:r>
+    </w:p>
+    <w:p>
+      <w:pPr>
+        <w:pStyle w:val="Heading1"/>
+      </w:pPr>
+      <w:r>
+        <w:t xml:space="preserve">18. Document Control</w:t>
       </w:r>
     </w:p>
     <w:tbl>

</xml_diff>

<commit_message>
Update CRM PRD — email domain updated to cbmentors.org
</commit_message>
<xml_diff>
--- a/PRDs/CBM-PRD-CRM.docx
+++ b/PRDs/CBM-PRD-CRM.docx
@@ -46,7 +46,7 @@
           <w:sz w:val="22"/>
           <w:szCs w:val="22"/>
         </w:rPr>
-        <w:t xml:space="preserve">Version 0.4  |  March 15, 2026 at 03:25 PM UTC</w:t>
+        <w:t xml:space="preserve">Version 0.4  |  March 15, 2026 at 03:42 PM UTC</w:t>
       </w:r>
     </w:p>
     <w:p>
@@ -3834,7 +3834,7 @@
         <w:spacing w:after="120"/>
       </w:pPr>
       <w:r>
-        <w:t xml:space="preserve">Each mentor is provisioned a personalized CBM email address (e.g., john.smith@clevelandbusinessmentors.org) via Google Workspace for Nonprofits. This address is connected to EspoCRM via OAuth using EspoCRM's official Google Integration extension, enabling bidirectional email sync while maintaining full privacy isolation between mentors.</w:t>
+        <w:t xml:space="preserve">Each mentor is provisioned a personalized CBM email address (e.g., john.smith@cbmentors.org) via Google Workspace for Nonprofits. This address is connected to EspoCRM via OAuth using EspoCRM's official Google Integration extension, enabling bidirectional email sync while maintaining full privacy isolation between mentors.</w:t>
       </w:r>
     </w:p>
     <w:p>
@@ -3864,7 +3864,7 @@
           <w:b w:val="false"/>
           <w:bCs w:val="false"/>
         </w:rPr>
-        <w:t xml:space="preserve">Each mentor receives a personalized john.smith@clevelandbusinessmentors.org Gmail account via Google Workspace for Nonprofits</w:t>
+        <w:t xml:space="preserve">Each mentor receives a personalized john.smith@cbmentors.org Gmail account via Google Workspace for Nonprofits</w:t>
       </w:r>
     </w:p>
     <w:p>
@@ -9379,7 +9379,7 @@
                 <w:sz w:val="20"/>
                 <w:szCs w:val="20"/>
               </w:rPr>
-              <w:t xml:space="preserve">March 15, 2026 at 03:25 PM UTC</w:t>
+              <w:t xml:space="preserve">March 15, 2026 at 03:42 PM UTC</w:t>
             </w:r>
           </w:p>
         </w:tc>

</xml_diff>

<commit_message>
Add CRM Mentor and Client design document stubs; update Master PRD and CRM PRD
New documents:
- CBM-PRD-CRM-Mentor.docx — stub with sections: Overview, Data Structure, Relationships, Processes & Workflows, Security, Document Control
- CBM-PRD-CRM-Client.docx — stub with sections: Overview, Data Structure, Relationships, Processes & Workflows, Security, Document Control

Updated CBM-PRD-Master.docx:
- Section PRD Index updated to include CBM-PRD-CRM-Mentor.docx and CBM-PRD-CRM-Client.docx
- Email domain updated to cbmentors.org
- Dynamic date/time stamping added
- Version updated to 0.2
- Repository name corrected

Updated CBM-PRD-CRM.docx:
- Document Control table updated with Related Documents references to new CRM design docs

Updated CBM-Decisions-Log.docx:
- Dynamic date/time stamping applied
</commit_message>
<xml_diff>
--- a/PRDs/CBM-PRD-CRM.docx
+++ b/PRDs/CBM-PRD-CRM.docx
@@ -46,7 +46,7 @@
           <w:sz w:val="22"/>
           <w:szCs w:val="22"/>
         </w:rPr>
-        <w:t xml:space="preserve">Version 0.4  |  March 15, 2026 at 03:42 PM UTC</w:t>
+        <w:t xml:space="preserve">Version 0.4  |  March 15, 2026 at 03:54 PM UTC</w:t>
       </w:r>
     </w:p>
     <w:p>
@@ -9379,7 +9379,7 @@
                 <w:sz w:val="20"/>
                 <w:szCs w:val="20"/>
               </w:rPr>
-              <w:t xml:space="preserve">March 15, 2026 at 03:42 PM UTC</w:t>
+              <w:t xml:space="preserve">March 15, 2026 at 03:54 PM UTC</w:t>
             </w:r>
           </w:p>
         </w:tc>
@@ -9438,6 +9438,122 @@
                 <w:szCs w:val="20"/>
               </w:rPr>
               <w:t xml:space="preserve">After EspoCRM installation and initial configuration</w:t>
+            </w:r>
+          </w:p>
+        </w:tc>
+      </w:tr>
+      <w:tr>
+        <w:tc>
+          <w:tcPr>
+            <w:tcW w:type="dxa" w:w="3000"/>
+            <w:tcBorders>
+              <w:top w:val="single" w:color="CCCCCC" w:sz="1"/>
+              <w:left w:val="single" w:color="CCCCCC" w:sz="1"/>
+              <w:bottom w:val="single" w:color="CCCCCC" w:sz="1"/>
+              <w:right w:val="single" w:color="CCCCCC" w:sz="1"/>
+            </w:tcBorders>
+            <w:shd w:fill="FFFFFF" w:val="clear"/>
+            <w:tcMar>
+              <w:top w:type="dxa" w:w="80"/>
+              <w:left w:type="dxa" w:w="120"/>
+              <w:bottom w:type="dxa" w:w="80"/>
+              <w:right w:type="dxa" w:w="120"/>
+            </w:tcMar>
+          </w:tcPr>
+          <w:p>
+            <w:r>
+              <w:rPr>
+                <w:rFonts w:ascii="Arial" w:cs="Arial" w:eastAsia="Arial" w:hAnsi="Arial"/>
+                <w:sz w:val="20"/>
+                <w:szCs w:val="20"/>
+              </w:rPr>
+              <w:t xml:space="preserve">Related Documents</w:t>
+            </w:r>
+          </w:p>
+        </w:tc>
+        <w:tc>
+          <w:tcPr>
+            <w:tcW w:type="dxa" w:w="6360"/>
+            <w:tcBorders>
+              <w:top w:val="single" w:color="CCCCCC" w:sz="1"/>
+              <w:left w:val="single" w:color="CCCCCC" w:sz="1"/>
+              <w:bottom w:val="single" w:color="CCCCCC" w:sz="1"/>
+              <w:right w:val="single" w:color="CCCCCC" w:sz="1"/>
+            </w:tcBorders>
+            <w:shd w:fill="FFFFFF" w:val="clear"/>
+            <w:tcMar>
+              <w:top w:type="dxa" w:w="80"/>
+              <w:left w:type="dxa" w:w="120"/>
+              <w:bottom w:type="dxa" w:w="80"/>
+              <w:right w:type="dxa" w:w="120"/>
+            </w:tcMar>
+          </w:tcPr>
+          <w:p>
+            <w:r>
+              <w:rPr>
+                <w:rFonts w:ascii="Arial" w:cs="Arial" w:eastAsia="Arial" w:hAnsi="Arial"/>
+                <w:sz w:val="20"/>
+                <w:szCs w:val="20"/>
+              </w:rPr>
+              <w:t xml:space="preserve">CBM-PRD-CRM-Mentor.docx — Mentor CRM design and implementation</w:t>
+            </w:r>
+          </w:p>
+        </w:tc>
+      </w:tr>
+      <w:tr>
+        <w:tc>
+          <w:tcPr>
+            <w:tcW w:type="dxa" w:w="3000"/>
+            <w:tcBorders>
+              <w:top w:val="single" w:color="CCCCCC" w:sz="1"/>
+              <w:left w:val="single" w:color="CCCCCC" w:sz="1"/>
+              <w:bottom w:val="single" w:color="CCCCCC" w:sz="1"/>
+              <w:right w:val="single" w:color="CCCCCC" w:sz="1"/>
+            </w:tcBorders>
+            <w:shd w:fill="F2F2F2" w:val="clear"/>
+            <w:tcMar>
+              <w:top w:type="dxa" w:w="80"/>
+              <w:left w:type="dxa" w:w="120"/>
+              <w:bottom w:type="dxa" w:w="80"/>
+              <w:right w:type="dxa" w:w="120"/>
+            </w:tcMar>
+          </w:tcPr>
+          <w:p>
+            <w:r>
+              <w:rPr>
+                <w:rFonts w:ascii="Arial" w:cs="Arial" w:eastAsia="Arial" w:hAnsi="Arial"/>
+                <w:sz w:val="20"/>
+                <w:szCs w:val="20"/>
+              </w:rPr>
+              <w:t xml:space="preserve"/>
+            </w:r>
+          </w:p>
+        </w:tc>
+        <w:tc>
+          <w:tcPr>
+            <w:tcW w:type="dxa" w:w="6360"/>
+            <w:tcBorders>
+              <w:top w:val="single" w:color="CCCCCC" w:sz="1"/>
+              <w:left w:val="single" w:color="CCCCCC" w:sz="1"/>
+              <w:bottom w:val="single" w:color="CCCCCC" w:sz="1"/>
+              <w:right w:val="single" w:color="CCCCCC" w:sz="1"/>
+            </w:tcBorders>
+            <w:shd w:fill="F2F2F2" w:val="clear"/>
+            <w:tcMar>
+              <w:top w:type="dxa" w:w="80"/>
+              <w:left w:type="dxa" w:w="120"/>
+              <w:bottom w:type="dxa" w:w="80"/>
+              <w:right w:type="dxa" w:w="120"/>
+            </w:tcMar>
+          </w:tcPr>
+          <w:p>
+            <w:r>
+              <w:rPr>
+                <w:rFonts w:ascii="Arial" w:cs="Arial" w:eastAsia="Arial" w:hAnsi="Arial"/>
+                <w:sz w:val="20"/>
+                <w:szCs w:val="20"/>
+              </w:rPr>
+              <w:t xml:space="preserve">CBM-PRD-CRM-Client.docx — Client CRM design and implementation</w:t>
             </w:r>
           </w:p>
         </w:tc>

</xml_diff>

<commit_message>
Remove DECIDED statement, change SELECTED to RECOMMENDED in platform decision
</commit_message>
<xml_diff>
--- a/PRDs/CBM-PRD-CRM.docx
+++ b/PRDs/CBM-PRD-CRM.docx
@@ -12039,24 +12039,6 @@
       </w:pPr>
       <w:r>
         <w:t xml:space="preserve">3. Platform Decision</w:t>
-      </w:r>
-    </w:p>
-    <w:p>
-      <w:pPr>
-        <w:spacing w:after="120"/>
-      </w:pPr>
-      <w:r>
-        <w:rPr>
-          <w:b/>
-          <w:bCs/>
-          <w:color w:val="375623"/>
-        </w:rPr>
-        <w:t xml:space="preserve">✓ DECIDED: EspoCRM — self-hosted on AWS</w:t>
-      </w:r>
-    </w:p>
-    <w:p>
-      <w:r>
-        <w:t xml:space="preserve"/>
       </w:r>
     </w:p>
     <w:tbl>
@@ -12227,7 +12209,7 @@
                 <w:sz w:val="20"/>
                 <w:szCs w:val="20"/>
               </w:rPr>
-              <w:t xml:space="preserve">SELECTED</w:t>
+              <w:t xml:space="preserve">RECOMMENDED</w:t>
             </w:r>
           </w:p>
         </w:tc>
@@ -12313,7 +12295,7 @@
                 <w:sz w:val="20"/>
                 <w:szCs w:val="20"/>
               </w:rPr>
-              <w:t xml:space="preserve">NOT SELECTED</w:t>
+              <w:t xml:space="preserve">NOT RECOMMENDED</w:t>
             </w:r>
           </w:p>
         </w:tc>
@@ -12485,7 +12467,7 @@
                 <w:sz w:val="20"/>
                 <w:szCs w:val="20"/>
               </w:rPr>
-              <w:t xml:space="preserve">NOT SELECTED</w:t>
+              <w:t xml:space="preserve">NOT RECOMMENDED</w:t>
             </w:r>
           </w:p>
         </w:tc>

</xml_diff>

<commit_message>
Add Section 2 User Personas (11 personas); renumber existing sections 2-6 to 3-7
</commit_message>
<xml_diff>
--- a/PRDs/CBM-PRD-CRM.docx
+++ b/PRDs/CBM-PRD-CRM.docx
@@ -124,7 +124,7 @@
       </w:pPr>
       <w:r>
         <w:rPr/>
-        <w:t>2. Detailed Requirements</w:t>
+        <w:t>2. User Personas</w:t>
       </w:r>
     </w:p>
     <w:p>
@@ -138,12 +138,2946 @@
     </w:p>
     <w:p>
       <w:pPr>
+        <w:pStyle w:val="Normal"/>
+        <w:rPr/>
+      </w:pPr>
+      <w:r>
+        <w:rPr/>
+        <w:t xml:space="preserve">This section defines the user personas for the CBM CRM. Each persona represents a distinct role within the organization, describing who they are, the primary processes they perform in the CRM, and the information they need to perform those processes.</w:t>
+      </w:r>
+    </w:p>
+    <w:p>
+      <w:pPr>
+        <w:pStyle w:val="Normal"/>
+        <w:rPr/>
+      </w:pPr>
+      <w:r>
+        <w:rPr/>
+      </w:r>
+    </w:p>
+    <w:p>
+      <w:pPr>
         <w:pStyle w:val="Heading2"/>
         <w:rPr/>
       </w:pPr>
       <w:r>
         <w:rPr/>
-        <w:t>2.1  Mentor Administration</w:t>
+        <w:t>2.1  System Administrator</w:t>
+      </w:r>
+    </w:p>
+    <w:p>
+      <w:pPr>
+        <w:pStyle w:val="Normal"/>
+        <w:rPr/>
+      </w:pPr>
+      <w:r>
+        <w:rPr/>
+      </w:r>
+    </w:p>
+    <w:p>
+      <w:pPr>
+        <w:pStyle w:val="Normal"/>
+        <w:rPr/>
+      </w:pPr>
+      <w:r>
+        <w:rPr/>
+        <w:t xml:space="preserve">The System Administrator is responsible for the technical setup, configuration, and ongoing maintenance of the CRM and its integrated systems. This role ensures the platform is stable, secure, and properly configured to support all other users.</w:t>
+      </w:r>
+    </w:p>
+    <w:p>
+      <w:pPr>
+        <w:pStyle w:val="Normal"/>
+        <w:rPr/>
+      </w:pPr>
+      <w:r>
+        <w:rPr/>
+      </w:r>
+    </w:p>
+    <w:p>
+      <w:pPr>
+        <w:pStyle w:val="Normal"/>
+        <w:rPr/>
+      </w:pPr>
+      <w:r>
+        <w:rPr>
+          <w:b/>
+        </w:rPr>
+        <w:t>Primary Processes:</w:t>
+      </w:r>
+    </w:p>
+    <w:p>
+      <w:pPr>
+        <w:pStyle w:val="ListParagraph"/>
+        <w:numPr>
+          <w:ilvl w:val="0"/>
+          <w:numId w:val="1"/>
+        </w:numPr>
+        <w:rPr/>
+      </w:pPr>
+      <w:r>
+        <w:rPr/>
+        <w:t xml:space="preserve">Configure and maintain the CRM platform — fields, layouts, workflows, and user roles</w:t>
+      </w:r>
+    </w:p>
+    <w:p>
+      <w:pPr>
+        <w:pStyle w:val="ListParagraph"/>
+        <w:numPr>
+          <w:ilvl w:val="0"/>
+          <w:numId w:val="1"/>
+        </w:numPr>
+        <w:rPr/>
+      </w:pPr>
+      <w:r>
+        <w:rPr/>
+        <w:t xml:space="preserve">Manage user accounts — create, edit, deactivate, and reactivate accounts</w:t>
+      </w:r>
+    </w:p>
+    <w:p>
+      <w:pPr>
+        <w:pStyle w:val="ListParagraph"/>
+        <w:numPr>
+          <w:ilvl w:val="0"/>
+          <w:numId w:val="1"/>
+        </w:numPr>
+        <w:rPr/>
+      </w:pPr>
+      <w:r>
+        <w:rPr/>
+        <w:t xml:space="preserve">Monitor system health — review audit logs, failed integrations, and error notifications</w:t>
+      </w:r>
+    </w:p>
+    <w:p>
+      <w:pPr>
+        <w:pStyle w:val="ListParagraph"/>
+        <w:numPr>
+          <w:ilvl w:val="0"/>
+          <w:numId w:val="1"/>
+        </w:numPr>
+        <w:rPr/>
+      </w:pPr>
+      <w:r>
+        <w:rPr/>
+        <w:t xml:space="preserve">Manage integrations with external systems (email, calendar, forms, SMS, LMS, survey)</w:t>
+      </w:r>
+    </w:p>
+    <w:p>
+      <w:pPr>
+        <w:pStyle w:val="ListParagraph"/>
+        <w:numPr>
+          <w:ilvl w:val="0"/>
+          <w:numId w:val="1"/>
+        </w:numPr>
+        <w:rPr/>
+      </w:pPr>
+      <w:r>
+        <w:rPr/>
+        <w:t xml:space="preserve">Perform data imports, exports, and deduplication</w:t>
+      </w:r>
+    </w:p>
+    <w:p>
+      <w:pPr>
+        <w:pStyle w:val="ListParagraph"/>
+        <w:numPr>
+          <w:ilvl w:val="0"/>
+          <w:numId w:val="1"/>
+        </w:numPr>
+        <w:rPr/>
+      </w:pPr>
+      <w:r>
+        <w:rPr/>
+        <w:t xml:space="preserve">Maintain backup and recovery procedures</w:t>
+      </w:r>
+    </w:p>
+    <w:p>
+      <w:pPr>
+        <w:pStyle w:val="ListParagraph"/>
+        <w:numPr>
+          <w:ilvl w:val="0"/>
+          <w:numId w:val="1"/>
+        </w:numPr>
+        <w:rPr/>
+      </w:pPr>
+      <w:r>
+        <w:rPr/>
+        <w:t xml:space="preserve">Manage staging environment for testing configuration changes</w:t>
+      </w:r>
+    </w:p>
+    <w:p>
+      <w:pPr>
+        <w:pStyle w:val="Normal"/>
+        <w:rPr/>
+      </w:pPr>
+      <w:r>
+        <w:rPr/>
+      </w:r>
+    </w:p>
+    <w:p>
+      <w:pPr>
+        <w:pStyle w:val="Normal"/>
+        <w:rPr/>
+      </w:pPr>
+      <w:r>
+        <w:rPr>
+          <w:b/>
+        </w:rPr>
+        <w:t>Information Needed:</w:t>
+      </w:r>
+    </w:p>
+    <w:p>
+      <w:pPr>
+        <w:pStyle w:val="ListParagraph"/>
+        <w:numPr>
+          <w:ilvl w:val="0"/>
+          <w:numId w:val="1"/>
+        </w:numPr>
+        <w:rPr/>
+      </w:pPr>
+      <w:r>
+        <w:rPr/>
+        <w:t xml:space="preserve">Full access to all system configuration settings</w:t>
+      </w:r>
+    </w:p>
+    <w:p>
+      <w:pPr>
+        <w:pStyle w:val="ListParagraph"/>
+        <w:numPr>
+          <w:ilvl w:val="0"/>
+          <w:numId w:val="1"/>
+        </w:numPr>
+        <w:rPr/>
+      </w:pPr>
+      <w:r>
+        <w:rPr/>
+        <w:t xml:space="preserve">User account and role assignments</w:t>
+      </w:r>
+    </w:p>
+    <w:p>
+      <w:pPr>
+        <w:pStyle w:val="ListParagraph"/>
+        <w:numPr>
+          <w:ilvl w:val="0"/>
+          <w:numId w:val="1"/>
+        </w:numPr>
+        <w:rPr/>
+      </w:pPr>
+      <w:r>
+        <w:rPr/>
+        <w:t xml:space="preserve">Integration credentials and API configurations</w:t>
+      </w:r>
+    </w:p>
+    <w:p>
+      <w:pPr>
+        <w:pStyle w:val="ListParagraph"/>
+        <w:numPr>
+          <w:ilvl w:val="0"/>
+          <w:numId w:val="1"/>
+        </w:numPr>
+        <w:rPr/>
+      </w:pPr>
+      <w:r>
+        <w:rPr/>
+        <w:t xml:space="preserve">System audit logs and error notifications</w:t>
+      </w:r>
+    </w:p>
+    <w:p>
+      <w:pPr>
+        <w:pStyle w:val="ListParagraph"/>
+        <w:numPr>
+          <w:ilvl w:val="0"/>
+          <w:numId w:val="1"/>
+        </w:numPr>
+        <w:rPr/>
+      </w:pPr>
+      <w:r>
+        <w:rPr/>
+        <w:t xml:space="preserve">Backup status and recovery documentation</w:t>
+      </w:r>
+    </w:p>
+    <w:p>
+      <w:pPr>
+        <w:pStyle w:val="Normal"/>
+        <w:rPr/>
+      </w:pPr>
+      <w:r>
+        <w:rPr/>
+      </w:r>
+    </w:p>
+    <w:p>
+      <w:pPr>
+        <w:pStyle w:val="Heading2"/>
+        <w:rPr/>
+      </w:pPr>
+      <w:r>
+        <w:rPr/>
+        <w:t>2.2  Client Recruiter</w:t>
+      </w:r>
+    </w:p>
+    <w:p>
+      <w:pPr>
+        <w:pStyle w:val="Normal"/>
+        <w:rPr/>
+      </w:pPr>
+      <w:r>
+        <w:rPr/>
+      </w:r>
+    </w:p>
+    <w:p>
+      <w:pPr>
+        <w:pStyle w:val="Normal"/>
+        <w:rPr/>
+      </w:pPr>
+      <w:r>
+        <w:rPr/>
+        <w:t xml:space="preserve">The Client Recruiter is responsible for raising awareness of CBM’s mentoring program within the local business community. This role focuses on outreach, branding, and marketing to drive prospective clients to the organization. It operates as a traditional push marketing function, working closely with the Partner Coordinator to extend CBM’s reach through partner channels.</w:t>
+      </w:r>
+    </w:p>
+    <w:p>
+      <w:pPr>
+        <w:pStyle w:val="Normal"/>
+        <w:rPr/>
+      </w:pPr>
+      <w:r>
+        <w:rPr/>
+      </w:r>
+    </w:p>
+    <w:p>
+      <w:pPr>
+        <w:pStyle w:val="Normal"/>
+        <w:rPr/>
+      </w:pPr>
+      <w:r>
+        <w:rPr>
+          <w:b/>
+        </w:rPr>
+        <w:t>Primary Processes:</w:t>
+      </w:r>
+    </w:p>
+    <w:p>
+      <w:pPr>
+        <w:pStyle w:val="ListParagraph"/>
+        <w:numPr>
+          <w:ilvl w:val="0"/>
+          <w:numId w:val="1"/>
+        </w:numPr>
+        <w:rPr/>
+      </w:pPr>
+      <w:r>
+        <w:rPr/>
+        <w:t xml:space="preserve">Develop and execute email marketing and outreach campaigns targeting prospective client businesses using an external campaign platform (e.g., Constant Contact)</w:t>
+      </w:r>
+    </w:p>
+    <w:p>
+      <w:pPr>
+        <w:pStyle w:val="ListParagraph"/>
+        <w:numPr>
+          <w:ilvl w:val="0"/>
+          <w:numId w:val="1"/>
+        </w:numPr>
+        <w:rPr/>
+      </w:pPr>
+      <w:r>
+        <w:rPr/>
+        <w:t xml:space="preserve">Manage CBM’s brand presence and messaging across relevant channels</w:t>
+      </w:r>
+    </w:p>
+    <w:p>
+      <w:pPr>
+        <w:pStyle w:val="ListParagraph"/>
+        <w:numPr>
+          <w:ilvl w:val="0"/>
+          <w:numId w:val="1"/>
+        </w:numPr>
+        <w:rPr/>
+      </w:pPr>
+      <w:r>
+        <w:rPr/>
+        <w:t xml:space="preserve">Coordinate with the Partner Coordinator to support joint marketing initiatives with partner organizations</w:t>
+      </w:r>
+    </w:p>
+    <w:p>
+      <w:pPr>
+        <w:pStyle w:val="ListParagraph"/>
+        <w:numPr>
+          <w:ilvl w:val="0"/>
+          <w:numId w:val="1"/>
+        </w:numPr>
+        <w:rPr/>
+      </w:pPr>
+      <w:r>
+        <w:rPr/>
+        <w:t xml:space="preserve">Manage marketing contact lists — maintaining prospect contacts in the CRM as the source of truth</w:t>
+      </w:r>
+    </w:p>
+    <w:p>
+      <w:pPr>
+        <w:pStyle w:val="ListParagraph"/>
+        <w:numPr>
+          <w:ilvl w:val="0"/>
+          <w:numId w:val="1"/>
+        </w:numPr>
+        <w:rPr/>
+      </w:pPr>
+      <w:r>
+        <w:rPr/>
+        <w:t xml:space="preserve">Track and report on campaign reach and application volume trends</w:t>
+      </w:r>
+    </w:p>
+    <w:p>
+      <w:pPr>
+        <w:pStyle w:val="ListParagraph"/>
+        <w:numPr>
+          <w:ilvl w:val="0"/>
+          <w:numId w:val="1"/>
+        </w:numPr>
+        <w:rPr/>
+      </w:pPr>
+      <w:r>
+        <w:rPr/>
+        <w:t xml:space="preserve">Manage content and materials used in client recruitment efforts</w:t>
+      </w:r>
+    </w:p>
+    <w:p>
+      <w:pPr>
+        <w:pStyle w:val="Normal"/>
+        <w:rPr/>
+      </w:pPr>
+      <w:r>
+        <w:rPr/>
+      </w:r>
+    </w:p>
+    <w:p>
+      <w:pPr>
+        <w:pStyle w:val="Normal"/>
+        <w:rPr/>
+      </w:pPr>
+      <w:r>
+        <w:rPr>
+          <w:b/>
+        </w:rPr>
+        <w:t>Information Needed:</w:t>
+      </w:r>
+    </w:p>
+    <w:p>
+      <w:pPr>
+        <w:pStyle w:val="ListParagraph"/>
+        <w:numPr>
+          <w:ilvl w:val="0"/>
+          <w:numId w:val="1"/>
+        </w:numPr>
+        <w:rPr/>
+      </w:pPr>
+      <w:r>
+        <w:rPr/>
+        <w:t xml:space="preserve">Marketing contact records — prospects and community contacts not yet in the program</w:t>
+      </w:r>
+    </w:p>
+    <w:p>
+      <w:pPr>
+        <w:pStyle w:val="ListParagraph"/>
+        <w:numPr>
+          <w:ilvl w:val="0"/>
+          <w:numId w:val="1"/>
+        </w:numPr>
+        <w:rPr/>
+      </w:pPr>
+      <w:r>
+        <w:rPr/>
+        <w:t xml:space="preserve">Mentor and client contact records — for inclusion in relevant campaigns</w:t>
+      </w:r>
+    </w:p>
+    <w:p>
+      <w:pPr>
+        <w:pStyle w:val="ListParagraph"/>
+        <w:numPr>
+          <w:ilvl w:val="0"/>
+          <w:numId w:val="1"/>
+        </w:numPr>
+        <w:rPr/>
+      </w:pPr>
+      <w:r>
+        <w:rPr/>
+        <w:t xml:space="preserve">Partner organization profiles and service areas — to coordinate partner marketing programs</w:t>
+      </w:r>
+    </w:p>
+    <w:p>
+      <w:pPr>
+        <w:pStyle w:val="ListParagraph"/>
+        <w:numPr>
+          <w:ilvl w:val="0"/>
+          <w:numId w:val="1"/>
+        </w:numPr>
+        <w:rPr/>
+      </w:pPr>
+      <w:r>
+        <w:rPr/>
+        <w:t xml:space="preserve">Geographic service area data — to target outreach appropriately</w:t>
+      </w:r>
+    </w:p>
+    <w:p>
+      <w:pPr>
+        <w:pStyle w:val="ListParagraph"/>
+        <w:numPr>
+          <w:ilvl w:val="0"/>
+          <w:numId w:val="1"/>
+        </w:numPr>
+        <w:rPr/>
+      </w:pPr>
+      <w:r>
+        <w:rPr/>
+        <w:t xml:space="preserve">Event and workshop schedule — to promote CBM programming as part of outreach</w:t>
+      </w:r>
+    </w:p>
+    <w:p>
+      <w:pPr>
+        <w:pStyle w:val="ListParagraph"/>
+        <w:numPr>
+          <w:ilvl w:val="0"/>
+          <w:numId w:val="1"/>
+        </w:numPr>
+        <w:rPr/>
+      </w:pPr>
+      <w:r>
+        <w:rPr/>
+        <w:t xml:space="preserve">Application volume and intake trends — to measure campaign effectiveness</w:t>
+      </w:r>
+    </w:p>
+    <w:p>
+      <w:pPr>
+        <w:pStyle w:val="Normal"/>
+        <w:rPr/>
+      </w:pPr>
+      <w:r>
+        <w:rPr/>
+      </w:r>
+    </w:p>
+    <w:p>
+      <w:pPr>
+        <w:pStyle w:val="Heading2"/>
+        <w:rPr/>
+      </w:pPr>
+      <w:r>
+        <w:rPr/>
+        <w:t>2.3  Mentor Recruiter</w:t>
+      </w:r>
+    </w:p>
+    <w:p>
+      <w:pPr>
+        <w:pStyle w:val="Normal"/>
+        <w:rPr/>
+      </w:pPr>
+      <w:r>
+        <w:rPr/>
+      </w:r>
+    </w:p>
+    <w:p>
+      <w:pPr>
+        <w:pStyle w:val="Normal"/>
+        <w:rPr/>
+      </w:pPr>
+      <w:r>
+        <w:rPr/>
+        <w:t xml:space="preserve">The Mentor Recruiter is responsible for raising awareness of CBM’s mentoring program within the professional and business community to attract qualified volunteer mentors. Like the Client Recruiter, this role operates as a push marketing function, leveraging outreach campaigns, branding, and partner channels to drive mentor applications.</w:t>
+      </w:r>
+    </w:p>
+    <w:p>
+      <w:pPr>
+        <w:pStyle w:val="Normal"/>
+        <w:rPr/>
+      </w:pPr>
+      <w:r>
+        <w:rPr/>
+      </w:r>
+    </w:p>
+    <w:p>
+      <w:pPr>
+        <w:pStyle w:val="Normal"/>
+        <w:rPr/>
+      </w:pPr>
+      <w:r>
+        <w:rPr>
+          <w:b/>
+        </w:rPr>
+        <w:t>Primary Processes:</w:t>
+      </w:r>
+    </w:p>
+    <w:p>
+      <w:pPr>
+        <w:pStyle w:val="ListParagraph"/>
+        <w:numPr>
+          <w:ilvl w:val="0"/>
+          <w:numId w:val="1"/>
+        </w:numPr>
+        <w:rPr/>
+      </w:pPr>
+      <w:r>
+        <w:rPr/>
+        <w:t xml:space="preserve">Develop and execute email marketing and outreach campaigns targeting prospective mentors using an external campaign platform (e.g., Constant Contact)</w:t>
+      </w:r>
+    </w:p>
+    <w:p>
+      <w:pPr>
+        <w:pStyle w:val="ListParagraph"/>
+        <w:numPr>
+          <w:ilvl w:val="0"/>
+          <w:numId w:val="1"/>
+        </w:numPr>
+        <w:rPr/>
+      </w:pPr>
+      <w:r>
+        <w:rPr/>
+        <w:t xml:space="preserve">Manage messaging and materials specific to mentor recruitment</w:t>
+      </w:r>
+    </w:p>
+    <w:p>
+      <w:pPr>
+        <w:pStyle w:val="ListParagraph"/>
+        <w:numPr>
+          <w:ilvl w:val="0"/>
+          <w:numId w:val="1"/>
+        </w:numPr>
+        <w:rPr/>
+      </w:pPr>
+      <w:r>
+        <w:rPr/>
+        <w:t xml:space="preserve">Coordinate with the Partner Coordinator to support joint mentor recruitment initiatives through partner organizations</w:t>
+      </w:r>
+    </w:p>
+    <w:p>
+      <w:pPr>
+        <w:pStyle w:val="ListParagraph"/>
+        <w:numPr>
+          <w:ilvl w:val="0"/>
+          <w:numId w:val="1"/>
+        </w:numPr>
+        <w:rPr/>
+      </w:pPr>
+      <w:r>
+        <w:rPr/>
+        <w:t xml:space="preserve">Manage mentor prospect contact lists — maintaining prospect contacts in the CRM as the source of truth</w:t>
+      </w:r>
+    </w:p>
+    <w:p>
+      <w:pPr>
+        <w:pStyle w:val="ListParagraph"/>
+        <w:numPr>
+          <w:ilvl w:val="0"/>
+          <w:numId w:val="1"/>
+        </w:numPr>
+        <w:rPr/>
+      </w:pPr>
+      <w:r>
+        <w:rPr/>
+        <w:t xml:space="preserve">Track and report on campaign reach and mentor application volume trends</w:t>
+      </w:r>
+    </w:p>
+    <w:p>
+      <w:pPr>
+        <w:pStyle w:val="Normal"/>
+        <w:rPr/>
+      </w:pPr>
+      <w:r>
+        <w:rPr/>
+      </w:r>
+    </w:p>
+    <w:p>
+      <w:pPr>
+        <w:pStyle w:val="Normal"/>
+        <w:rPr/>
+      </w:pPr>
+      <w:r>
+        <w:rPr>
+          <w:b/>
+        </w:rPr>
+        <w:t>Information Needed:</w:t>
+      </w:r>
+    </w:p>
+    <w:p>
+      <w:pPr>
+        <w:pStyle w:val="ListParagraph"/>
+        <w:numPr>
+          <w:ilvl w:val="0"/>
+          <w:numId w:val="1"/>
+        </w:numPr>
+        <w:rPr/>
+      </w:pPr>
+      <w:r>
+        <w:rPr/>
+        <w:t xml:space="preserve">Mentor prospect contact records</w:t>
+      </w:r>
+    </w:p>
+    <w:p>
+      <w:pPr>
+        <w:pStyle w:val="ListParagraph"/>
+        <w:numPr>
+          <w:ilvl w:val="0"/>
+          <w:numId w:val="1"/>
+        </w:numPr>
+        <w:rPr/>
+      </w:pPr>
+      <w:r>
+        <w:rPr/>
+        <w:t xml:space="preserve">Partner organization profiles and service areas — to coordinate partner recruitment programs</w:t>
+      </w:r>
+    </w:p>
+    <w:p>
+      <w:pPr>
+        <w:pStyle w:val="ListParagraph"/>
+        <w:numPr>
+          <w:ilvl w:val="0"/>
+          <w:numId w:val="1"/>
+        </w:numPr>
+        <w:rPr/>
+      </w:pPr>
+      <w:r>
+        <w:rPr/>
+        <w:t xml:space="preserve">Geographic service area data — to target outreach appropriately</w:t>
+      </w:r>
+    </w:p>
+    <w:p>
+      <w:pPr>
+        <w:pStyle w:val="ListParagraph"/>
+        <w:numPr>
+          <w:ilvl w:val="0"/>
+          <w:numId w:val="1"/>
+        </w:numPr>
+        <w:rPr/>
+      </w:pPr>
+      <w:r>
+        <w:rPr/>
+        <w:t xml:space="preserve">Mentor application volume and pipeline trends — to measure campaign effectiveness</w:t>
+      </w:r>
+    </w:p>
+    <w:p>
+      <w:pPr>
+        <w:pStyle w:val="ListParagraph"/>
+        <w:numPr>
+          <w:ilvl w:val="0"/>
+          <w:numId w:val="1"/>
+        </w:numPr>
+        <w:rPr/>
+      </w:pPr>
+      <w:r>
+        <w:rPr/>
+        <w:t xml:space="preserve">Current mentor roster and capacity — to identify gaps and inform recruitment targeting</w:t>
+      </w:r>
+    </w:p>
+    <w:p>
+      <w:pPr>
+        <w:pStyle w:val="Normal"/>
+        <w:rPr/>
+      </w:pPr>
+      <w:r>
+        <w:rPr/>
+      </w:r>
+    </w:p>
+    <w:p>
+      <w:pPr>
+        <w:pStyle w:val="Heading2"/>
+        <w:rPr/>
+      </w:pPr>
+      <w:r>
+        <w:rPr/>
+        <w:t>2.4  Client Administrator</w:t>
+      </w:r>
+    </w:p>
+    <w:p>
+      <w:pPr>
+        <w:pStyle w:val="Normal"/>
+        <w:rPr/>
+      </w:pPr>
+      <w:r>
+        <w:rPr/>
+      </w:r>
+    </w:p>
+    <w:p>
+      <w:pPr>
+        <w:pStyle w:val="Normal"/>
+        <w:rPr/>
+      </w:pPr>
+      <w:r>
+        <w:rPr/>
+        <w:t xml:space="preserve">The Client Administrator is responsible for managing the day-to-day administration of client records and the client application process. This role serves as the primary point of contact for prospective and active clients, guiding them through intake, onboarding, and ongoing program participation.</w:t>
+      </w:r>
+    </w:p>
+    <w:p>
+      <w:pPr>
+        <w:pStyle w:val="Normal"/>
+        <w:rPr/>
+      </w:pPr>
+      <w:r>
+        <w:rPr/>
+      </w:r>
+    </w:p>
+    <w:p>
+      <w:pPr>
+        <w:pStyle w:val="Normal"/>
+        <w:rPr/>
+      </w:pPr>
+      <w:r>
+        <w:rPr>
+          <w:b/>
+        </w:rPr>
+        <w:t>Primary Processes:</w:t>
+      </w:r>
+    </w:p>
+    <w:p>
+      <w:pPr>
+        <w:pStyle w:val="ListParagraph"/>
+        <w:numPr>
+          <w:ilvl w:val="0"/>
+          <w:numId w:val="1"/>
+        </w:numPr>
+        <w:rPr/>
+      </w:pPr>
+      <w:r>
+        <w:rPr/>
+        <w:t xml:space="preserve">Review and process incoming client applications</w:t>
+      </w:r>
+    </w:p>
+    <w:p>
+      <w:pPr>
+        <w:pStyle w:val="ListParagraph"/>
+        <w:numPr>
+          <w:ilvl w:val="0"/>
+          <w:numId w:val="1"/>
+        </w:numPr>
+        <w:rPr/>
+      </w:pPr>
+      <w:r>
+        <w:rPr/>
+        <w:t xml:space="preserve">Maintain and update client and contact records in the CRM</w:t>
+      </w:r>
+    </w:p>
+    <w:p>
+      <w:pPr>
+        <w:pStyle w:val="ListParagraph"/>
+        <w:numPr>
+          <w:ilvl w:val="0"/>
+          <w:numId w:val="1"/>
+        </w:numPr>
+        <w:rPr/>
+      </w:pPr>
+      <w:r>
+        <w:rPr/>
+        <w:t xml:space="preserve">Communicate with prospective and active clients regarding application status, program requirements, and next steps</w:t>
+      </w:r>
+    </w:p>
+    <w:p>
+      <w:pPr>
+        <w:pStyle w:val="ListParagraph"/>
+        <w:numPr>
+          <w:ilvl w:val="0"/>
+          <w:numId w:val="1"/>
+        </w:numPr>
+        <w:rPr/>
+      </w:pPr>
+      <w:r>
+        <w:rPr/>
+        <w:t xml:space="preserve">Track client status throughout the full lifecycle — from applicant through active, inactive, and closed</w:t>
+      </w:r>
+    </w:p>
+    <w:p>
+      <w:pPr>
+        <w:pStyle w:val="ListParagraph"/>
+        <w:numPr>
+          <w:ilvl w:val="0"/>
+          <w:numId w:val="1"/>
+        </w:numPr>
+        <w:rPr/>
+      </w:pPr>
+      <w:r>
+        <w:rPr/>
+        <w:t xml:space="preserve">Support the Client Assignment Coordinator with client readiness and background information</w:t>
+      </w:r>
+    </w:p>
+    <w:p>
+      <w:pPr>
+        <w:pStyle w:val="ListParagraph"/>
+        <w:numPr>
+          <w:ilvl w:val="0"/>
+          <w:numId w:val="1"/>
+        </w:numPr>
+        <w:rPr/>
+      </w:pPr>
+      <w:r>
+        <w:rPr/>
+        <w:t xml:space="preserve">Monitor and follow up on inactive client engagements</w:t>
+      </w:r>
+    </w:p>
+    <w:p>
+      <w:pPr>
+        <w:pStyle w:val="ListParagraph"/>
+        <w:numPr>
+          <w:ilvl w:val="0"/>
+          <w:numId w:val="1"/>
+        </w:numPr>
+        <w:rPr/>
+      </w:pPr>
+      <w:r>
+        <w:rPr/>
+        <w:t xml:space="preserve">Record client business outcomes at engagement close</w:t>
+      </w:r>
+    </w:p>
+    <w:p>
+      <w:pPr>
+        <w:pStyle w:val="Normal"/>
+        <w:rPr/>
+      </w:pPr>
+      <w:r>
+        <w:rPr/>
+      </w:r>
+    </w:p>
+    <w:p>
+      <w:pPr>
+        <w:pStyle w:val="Normal"/>
+        <w:rPr/>
+      </w:pPr>
+      <w:r>
+        <w:rPr>
+          <w:b/>
+        </w:rPr>
+        <w:t>Information Needed:</w:t>
+      </w:r>
+    </w:p>
+    <w:p>
+      <w:pPr>
+        <w:pStyle w:val="ListParagraph"/>
+        <w:numPr>
+          <w:ilvl w:val="0"/>
+          <w:numId w:val="1"/>
+        </w:numPr>
+        <w:rPr/>
+      </w:pPr>
+      <w:r>
+        <w:rPr/>
+        <w:t xml:space="preserve">Client and contact profiles — business name, primary contact, industry, business stage, and description</w:t>
+      </w:r>
+    </w:p>
+    <w:p>
+      <w:pPr>
+        <w:pStyle w:val="ListParagraph"/>
+        <w:numPr>
+          <w:ilvl w:val="0"/>
+          <w:numId w:val="1"/>
+        </w:numPr>
+        <w:rPr/>
+      </w:pPr>
+      <w:r>
+        <w:rPr/>
+        <w:t xml:space="preserve">Client application status and history</w:t>
+      </w:r>
+    </w:p>
+    <w:p>
+      <w:pPr>
+        <w:pStyle w:val="ListParagraph"/>
+        <w:numPr>
+          <w:ilvl w:val="0"/>
+          <w:numId w:val="1"/>
+        </w:numPr>
+        <w:rPr/>
+      </w:pPr>
+      <w:r>
+        <w:rPr/>
+        <w:t xml:space="preserve">Engagement status and session activity — to monitor inactivity and follow up appropriately</w:t>
+      </w:r>
+    </w:p>
+    <w:p>
+      <w:pPr>
+        <w:pStyle w:val="ListParagraph"/>
+        <w:numPr>
+          <w:ilvl w:val="0"/>
+          <w:numId w:val="1"/>
+        </w:numPr>
+        <w:rPr/>
+      </w:pPr>
+      <w:r>
+        <w:rPr/>
+        <w:t xml:space="preserve">Communication history with each client</w:t>
+      </w:r>
+    </w:p>
+    <w:p>
+      <w:pPr>
+        <w:pStyle w:val="ListParagraph"/>
+        <w:numPr>
+          <w:ilvl w:val="0"/>
+          <w:numId w:val="1"/>
+        </w:numPr>
+        <w:rPr/>
+      </w:pPr>
+      <w:r>
+        <w:rPr/>
+        <w:t xml:space="preserve">NPS and survey results linked to client records</w:t>
+      </w:r>
+    </w:p>
+    <w:p>
+      <w:pPr>
+        <w:pStyle w:val="ListParagraph"/>
+        <w:numPr>
+          <w:ilvl w:val="0"/>
+          <w:numId w:val="1"/>
+        </w:numPr>
+        <w:rPr/>
+      </w:pPr>
+      <w:r>
+        <w:rPr/>
+        <w:t xml:space="preserve">Partner referral source — to track clients referred by partner organizations</w:t>
+      </w:r>
+    </w:p>
+    <w:p>
+      <w:pPr>
+        <w:pStyle w:val="Normal"/>
+        <w:rPr/>
+      </w:pPr>
+      <w:r>
+        <w:rPr/>
+      </w:r>
+    </w:p>
+    <w:p>
+      <w:pPr>
+        <w:pStyle w:val="Heading2"/>
+        <w:rPr/>
+      </w:pPr>
+      <w:r>
+        <w:rPr/>
+        <w:t>2.5  Mentor Administrator</w:t>
+      </w:r>
+    </w:p>
+    <w:p>
+      <w:pPr>
+        <w:pStyle w:val="Normal"/>
+        <w:rPr/>
+      </w:pPr>
+      <w:r>
+        <w:rPr/>
+      </w:r>
+    </w:p>
+    <w:p>
+      <w:pPr>
+        <w:pStyle w:val="Normal"/>
+        <w:rPr/>
+      </w:pPr>
+      <w:r>
+        <w:rPr/>
+        <w:t xml:space="preserve">The Mentor Administrator is responsible for managing the day-to-day administration of mentor records and the mentor application and onboarding process. This role guides prospective mentors from application through activation and manages ongoing mentor status and engagement throughout their tenure with CBM.</w:t>
+      </w:r>
+    </w:p>
+    <w:p>
+      <w:pPr>
+        <w:pStyle w:val="Normal"/>
+        <w:rPr/>
+      </w:pPr>
+      <w:r>
+        <w:rPr/>
+      </w:r>
+    </w:p>
+    <w:p>
+      <w:pPr>
+        <w:pStyle w:val="Normal"/>
+        <w:rPr/>
+      </w:pPr>
+      <w:r>
+        <w:rPr>
+          <w:b/>
+        </w:rPr>
+        <w:t>Primary Processes:</w:t>
+      </w:r>
+    </w:p>
+    <w:p>
+      <w:pPr>
+        <w:pStyle w:val="ListParagraph"/>
+        <w:numPr>
+          <w:ilvl w:val="0"/>
+          <w:numId w:val="1"/>
+        </w:numPr>
+        <w:rPr/>
+      </w:pPr>
+      <w:r>
+        <w:rPr/>
+        <w:t xml:space="preserve">Review and process incoming mentor applications</w:t>
+      </w:r>
+    </w:p>
+    <w:p>
+      <w:pPr>
+        <w:pStyle w:val="ListParagraph"/>
+        <w:numPr>
+          <w:ilvl w:val="0"/>
+          <w:numId w:val="1"/>
+        </w:numPr>
+        <w:rPr/>
+      </w:pPr>
+      <w:r>
+        <w:rPr/>
+        <w:t xml:space="preserve">Maintain and update mentor contact records in the CRM</w:t>
+      </w:r>
+    </w:p>
+    <w:p>
+      <w:pPr>
+        <w:pStyle w:val="ListParagraph"/>
+        <w:numPr>
+          <w:ilvl w:val="0"/>
+          <w:numId w:val="1"/>
+        </w:numPr>
+        <w:rPr/>
+      </w:pPr>
+      <w:r>
+        <w:rPr/>
+        <w:t xml:space="preserve">Communicate with prospective and active mentors regarding application status, onboarding requirements, and next steps</w:t>
+      </w:r>
+    </w:p>
+    <w:p>
+      <w:pPr>
+        <w:pStyle w:val="ListParagraph"/>
+        <w:numPr>
+          <w:ilvl w:val="0"/>
+          <w:numId w:val="1"/>
+        </w:numPr>
+        <w:rPr/>
+      </w:pPr>
+      <w:r>
+        <w:rPr/>
+        <w:t xml:space="preserve">Track mentor status throughout the full lifecycle — from provisional through active, inactive, and departed</w:t>
+      </w:r>
+    </w:p>
+    <w:p>
+      <w:pPr>
+        <w:pStyle w:val="ListParagraph"/>
+        <w:numPr>
+          <w:ilvl w:val="0"/>
+          <w:numId w:val="1"/>
+        </w:numPr>
+        <w:rPr/>
+      </w:pPr>
+      <w:r>
+        <w:rPr/>
+        <w:t xml:space="preserve">Coordinate mentor training enrollment and track completion via the learning management system</w:t>
+      </w:r>
+    </w:p>
+    <w:p>
+      <w:pPr>
+        <w:pStyle w:val="ListParagraph"/>
+        <w:numPr>
+          <w:ilvl w:val="0"/>
+          <w:numId w:val="1"/>
+        </w:numPr>
+        <w:rPr/>
+      </w:pPr>
+      <w:r>
+        <w:rPr/>
+        <w:t xml:space="preserve">Track provisional co-mentoring activity required before full mentor activation</w:t>
+      </w:r>
+    </w:p>
+    <w:p>
+      <w:pPr>
+        <w:pStyle w:val="ListParagraph"/>
+        <w:numPr>
+          <w:ilvl w:val="0"/>
+          <w:numId w:val="1"/>
+        </w:numPr>
+        <w:rPr/>
+      </w:pPr>
+      <w:r>
+        <w:rPr/>
+        <w:t xml:space="preserve">Manage mentor reactivation when returning from inactive status</w:t>
+      </w:r>
+    </w:p>
+    <w:p>
+      <w:pPr>
+        <w:pStyle w:val="ListParagraph"/>
+        <w:numPr>
+          <w:ilvl w:val="0"/>
+          <w:numId w:val="1"/>
+        </w:numPr>
+        <w:rPr/>
+      </w:pPr>
+      <w:r>
+        <w:rPr/>
+        <w:t xml:space="preserve">Record background check status and monitor expiration</w:t>
+      </w:r>
+    </w:p>
+    <w:p>
+      <w:pPr>
+        <w:pStyle w:val="ListParagraph"/>
+        <w:numPr>
+          <w:ilvl w:val="0"/>
+          <w:numId w:val="1"/>
+        </w:numPr>
+        <w:rPr/>
+      </w:pPr>
+      <w:r>
+        <w:rPr/>
+        <w:t xml:space="preserve">Monitor mentor capacity and availability</w:t>
+      </w:r>
+    </w:p>
+    <w:p>
+      <w:pPr>
+        <w:pStyle w:val="ListParagraph"/>
+        <w:numPr>
+          <w:ilvl w:val="0"/>
+          <w:numId w:val="1"/>
+        </w:numPr>
+        <w:rPr/>
+      </w:pPr>
+      <w:r>
+        <w:rPr/>
+        <w:t xml:space="preserve">Record reason for departure when a mentor exits</w:t>
+      </w:r>
+    </w:p>
+    <w:p>
+      <w:pPr>
+        <w:pStyle w:val="Normal"/>
+        <w:rPr/>
+      </w:pPr>
+      <w:r>
+        <w:rPr/>
+      </w:r>
+    </w:p>
+    <w:p>
+      <w:pPr>
+        <w:pStyle w:val="Normal"/>
+        <w:rPr/>
+      </w:pPr>
+      <w:r>
+        <w:rPr>
+          <w:b/>
+        </w:rPr>
+        <w:t>Information Needed:</w:t>
+      </w:r>
+    </w:p>
+    <w:p>
+      <w:pPr>
+        <w:pStyle w:val="ListParagraph"/>
+        <w:numPr>
+          <w:ilvl w:val="0"/>
+          <w:numId w:val="1"/>
+        </w:numPr>
+        <w:rPr/>
+      </w:pPr>
+      <w:r>
+        <w:rPr/>
+        <w:t xml:space="preserve">Mentor contact profiles — name, contact info, bio, expertise, industry background, and availability</w:t>
+      </w:r>
+    </w:p>
+    <w:p>
+      <w:pPr>
+        <w:pStyle w:val="ListParagraph"/>
+        <w:numPr>
+          <w:ilvl w:val="0"/>
+          <w:numId w:val="1"/>
+        </w:numPr>
+        <w:rPr/>
+      </w:pPr>
+      <w:r>
+        <w:rPr/>
+        <w:t xml:space="preserve">Mentor application status and history</w:t>
+      </w:r>
+    </w:p>
+    <w:p>
+      <w:pPr>
+        <w:pStyle w:val="ListParagraph"/>
+        <w:numPr>
+          <w:ilvl w:val="0"/>
+          <w:numId w:val="1"/>
+        </w:numPr>
+        <w:rPr/>
+      </w:pPr>
+      <w:r>
+        <w:rPr/>
+        <w:t xml:space="preserve">Mentor status and lifecycle stage</w:t>
+      </w:r>
+    </w:p>
+    <w:p>
+      <w:pPr>
+        <w:pStyle w:val="ListParagraph"/>
+        <w:numPr>
+          <w:ilvl w:val="0"/>
+          <w:numId w:val="1"/>
+        </w:numPr>
+        <w:rPr/>
+      </w:pPr>
+      <w:r>
+        <w:rPr/>
+        <w:t xml:space="preserve">Training enrollment and completion records from the LMS</w:t>
+      </w:r>
+    </w:p>
+    <w:p>
+      <w:pPr>
+        <w:pStyle w:val="ListParagraph"/>
+        <w:numPr>
+          <w:ilvl w:val="0"/>
+          <w:numId w:val="1"/>
+        </w:numPr>
+        <w:rPr/>
+      </w:pPr>
+      <w:r>
+        <w:rPr/>
+        <w:t xml:space="preserve">Background check status and dates</w:t>
+      </w:r>
+    </w:p>
+    <w:p>
+      <w:pPr>
+        <w:pStyle w:val="ListParagraph"/>
+        <w:numPr>
+          <w:ilvl w:val="0"/>
+          <w:numId w:val="1"/>
+        </w:numPr>
+        <w:rPr/>
+      </w:pPr>
+      <w:r>
+        <w:rPr/>
+        <w:t xml:space="preserve">Mentor capacity settings — maximum active engagements</w:t>
+      </w:r>
+    </w:p>
+    <w:p>
+      <w:pPr>
+        <w:pStyle w:val="ListParagraph"/>
+        <w:numPr>
+          <w:ilvl w:val="0"/>
+          <w:numId w:val="1"/>
+        </w:numPr>
+        <w:rPr/>
+      </w:pPr>
+      <w:r>
+        <w:rPr/>
+        <w:t xml:space="preserve">Communication history with each mentor</w:t>
+      </w:r>
+    </w:p>
+    <w:p>
+      <w:pPr>
+        <w:pStyle w:val="ListParagraph"/>
+        <w:numPr>
+          <w:ilvl w:val="0"/>
+          <w:numId w:val="1"/>
+        </w:numPr>
+        <w:rPr/>
+      </w:pPr>
+      <w:r>
+        <w:rPr/>
+        <w:t xml:space="preserve">Engagement history and session activity per mentor</w:t>
+      </w:r>
+    </w:p>
+    <w:p>
+      <w:pPr>
+        <w:pStyle w:val="Normal"/>
+        <w:rPr/>
+      </w:pPr>
+      <w:r>
+        <w:rPr/>
+      </w:r>
+    </w:p>
+    <w:p>
+      <w:pPr>
+        <w:pStyle w:val="Heading2"/>
+        <w:rPr/>
+      </w:pPr>
+      <w:r>
+        <w:rPr/>
+        <w:t>2.6  Client Assignment Coordinator</w:t>
+      </w:r>
+    </w:p>
+    <w:p>
+      <w:pPr>
+        <w:pStyle w:val="Normal"/>
+        <w:rPr/>
+      </w:pPr>
+      <w:r>
+        <w:rPr/>
+      </w:r>
+    </w:p>
+    <w:p>
+      <w:pPr>
+        <w:pStyle w:val="Normal"/>
+        <w:rPr/>
+      </w:pPr>
+      <w:r>
+        <w:rPr/>
+        <w:t xml:space="preserve">The Client Assignment Coordinator is responsible for matching approved clients with the most appropriate available mentors. This role sits at the center of CBM’s core program delivery, ensuring that each client is paired with a mentor whose expertise, availability, and background align with the client’s needs.</w:t>
+      </w:r>
+    </w:p>
+    <w:p>
+      <w:pPr>
+        <w:pStyle w:val="Normal"/>
+        <w:rPr/>
+      </w:pPr>
+      <w:r>
+        <w:rPr/>
+      </w:r>
+    </w:p>
+    <w:p>
+      <w:pPr>
+        <w:pStyle w:val="Normal"/>
+        <w:rPr/>
+      </w:pPr>
+      <w:r>
+        <w:rPr>
+          <w:b/>
+        </w:rPr>
+        <w:t>Primary Processes:</w:t>
+      </w:r>
+    </w:p>
+    <w:p>
+      <w:pPr>
+        <w:pStyle w:val="ListParagraph"/>
+        <w:numPr>
+          <w:ilvl w:val="0"/>
+          <w:numId w:val="1"/>
+        </w:numPr>
+        <w:rPr/>
+      </w:pPr>
+      <w:r>
+        <w:rPr/>
+        <w:t xml:space="preserve">Review approved client applications and assess mentoring needs</w:t>
+      </w:r>
+    </w:p>
+    <w:p>
+      <w:pPr>
+        <w:pStyle w:val="ListParagraph"/>
+        <w:numPr>
+          <w:ilvl w:val="0"/>
+          <w:numId w:val="1"/>
+        </w:numPr>
+        <w:rPr/>
+      </w:pPr>
+      <w:r>
+        <w:rPr/>
+        <w:t xml:space="preserve">Identify and evaluate candidate mentors based on expertise, availability, industry background, and capacity</w:t>
+      </w:r>
+    </w:p>
+    <w:p>
+      <w:pPr>
+        <w:pStyle w:val="ListParagraph"/>
+        <w:numPr>
+          <w:ilvl w:val="0"/>
+          <w:numId w:val="1"/>
+        </w:numPr>
+        <w:rPr/>
+      </w:pPr>
+      <w:r>
+        <w:rPr/>
+        <w:t xml:space="preserve">Manage the mentor nomination and assignment process — including tracking mentor acceptance or declination</w:t>
+      </w:r>
+    </w:p>
+    <w:p>
+      <w:pPr>
+        <w:pStyle w:val="ListParagraph"/>
+        <w:numPr>
+          <w:ilvl w:val="0"/>
+          <w:numId w:val="1"/>
+        </w:numPr>
+        <w:rPr/>
+      </w:pPr>
+      <w:r>
+        <w:rPr/>
+        <w:t xml:space="preserve">Assign primary mentor and optional co-mentor or SME to each engagement</w:t>
+      </w:r>
+    </w:p>
+    <w:p>
+      <w:pPr>
+        <w:pStyle w:val="ListParagraph"/>
+        <w:numPr>
+          <w:ilvl w:val="0"/>
+          <w:numId w:val="1"/>
+        </w:numPr>
+        <w:rPr/>
+      </w:pPr>
+      <w:r>
+        <w:rPr/>
+        <w:t xml:space="preserve">Create and activate engagement records in the CRM</w:t>
+      </w:r>
+    </w:p>
+    <w:p>
+      <w:pPr>
+        <w:pStyle w:val="ListParagraph"/>
+        <w:numPr>
+          <w:ilvl w:val="0"/>
+          <w:numId w:val="1"/>
+        </w:numPr>
+        <w:rPr/>
+      </w:pPr>
+      <w:r>
+        <w:rPr/>
+        <w:t xml:space="preserve">Facilitate the initial introduction between mentor and client</w:t>
+      </w:r>
+    </w:p>
+    <w:p>
+      <w:pPr>
+        <w:pStyle w:val="ListParagraph"/>
+        <w:numPr>
+          <w:ilvl w:val="0"/>
+          <w:numId w:val="1"/>
+        </w:numPr>
+        <w:rPr/>
+      </w:pPr>
+      <w:r>
+        <w:rPr/>
+        <w:t xml:space="preserve">Monitor newly assigned engagements to confirm the relationship is established</w:t>
+      </w:r>
+    </w:p>
+    <w:p>
+      <w:pPr>
+        <w:pStyle w:val="Normal"/>
+        <w:rPr/>
+      </w:pPr>
+      <w:r>
+        <w:rPr/>
+      </w:r>
+    </w:p>
+    <w:p>
+      <w:pPr>
+        <w:pStyle w:val="Normal"/>
+        <w:rPr/>
+      </w:pPr>
+      <w:r>
+        <w:rPr>
+          <w:b/>
+        </w:rPr>
+        <w:t>Information Needed:</w:t>
+      </w:r>
+    </w:p>
+    <w:p>
+      <w:pPr>
+        <w:pStyle w:val="ListParagraph"/>
+        <w:numPr>
+          <w:ilvl w:val="0"/>
+          <w:numId w:val="1"/>
+        </w:numPr>
+        <w:rPr/>
+      </w:pPr>
+      <w:r>
+        <w:rPr/>
+        <w:t xml:space="preserve">Approved client profiles — business description, goals, industry, and mentoring focus areas</w:t>
+      </w:r>
+    </w:p>
+    <w:p>
+      <w:pPr>
+        <w:pStyle w:val="ListParagraph"/>
+        <w:numPr>
+          <w:ilvl w:val="0"/>
+          <w:numId w:val="1"/>
+        </w:numPr>
+        <w:rPr/>
+      </w:pPr>
+      <w:r>
+        <w:rPr/>
+        <w:t xml:space="preserve">Mentor roster — expertise, industry background, availability, capacity, and current engagement load</w:t>
+      </w:r>
+    </w:p>
+    <w:p>
+      <w:pPr>
+        <w:pStyle w:val="ListParagraph"/>
+        <w:numPr>
+          <w:ilvl w:val="0"/>
+          <w:numId w:val="1"/>
+        </w:numPr>
+        <w:rPr/>
+      </w:pPr>
+      <w:r>
+        <w:rPr/>
+        <w:t xml:space="preserve">Mentor status — active and accepting new clients</w:t>
+      </w:r>
+    </w:p>
+    <w:p>
+      <w:pPr>
+        <w:pStyle w:val="ListParagraph"/>
+        <w:numPr>
+          <w:ilvl w:val="0"/>
+          <w:numId w:val="1"/>
+        </w:numPr>
+        <w:rPr/>
+      </w:pPr>
+      <w:r>
+        <w:rPr/>
+        <w:t xml:space="preserve">Engagement history — prior pairings and outcomes to inform matching decisions</w:t>
+      </w:r>
+    </w:p>
+    <w:p>
+      <w:pPr>
+        <w:pStyle w:val="ListParagraph"/>
+        <w:numPr>
+          <w:ilvl w:val="0"/>
+          <w:numId w:val="1"/>
+        </w:numPr>
+        <w:rPr/>
+      </w:pPr>
+      <w:r>
+        <w:rPr/>
+        <w:t xml:space="preserve">Partner affiliation — to ensure geographic or partner-specific matching requirements are met</w:t>
+      </w:r>
+    </w:p>
+    <w:p>
+      <w:pPr>
+        <w:pStyle w:val="ListParagraph"/>
+        <w:numPr>
+          <w:ilvl w:val="0"/>
+          <w:numId w:val="1"/>
+        </w:numPr>
+        <w:rPr/>
+      </w:pPr>
+      <w:r>
+        <w:rPr/>
+        <w:t xml:space="preserve">Communication history — to coordinate with mentors and clients during the assignment process</w:t>
+      </w:r>
+    </w:p>
+    <w:p>
+      <w:pPr>
+        <w:pStyle w:val="Normal"/>
+        <w:rPr/>
+      </w:pPr>
+      <w:r>
+        <w:rPr/>
+      </w:r>
+    </w:p>
+    <w:p>
+      <w:pPr>
+        <w:pStyle w:val="Heading2"/>
+        <w:rPr/>
+      </w:pPr>
+      <w:r>
+        <w:rPr/>
+        <w:t>2.7  Donor / Sponsor Coordinator</w:t>
+      </w:r>
+    </w:p>
+    <w:p>
+      <w:pPr>
+        <w:pStyle w:val="Normal"/>
+        <w:rPr/>
+      </w:pPr>
+      <w:r>
+        <w:rPr/>
+      </w:r>
+    </w:p>
+    <w:p>
+      <w:pPr>
+        <w:pStyle w:val="Normal"/>
+        <w:rPr/>
+      </w:pPr>
+      <w:r>
+        <w:rPr/>
+        <w:t xml:space="preserve">The Donor / Sponsor Coordinator is responsible for managing CBM’s donor and sponsor relationships and fundraising activities. This role tracks individual and organizational donors and sponsors throughout their full lifecycle, manages campaign activity, and ensures accurate records of all contributions, sponsorships, and pledges.</w:t>
+      </w:r>
+    </w:p>
+    <w:p>
+      <w:pPr>
+        <w:pStyle w:val="Normal"/>
+        <w:rPr/>
+      </w:pPr>
+      <w:r>
+        <w:rPr/>
+      </w:r>
+    </w:p>
+    <w:p>
+      <w:pPr>
+        <w:pStyle w:val="Normal"/>
+        <w:rPr/>
+      </w:pPr>
+      <w:r>
+        <w:rPr>
+          <w:b/>
+        </w:rPr>
+        <w:t>Primary Processes:</w:t>
+      </w:r>
+    </w:p>
+    <w:p>
+      <w:pPr>
+        <w:pStyle w:val="ListParagraph"/>
+        <w:numPr>
+          <w:ilvl w:val="0"/>
+          <w:numId w:val="1"/>
+        </w:numPr>
+        <w:rPr/>
+      </w:pPr>
+      <w:r>
+        <w:rPr/>
+        <w:t xml:space="preserve">Identify and pursue prospective donors and sponsors — managing the pipeline from prospect through committed</w:t>
+      </w:r>
+    </w:p>
+    <w:p>
+      <w:pPr>
+        <w:pStyle w:val="ListParagraph"/>
+        <w:numPr>
+          <w:ilvl w:val="0"/>
+          <w:numId w:val="1"/>
+        </w:numPr>
+        <w:rPr/>
+      </w:pPr>
+      <w:r>
+        <w:rPr/>
+        <w:t xml:space="preserve">Record and maintain individual and organizational donor and sponsor profiles in the CRM</w:t>
+      </w:r>
+    </w:p>
+    <w:p>
+      <w:pPr>
+        <w:pStyle w:val="ListParagraph"/>
+        <w:numPr>
+          <w:ilvl w:val="0"/>
+          <w:numId w:val="1"/>
+        </w:numPr>
+        <w:rPr/>
+      </w:pPr>
+      <w:r>
+        <w:rPr/>
+        <w:t xml:space="preserve">Record and track donations, sponsorships, grants, pledges, and recurring contributions</w:t>
+      </w:r>
+    </w:p>
+    <w:p>
+      <w:pPr>
+        <w:pStyle w:val="ListParagraph"/>
+        <w:numPr>
+          <w:ilvl w:val="0"/>
+          <w:numId w:val="1"/>
+        </w:numPr>
+        <w:rPr/>
+      </w:pPr>
+      <w:r>
+        <w:rPr/>
+        <w:t xml:space="preserve">Manage fundraising campaigns — track progress against goals and link donations to campaigns</w:t>
+      </w:r>
+    </w:p>
+    <w:p>
+      <w:pPr>
+        <w:pStyle w:val="ListParagraph"/>
+        <w:numPr>
+          <w:ilvl w:val="0"/>
+          <w:numId w:val="1"/>
+        </w:numPr>
+        <w:rPr/>
+      </w:pPr>
+      <w:r>
+        <w:rPr/>
+        <w:t xml:space="preserve">Track grant management — application status, award dates, reporting requirements, and renewals</w:t>
+      </w:r>
+    </w:p>
+    <w:p>
+      <w:pPr>
+        <w:pStyle w:val="ListParagraph"/>
+        <w:numPr>
+          <w:ilvl w:val="0"/>
+          <w:numId w:val="1"/>
+        </w:numPr>
+        <w:rPr/>
+      </w:pPr>
+      <w:r>
+        <w:rPr/>
+        <w:t xml:space="preserve">Generate donor acknowledgment records for tax receipt purposes</w:t>
+      </w:r>
+    </w:p>
+    <w:p>
+      <w:pPr>
+        <w:pStyle w:val="ListParagraph"/>
+        <w:numPr>
+          <w:ilvl w:val="0"/>
+          <w:numId w:val="1"/>
+        </w:numPr>
+        <w:rPr/>
+      </w:pPr>
+      <w:r>
+        <w:rPr/>
+        <w:t xml:space="preserve">Coordinate donor and sponsor communications — outreach, stewardship, and reporting</w:t>
+      </w:r>
+    </w:p>
+    <w:p>
+      <w:pPr>
+        <w:pStyle w:val="ListParagraph"/>
+        <w:numPr>
+          <w:ilvl w:val="0"/>
+          <w:numId w:val="1"/>
+        </w:numPr>
+        <w:rPr/>
+      </w:pPr>
+      <w:r>
+        <w:rPr/>
+        <w:t xml:space="preserve">Produce donor and funding analytics reports — giving history, campaign performance, and trends</w:t>
+      </w:r>
+    </w:p>
+    <w:p>
+      <w:pPr>
+        <w:pStyle w:val="Normal"/>
+        <w:rPr/>
+      </w:pPr>
+      <w:r>
+        <w:rPr/>
+      </w:r>
+    </w:p>
+    <w:p>
+      <w:pPr>
+        <w:pStyle w:val="Normal"/>
+        <w:rPr/>
+      </w:pPr>
+      <w:r>
+        <w:rPr>
+          <w:b/>
+        </w:rPr>
+        <w:t>Information Needed:</w:t>
+      </w:r>
+    </w:p>
+    <w:p>
+      <w:pPr>
+        <w:pStyle w:val="ListParagraph"/>
+        <w:numPr>
+          <w:ilvl w:val="0"/>
+          <w:numId w:val="1"/>
+        </w:numPr>
+        <w:rPr/>
+      </w:pPr>
+      <w:r>
+        <w:rPr/>
+        <w:t xml:space="preserve">Donor and sponsor profiles — contact information, giving history, campaign participation, and lifetime value</w:t>
+      </w:r>
+    </w:p>
+    <w:p>
+      <w:pPr>
+        <w:pStyle w:val="ListParagraph"/>
+        <w:numPr>
+          <w:ilvl w:val="0"/>
+          <w:numId w:val="1"/>
+        </w:numPr>
+        <w:rPr/>
+      </w:pPr>
+      <w:r>
+        <w:rPr/>
+        <w:t xml:space="preserve">Donation, sponsorship, and pledge records — amount, date, campaign, payment method, and designation</w:t>
+      </w:r>
+    </w:p>
+    <w:p>
+      <w:pPr>
+        <w:pStyle w:val="ListParagraph"/>
+        <w:numPr>
+          <w:ilvl w:val="0"/>
+          <w:numId w:val="1"/>
+        </w:numPr>
+        <w:rPr/>
+      </w:pPr>
+      <w:r>
+        <w:rPr/>
+        <w:t xml:space="preserve">Grant records — application status, award amount, reporting requirements, and renewal dates</w:t>
+      </w:r>
+    </w:p>
+    <w:p>
+      <w:pPr>
+        <w:pStyle w:val="ListParagraph"/>
+        <w:numPr>
+          <w:ilvl w:val="0"/>
+          <w:numId w:val="1"/>
+        </w:numPr>
+        <w:rPr/>
+      </w:pPr>
+      <w:r>
+        <w:rPr/>
+        <w:t xml:space="preserve">Campaign performance data — contributions received vs. goals</w:t>
+      </w:r>
+    </w:p>
+    <w:p>
+      <w:pPr>
+        <w:pStyle w:val="ListParagraph"/>
+        <w:numPr>
+          <w:ilvl w:val="0"/>
+          <w:numId w:val="1"/>
+        </w:numPr>
+        <w:rPr/>
+      </w:pPr>
+      <w:r>
+        <w:rPr/>
+        <w:t xml:space="preserve">Board member and mentor giving records — tracked separately for internal reporting</w:t>
+      </w:r>
+    </w:p>
+    <w:p>
+      <w:pPr>
+        <w:pStyle w:val="ListParagraph"/>
+        <w:numPr>
+          <w:ilvl w:val="0"/>
+          <w:numId w:val="1"/>
+        </w:numPr>
+        <w:rPr/>
+      </w:pPr>
+      <w:r>
+        <w:rPr/>
+        <w:t xml:space="preserve">Communication history with each donor and sponsor</w:t>
+      </w:r>
+    </w:p>
+    <w:p>
+      <w:pPr>
+        <w:pStyle w:val="Normal"/>
+        <w:rPr/>
+      </w:pPr>
+      <w:r>
+        <w:rPr/>
+      </w:r>
+    </w:p>
+    <w:p>
+      <w:pPr>
+        <w:pStyle w:val="Heading2"/>
+        <w:rPr/>
+      </w:pPr>
+      <w:r>
+        <w:rPr/>
+        <w:t>2.8  Partner Coordinator</w:t>
+      </w:r>
+    </w:p>
+    <w:p>
+      <w:pPr>
+        <w:pStyle w:val="Normal"/>
+        <w:rPr/>
+      </w:pPr>
+      <w:r>
+        <w:rPr/>
+      </w:r>
+    </w:p>
+    <w:p>
+      <w:pPr>
+        <w:pStyle w:val="Normal"/>
+        <w:rPr/>
+      </w:pPr>
+      <w:r>
+        <w:rPr/>
+        <w:t xml:space="preserve">The Partner Coordinator is responsible for managing CBM’s relationships with partner organizations. This role oversees the full partner lifecycle, coordinates joint service delivery, and ensures that partner-affiliated mentors and clients are properly tracked and supported.</w:t>
+      </w:r>
+    </w:p>
+    <w:p>
+      <w:pPr>
+        <w:pStyle w:val="Normal"/>
+        <w:rPr/>
+      </w:pPr>
+      <w:r>
+        <w:rPr/>
+      </w:r>
+    </w:p>
+    <w:p>
+      <w:pPr>
+        <w:pStyle w:val="Normal"/>
+        <w:rPr/>
+      </w:pPr>
+      <w:r>
+        <w:rPr>
+          <w:b/>
+        </w:rPr>
+        <w:t>Primary Processes:</w:t>
+      </w:r>
+    </w:p>
+    <w:p>
+      <w:pPr>
+        <w:pStyle w:val="ListParagraph"/>
+        <w:numPr>
+          <w:ilvl w:val="0"/>
+          <w:numId w:val="1"/>
+        </w:numPr>
+        <w:rPr/>
+      </w:pPr>
+      <w:r>
+        <w:rPr/>
+        <w:t xml:space="preserve">Identify and pursue prospective partner organizations — managing the pipeline from prospect through active</w:t>
+      </w:r>
+    </w:p>
+    <w:p>
+      <w:pPr>
+        <w:pStyle w:val="ListParagraph"/>
+        <w:numPr>
+          <w:ilvl w:val="0"/>
+          <w:numId w:val="1"/>
+        </w:numPr>
+        <w:rPr/>
+      </w:pPr>
+      <w:r>
+        <w:rPr/>
+        <w:t xml:space="preserve">Record and maintain partner organization profiles and associated contacts in the CRM</w:t>
+      </w:r>
+    </w:p>
+    <w:p>
+      <w:pPr>
+        <w:pStyle w:val="ListParagraph"/>
+        <w:numPr>
+          <w:ilvl w:val="0"/>
+          <w:numId w:val="1"/>
+        </w:numPr>
+        <w:rPr/>
+      </w:pPr>
+      <w:r>
+        <w:rPr/>
+        <w:t xml:space="preserve">Manage partnership agreements — track start dates, renewal dates, and terms</w:t>
+      </w:r>
+    </w:p>
+    <w:p>
+      <w:pPr>
+        <w:pStyle w:val="ListParagraph"/>
+        <w:numPr>
+          <w:ilvl w:val="0"/>
+          <w:numId w:val="1"/>
+        </w:numPr>
+        <w:rPr/>
+      </w:pPr>
+      <w:r>
+        <w:rPr/>
+        <w:t xml:space="preserve">Maintain regular contact with active partners — scheduling touchpoints, logging interactions, and ensuring relationships remain healthy and productive</w:t>
+      </w:r>
+    </w:p>
+    <w:p>
+      <w:pPr>
+        <w:pStyle w:val="ListParagraph"/>
+        <w:numPr>
+          <w:ilvl w:val="0"/>
+          <w:numId w:val="1"/>
+        </w:numPr>
+        <w:rPr/>
+      </w:pPr>
+      <w:r>
+        <w:rPr/>
+        <w:t xml:space="preserve">Coordinate joint marketing and recruitment initiatives with the Client Recruiter and Mentor Recruiter</w:t>
+      </w:r>
+    </w:p>
+    <w:p>
+      <w:pPr>
+        <w:pStyle w:val="ListParagraph"/>
+        <w:numPr>
+          <w:ilvl w:val="0"/>
+          <w:numId w:val="1"/>
+        </w:numPr>
+        <w:rPr/>
+      </w:pPr>
+      <w:r>
+        <w:rPr/>
+        <w:t xml:space="preserve">Track mentors affiliated with partner organizations and their geographic service areas</w:t>
+      </w:r>
+    </w:p>
+    <w:p>
+      <w:pPr>
+        <w:pStyle w:val="ListParagraph"/>
+        <w:numPr>
+          <w:ilvl w:val="0"/>
+          <w:numId w:val="1"/>
+        </w:numPr>
+        <w:rPr/>
+      </w:pPr>
+      <w:r>
+        <w:rPr/>
+        <w:t xml:space="preserve">Track clients referred by partner organizations and link engagements to the referring partner</w:t>
+      </w:r>
+    </w:p>
+    <w:p>
+      <w:pPr>
+        <w:pStyle w:val="ListParagraph"/>
+        <w:numPr>
+          <w:ilvl w:val="0"/>
+          <w:numId w:val="1"/>
+        </w:numPr>
+        <w:rPr/>
+      </w:pPr>
+      <w:r>
+        <w:rPr/>
+        <w:t xml:space="preserve">Coordinate partner co-sponsorship of workshops and events</w:t>
+      </w:r>
+    </w:p>
+    <w:p>
+      <w:pPr>
+        <w:pStyle w:val="ListParagraph"/>
+        <w:numPr>
+          <w:ilvl w:val="0"/>
+          <w:numId w:val="1"/>
+        </w:numPr>
+        <w:rPr/>
+      </w:pPr>
+      <w:r>
+        <w:rPr/>
+        <w:t xml:space="preserve">Produce partner analytics reports — mentors contributed, clients served, events co-sponsored, and CBM service delivery within partner geography</w:t>
+      </w:r>
+    </w:p>
+    <w:p>
+      <w:pPr>
+        <w:pStyle w:val="ListParagraph"/>
+        <w:numPr>
+          <w:ilvl w:val="0"/>
+          <w:numId w:val="1"/>
+        </w:numPr>
+        <w:rPr/>
+      </w:pPr>
+      <w:r>
+        <w:rPr/>
+        <w:t xml:space="preserve">Communicate with partner organizations across all CBM personnel — ensuring no communication is siloed</w:t>
+      </w:r>
+    </w:p>
+    <w:p>
+      <w:pPr>
+        <w:pStyle w:val="Normal"/>
+        <w:rPr/>
+      </w:pPr>
+      <w:r>
+        <w:rPr/>
+      </w:r>
+    </w:p>
+    <w:p>
+      <w:pPr>
+        <w:pStyle w:val="Normal"/>
+        <w:rPr/>
+      </w:pPr>
+      <w:r>
+        <w:rPr>
+          <w:b/>
+        </w:rPr>
+        <w:t>Information Needed:</w:t>
+      </w:r>
+    </w:p>
+    <w:p>
+      <w:pPr>
+        <w:pStyle w:val="ListParagraph"/>
+        <w:numPr>
+          <w:ilvl w:val="0"/>
+          <w:numId w:val="1"/>
+        </w:numPr>
+        <w:rPr/>
+      </w:pPr>
+      <w:r>
+        <w:rPr/>
+        <w:t xml:space="preserve">Partner organization profiles — name, contact info, service area, partner type, and status</w:t>
+      </w:r>
+    </w:p>
+    <w:p>
+      <w:pPr>
+        <w:pStyle w:val="ListParagraph"/>
+        <w:numPr>
+          <w:ilvl w:val="0"/>
+          <w:numId w:val="1"/>
+        </w:numPr>
+        <w:rPr/>
+      </w:pPr>
+      <w:r>
+        <w:rPr/>
+        <w:t xml:space="preserve">Partnership agreement records — dates, terms, and renewal schedule</w:t>
+      </w:r>
+    </w:p>
+    <w:p>
+      <w:pPr>
+        <w:pStyle w:val="ListParagraph"/>
+        <w:numPr>
+          <w:ilvl w:val="0"/>
+          <w:numId w:val="1"/>
+        </w:numPr>
+        <w:rPr/>
+      </w:pPr>
+      <w:r>
+        <w:rPr/>
+        <w:t xml:space="preserve">Communication history and interaction log with each partner — to track relationship cadence and follow-up needs</w:t>
+      </w:r>
+    </w:p>
+    <w:p>
+      <w:pPr>
+        <w:pStyle w:val="ListParagraph"/>
+        <w:numPr>
+          <w:ilvl w:val="0"/>
+          <w:numId w:val="1"/>
+        </w:numPr>
+        <w:rPr/>
+      </w:pPr>
+      <w:r>
+        <w:rPr/>
+        <w:t xml:space="preserve">Mentor roster — filtered by partner affiliation and geographic service area</w:t>
+      </w:r>
+    </w:p>
+    <w:p>
+      <w:pPr>
+        <w:pStyle w:val="ListParagraph"/>
+        <w:numPr>
+          <w:ilvl w:val="0"/>
+          <w:numId w:val="1"/>
+        </w:numPr>
+        <w:rPr/>
+      </w:pPr>
+      <w:r>
+        <w:rPr/>
+        <w:t xml:space="preserve">Client records — filtered by partner referral source</w:t>
+      </w:r>
+    </w:p>
+    <w:p>
+      <w:pPr>
+        <w:pStyle w:val="ListParagraph"/>
+        <w:numPr>
+          <w:ilvl w:val="0"/>
+          <w:numId w:val="1"/>
+        </w:numPr>
+        <w:rPr/>
+      </w:pPr>
+      <w:r>
+        <w:rPr/>
+        <w:t xml:space="preserve">Engagement records — linked to partner organizations for joint service reporting</w:t>
+      </w:r>
+    </w:p>
+    <w:p>
+      <w:pPr>
+        <w:pStyle w:val="ListParagraph"/>
+        <w:numPr>
+          <w:ilvl w:val="0"/>
+          <w:numId w:val="1"/>
+        </w:numPr>
+        <w:rPr/>
+      </w:pPr>
+      <w:r>
+        <w:rPr/>
+        <w:t xml:space="preserve">Event and workshop records — linked to partner co-sponsorships</w:t>
+      </w:r>
+    </w:p>
+    <w:p>
+      <w:pPr>
+        <w:pStyle w:val="Normal"/>
+        <w:rPr/>
+      </w:pPr>
+      <w:r>
+        <w:rPr/>
+      </w:r>
+    </w:p>
+    <w:p>
+      <w:pPr>
+        <w:pStyle w:val="Heading2"/>
+        <w:rPr/>
+      </w:pPr>
+      <w:r>
+        <w:rPr/>
+        <w:t>2.9  Content and Event Administrator</w:t>
+      </w:r>
+    </w:p>
+    <w:p>
+      <w:pPr>
+        <w:pStyle w:val="Normal"/>
+        <w:rPr/>
+      </w:pPr>
+      <w:r>
+        <w:rPr/>
+      </w:r>
+    </w:p>
+    <w:p>
+      <w:pPr>
+        <w:pStyle w:val="Normal"/>
+        <w:rPr/>
+      </w:pPr>
+      <w:r>
+        <w:rPr/>
+        <w:t xml:space="preserve">The Content and Event Administrator is responsible for planning, organizing, and managing CBM’s workshops, events, and related content. This role coordinates all aspects of event delivery from creation through post-event reporting, and manages the materials and resources that support CBM’s programming.</w:t>
+      </w:r>
+    </w:p>
+    <w:p>
+      <w:pPr>
+        <w:pStyle w:val="Normal"/>
+        <w:rPr/>
+      </w:pPr>
+      <w:r>
+        <w:rPr/>
+      </w:r>
+    </w:p>
+    <w:p>
+      <w:pPr>
+        <w:pStyle w:val="Normal"/>
+        <w:rPr/>
+      </w:pPr>
+      <w:r>
+        <w:rPr>
+          <w:b/>
+        </w:rPr>
+        <w:t>Primary Processes:</w:t>
+      </w:r>
+    </w:p>
+    <w:p>
+      <w:pPr>
+        <w:pStyle w:val="ListParagraph"/>
+        <w:numPr>
+          <w:ilvl w:val="0"/>
+          <w:numId w:val="1"/>
+        </w:numPr>
+        <w:rPr/>
+      </w:pPr>
+      <w:r>
+        <w:rPr/>
+        <w:t xml:space="preserve">Create and manage event records in the CRM — name, date, location, description, capacity, and status</w:t>
+      </w:r>
+    </w:p>
+    <w:p>
+      <w:pPr>
+        <w:pStyle w:val="ListParagraph"/>
+        <w:numPr>
+          <w:ilvl w:val="0"/>
+          <w:numId w:val="1"/>
+        </w:numPr>
+        <w:rPr/>
+      </w:pPr>
+      <w:r>
+        <w:rPr/>
+        <w:t xml:space="preserve">Manage event registration — track registrations, attendance, waitlists, and no-shows</w:t>
+      </w:r>
+    </w:p>
+    <w:p>
+      <w:pPr>
+        <w:pStyle w:val="ListParagraph"/>
+        <w:numPr>
+          <w:ilvl w:val="0"/>
+          <w:numId w:val="1"/>
+        </w:numPr>
+        <w:rPr/>
+      </w:pPr>
+      <w:r>
+        <w:rPr/>
+        <w:t xml:space="preserve">Send event registration confirmations and reminders to registrants</w:t>
+      </w:r>
+    </w:p>
+    <w:p>
+      <w:pPr>
+        <w:pStyle w:val="ListParagraph"/>
+        <w:numPr>
+          <w:ilvl w:val="0"/>
+          <w:numId w:val="1"/>
+        </w:numPr>
+        <w:rPr/>
+      </w:pPr>
+      <w:r>
+        <w:rPr/>
+        <w:t xml:space="preserve">Coordinate with partner organizations on co-sponsored events</w:t>
+      </w:r>
+    </w:p>
+    <w:p>
+      <w:pPr>
+        <w:pStyle w:val="ListParagraph"/>
+        <w:numPr>
+          <w:ilvl w:val="0"/>
+          <w:numId w:val="1"/>
+        </w:numPr>
+        <w:rPr/>
+      </w:pPr>
+      <w:r>
+        <w:rPr/>
+        <w:t xml:space="preserve">Coordinate with donor and sponsor organizations on sponsored events</w:t>
+      </w:r>
+    </w:p>
+    <w:p>
+      <w:pPr>
+        <w:pStyle w:val="ListParagraph"/>
+        <w:numPr>
+          <w:ilvl w:val="0"/>
+          <w:numId w:val="1"/>
+        </w:numPr>
+        <w:rPr/>
+      </w:pPr>
+      <w:r>
+        <w:rPr/>
+        <w:t xml:space="preserve">Track presenters associated with events — linking to existing contact records where applicable</w:t>
+      </w:r>
+    </w:p>
+    <w:p>
+      <w:pPr>
+        <w:pStyle w:val="ListParagraph"/>
+        <w:numPr>
+          <w:ilvl w:val="0"/>
+          <w:numId w:val="1"/>
+        </w:numPr>
+        <w:rPr/>
+      </w:pPr>
+      <w:r>
+        <w:rPr/>
+        <w:t xml:space="preserve">Store and manage event documents — agendas, presentations, and supporting materials</w:t>
+      </w:r>
+    </w:p>
+    <w:p>
+      <w:pPr>
+        <w:pStyle w:val="ListParagraph"/>
+        <w:numPr>
+          <w:ilvl w:val="0"/>
+          <w:numId w:val="1"/>
+        </w:numPr>
+        <w:rPr/>
+      </w:pPr>
+      <w:r>
+        <w:rPr/>
+        <w:t xml:space="preserve">Produce event analytics reports — registrations, attendance, no-shows, and trends by event type and geography</w:t>
+      </w:r>
+    </w:p>
+    <w:p>
+      <w:pPr>
+        <w:pStyle w:val="ListParagraph"/>
+        <w:numPr>
+          <w:ilvl w:val="0"/>
+          <w:numId w:val="1"/>
+        </w:numPr>
+        <w:rPr/>
+      </w:pPr>
+      <w:r>
+        <w:rPr/>
+        <w:t xml:space="preserve">Manage content and materials used across CBM’s programs and communications</w:t>
+      </w:r>
+    </w:p>
+    <w:p>
+      <w:pPr>
+        <w:pStyle w:val="Normal"/>
+        <w:rPr/>
+      </w:pPr>
+      <w:r>
+        <w:rPr/>
+      </w:r>
+    </w:p>
+    <w:p>
+      <w:pPr>
+        <w:pStyle w:val="Normal"/>
+        <w:rPr/>
+      </w:pPr>
+      <w:r>
+        <w:rPr>
+          <w:b/>
+        </w:rPr>
+        <w:t>Information Needed:</w:t>
+      </w:r>
+    </w:p>
+    <w:p>
+      <w:pPr>
+        <w:pStyle w:val="ListParagraph"/>
+        <w:numPr>
+          <w:ilvl w:val="0"/>
+          <w:numId w:val="1"/>
+        </w:numPr>
+        <w:rPr/>
+      </w:pPr>
+      <w:r>
+        <w:rPr/>
+        <w:t xml:space="preserve">Event records — type, status, date, location, capacity, and audience</w:t>
+      </w:r>
+    </w:p>
+    <w:p>
+      <w:pPr>
+        <w:pStyle w:val="ListParagraph"/>
+        <w:numPr>
+          <w:ilvl w:val="0"/>
+          <w:numId w:val="1"/>
+        </w:numPr>
+        <w:rPr/>
+      </w:pPr>
+      <w:r>
+        <w:rPr/>
+        <w:t xml:space="preserve">Registration and attendance records per event</w:t>
+      </w:r>
+    </w:p>
+    <w:p>
+      <w:pPr>
+        <w:pStyle w:val="ListParagraph"/>
+        <w:numPr>
+          <w:ilvl w:val="0"/>
+          <w:numId w:val="1"/>
+        </w:numPr>
+        <w:rPr/>
+      </w:pPr>
+      <w:r>
+        <w:rPr/>
+        <w:t xml:space="preserve">Presenter contact records</w:t>
+      </w:r>
+    </w:p>
+    <w:p>
+      <w:pPr>
+        <w:pStyle w:val="ListParagraph"/>
+        <w:numPr>
+          <w:ilvl w:val="0"/>
+          <w:numId w:val="1"/>
+        </w:numPr>
+        <w:rPr/>
+      </w:pPr>
+      <w:r>
+        <w:rPr/>
+        <w:t xml:space="preserve">Partner and sponsor records — linked to co-sponsored events</w:t>
+      </w:r>
+    </w:p>
+    <w:p>
+      <w:pPr>
+        <w:pStyle w:val="ListParagraph"/>
+        <w:numPr>
+          <w:ilvl w:val="0"/>
+          <w:numId w:val="1"/>
+        </w:numPr>
+        <w:rPr/>
+      </w:pPr>
+      <w:r>
+        <w:rPr/>
+        <w:t xml:space="preserve">Communication history — confirmations, reminders, and follow-ups sent to registrants</w:t>
+      </w:r>
+    </w:p>
+    <w:p>
+      <w:pPr>
+        <w:pStyle w:val="ListParagraph"/>
+        <w:numPr>
+          <w:ilvl w:val="0"/>
+          <w:numId w:val="1"/>
+        </w:numPr>
+        <w:rPr/>
+      </w:pPr>
+      <w:r>
+        <w:rPr/>
+        <w:t xml:space="preserve">Event analytics — historical attendance trends by event type and geography</w:t>
+      </w:r>
+    </w:p>
+    <w:p>
+      <w:pPr>
+        <w:pStyle w:val="Normal"/>
+        <w:rPr/>
+      </w:pPr>
+      <w:r>
+        <w:rPr/>
+      </w:r>
+    </w:p>
+    <w:p>
+      <w:pPr>
+        <w:pStyle w:val="Heading2"/>
+        <w:rPr/>
+      </w:pPr>
+      <w:r>
+        <w:rPr/>
+        <w:t>2.10  Mentor</w:t>
+      </w:r>
+    </w:p>
+    <w:p>
+      <w:pPr>
+        <w:pStyle w:val="Normal"/>
+        <w:rPr/>
+      </w:pPr>
+      <w:r>
+        <w:rPr/>
+      </w:r>
+    </w:p>
+    <w:p>
+      <w:pPr>
+        <w:pStyle w:val="Normal"/>
+        <w:rPr/>
+      </w:pPr>
+      <w:r>
+        <w:rPr/>
+        <w:t xml:space="preserve">The Mentor is a volunteer professional who provides guidance, expertise, and support to CBM client businesses. A single individual may serve in one or more mentor capacities — as a Primary Mentor owning a client relationship, a Co-Mentor paired with a primary, or a Subject Matter Expert providing on-demand specialist input. All three variations share the same profile and interact with the CRM in essentially the same way.</w:t>
+      </w:r>
+    </w:p>
+    <w:p>
+      <w:pPr>
+        <w:pStyle w:val="Normal"/>
+        <w:rPr/>
+      </w:pPr>
+      <w:r>
+        <w:rPr/>
+      </w:r>
+    </w:p>
+    <w:p>
+      <w:pPr>
+        <w:pStyle w:val="Normal"/>
+        <w:rPr/>
+      </w:pPr>
+      <w:r>
+        <w:rPr>
+          <w:b/>
+        </w:rPr>
+        <w:t>Primary Processes:</w:t>
+      </w:r>
+    </w:p>
+    <w:p>
+      <w:pPr>
+        <w:pStyle w:val="ListParagraph"/>
+        <w:numPr>
+          <w:ilvl w:val="0"/>
+          <w:numId w:val="1"/>
+        </w:numPr>
+        <w:rPr/>
+      </w:pPr>
+      <w:r>
+        <w:rPr/>
+        <w:t xml:space="preserve">Maintain and update their own mentor profile — bio, expertise, industry background, and availability</w:t>
+      </w:r>
+    </w:p>
+    <w:p>
+      <w:pPr>
+        <w:pStyle w:val="ListParagraph"/>
+        <w:numPr>
+          <w:ilvl w:val="0"/>
+          <w:numId w:val="1"/>
+        </w:numPr>
+        <w:rPr/>
+      </w:pPr>
+      <w:r>
+        <w:rPr/>
+        <w:t xml:space="preserve">Review and accept or decline engagement and SME request assignments</w:t>
+      </w:r>
+    </w:p>
+    <w:p>
+      <w:pPr>
+        <w:pStyle w:val="ListParagraph"/>
+        <w:numPr>
+          <w:ilvl w:val="0"/>
+          <w:numId w:val="1"/>
+        </w:numPr>
+        <w:rPr/>
+      </w:pPr>
+      <w:r>
+        <w:rPr/>
+        <w:t xml:space="preserve">Log session notes and outcomes following each client meeting</w:t>
+      </w:r>
+    </w:p>
+    <w:p>
+      <w:pPr>
+        <w:pStyle w:val="ListParagraph"/>
+        <w:numPr>
+          <w:ilvl w:val="0"/>
+          <w:numId w:val="1"/>
+        </w:numPr>
+        <w:rPr/>
+      </w:pPr>
+      <w:r>
+        <w:rPr/>
+        <w:t xml:space="preserve">Schedule sessions with clients — via CRM or self-scheduling tool</w:t>
+      </w:r>
+    </w:p>
+    <w:p>
+      <w:pPr>
+        <w:pStyle w:val="ListParagraph"/>
+        <w:numPr>
+          <w:ilvl w:val="0"/>
+          <w:numId w:val="1"/>
+        </w:numPr>
+        <w:rPr/>
+      </w:pPr>
+      <w:r>
+        <w:rPr/>
+        <w:t xml:space="preserve">Request Subject Matter Expert involvement when specialist input is needed for a client engagement</w:t>
+      </w:r>
+    </w:p>
+    <w:p>
+      <w:pPr>
+        <w:pStyle w:val="ListParagraph"/>
+        <w:numPr>
+          <w:ilvl w:val="0"/>
+          <w:numId w:val="1"/>
+        </w:numPr>
+        <w:rPr/>
+      </w:pPr>
+      <w:r>
+        <w:rPr/>
+        <w:t xml:space="preserve">Register for and attend CBM workshops and events</w:t>
+      </w:r>
+    </w:p>
+    <w:p>
+      <w:pPr>
+        <w:pStyle w:val="ListParagraph"/>
+        <w:numPr>
+          <w:ilvl w:val="0"/>
+          <w:numId w:val="1"/>
+        </w:numPr>
+        <w:rPr/>
+      </w:pPr>
+      <w:r>
+        <w:rPr/>
+        <w:t xml:space="preserve">Complete training requirements during provisional onboarding</w:t>
+      </w:r>
+    </w:p>
+    <w:p>
+      <w:pPr>
+        <w:pStyle w:val="ListParagraph"/>
+        <w:numPr>
+          <w:ilvl w:val="0"/>
+          <w:numId w:val="1"/>
+        </w:numPr>
+        <w:rPr/>
+      </w:pPr>
+      <w:r>
+        <w:rPr/>
+        <w:t xml:space="preserve">Access their personal analytics dashboard — session history, engagement outcomes, and performance trends</w:t>
+      </w:r>
+    </w:p>
+    <w:p>
+      <w:pPr>
+        <w:pStyle w:val="Normal"/>
+        <w:rPr/>
+      </w:pPr>
+      <w:r>
+        <w:rPr/>
+      </w:r>
+    </w:p>
+    <w:p>
+      <w:pPr>
+        <w:pStyle w:val="Normal"/>
+        <w:rPr/>
+      </w:pPr>
+      <w:r>
+        <w:rPr>
+          <w:b/>
+        </w:rPr>
+        <w:t>Information Needed:</w:t>
+      </w:r>
+    </w:p>
+    <w:p>
+      <w:pPr>
+        <w:pStyle w:val="ListParagraph"/>
+        <w:numPr>
+          <w:ilvl w:val="0"/>
+          <w:numId w:val="1"/>
+        </w:numPr>
+        <w:rPr/>
+      </w:pPr>
+      <w:r>
+        <w:rPr/>
+        <w:t xml:space="preserve">Their own profile and status</w:t>
+      </w:r>
+    </w:p>
+    <w:p>
+      <w:pPr>
+        <w:pStyle w:val="ListParagraph"/>
+        <w:numPr>
+          <w:ilvl w:val="0"/>
+          <w:numId w:val="1"/>
+        </w:numPr>
+        <w:rPr/>
+      </w:pPr>
+      <w:r>
+        <w:rPr/>
+        <w:t xml:space="preserve">Assigned client and engagement records</w:t>
+      </w:r>
+    </w:p>
+    <w:p>
+      <w:pPr>
+        <w:pStyle w:val="ListParagraph"/>
+        <w:numPr>
+          <w:ilvl w:val="0"/>
+          <w:numId w:val="1"/>
+        </w:numPr>
+        <w:rPr/>
+      </w:pPr>
+      <w:r>
+        <w:rPr/>
+        <w:t xml:space="preserve">Session history and upcoming scheduled sessions</w:t>
+      </w:r>
+    </w:p>
+    <w:p>
+      <w:pPr>
+        <w:pStyle w:val="ListParagraph"/>
+        <w:numPr>
+          <w:ilvl w:val="0"/>
+          <w:numId w:val="1"/>
+        </w:numPr>
+        <w:rPr/>
+      </w:pPr>
+      <w:r>
+        <w:rPr/>
+        <w:t xml:space="preserve">SME request status — for requests they have initiated or received</w:t>
+      </w:r>
+    </w:p>
+    <w:p>
+      <w:pPr>
+        <w:pStyle w:val="ListParagraph"/>
+        <w:numPr>
+          <w:ilvl w:val="0"/>
+          <w:numId w:val="1"/>
+        </w:numPr>
+        <w:rPr/>
+      </w:pPr>
+      <w:r>
+        <w:rPr/>
+        <w:t xml:space="preserve">Training enrollment and completion status</w:t>
+      </w:r>
+    </w:p>
+    <w:p>
+      <w:pPr>
+        <w:pStyle w:val="ListParagraph"/>
+        <w:numPr>
+          <w:ilvl w:val="0"/>
+          <w:numId w:val="1"/>
+        </w:numPr>
+        <w:rPr/>
+      </w:pPr>
+      <w:r>
+        <w:rPr/>
+        <w:t xml:space="preserve">CBM mentor directory — to locate and connect with fellow mentors</w:t>
+      </w:r>
+    </w:p>
+    <w:p>
+      <w:pPr>
+        <w:pStyle w:val="ListParagraph"/>
+        <w:numPr>
+          <w:ilvl w:val="0"/>
+          <w:numId w:val="1"/>
+        </w:numPr>
+        <w:rPr/>
+      </w:pPr>
+      <w:r>
+        <w:rPr/>
+        <w:t xml:space="preserve">Event and workshop schedule</w:t>
+      </w:r>
+    </w:p>
+    <w:p>
+      <w:pPr>
+        <w:pStyle w:val="Normal"/>
+        <w:rPr/>
+      </w:pPr>
+      <w:r>
+        <w:rPr/>
+      </w:r>
+    </w:p>
+    <w:p>
+      <w:pPr>
+        <w:pStyle w:val="Heading2"/>
+        <w:rPr/>
+      </w:pPr>
+      <w:r>
+        <w:rPr/>
+        <w:t>2.11  Member</w:t>
+      </w:r>
+    </w:p>
+    <w:p>
+      <w:pPr>
+        <w:pStyle w:val="Normal"/>
+        <w:rPr/>
+      </w:pPr>
+      <w:r>
+        <w:rPr/>
+      </w:r>
+    </w:p>
+    <w:p>
+      <w:pPr>
+        <w:pStyle w:val="Normal"/>
+        <w:rPr/>
+      </w:pPr>
+      <w:r>
+        <w:rPr/>
+        <w:t xml:space="preserve">The Member is a general affiliate of CBM who supports the organization in a variety of capacities without holding a specific functional role. Members may assist with outreach, events, committees, or other organizational activities as needed. This persona serves as the catch-all for individuals who are engaged with CBM but do not fit any other defined role.</w:t>
+      </w:r>
+    </w:p>
+    <w:p>
+      <w:pPr>
+        <w:pStyle w:val="Normal"/>
+        <w:rPr/>
+      </w:pPr>
+      <w:r>
+        <w:rPr/>
+      </w:r>
+    </w:p>
+    <w:p>
+      <w:pPr>
+        <w:pStyle w:val="Normal"/>
+        <w:rPr/>
+      </w:pPr>
+      <w:r>
+        <w:rPr>
+          <w:b/>
+        </w:rPr>
+        <w:t>Primary Processes:</w:t>
+      </w:r>
+    </w:p>
+    <w:p>
+      <w:pPr>
+        <w:pStyle w:val="ListParagraph"/>
+        <w:numPr>
+          <w:ilvl w:val="0"/>
+          <w:numId w:val="1"/>
+        </w:numPr>
+        <w:rPr/>
+      </w:pPr>
+      <w:r>
+        <w:rPr/>
+        <w:t xml:space="preserve">Participate in CBM events, workshops, and organizational activities</w:t>
+      </w:r>
+    </w:p>
+    <w:p>
+      <w:pPr>
+        <w:pStyle w:val="ListParagraph"/>
+        <w:numPr>
+          <w:ilvl w:val="0"/>
+          <w:numId w:val="1"/>
+        </w:numPr>
+        <w:rPr/>
+      </w:pPr>
+      <w:r>
+        <w:rPr/>
+        <w:t xml:space="preserve">Support CBM programs and initiatives in an as-needed or ad-hoc capacity</w:t>
+      </w:r>
+    </w:p>
+    <w:p>
+      <w:pPr>
+        <w:pStyle w:val="ListParagraph"/>
+        <w:numPr>
+          <w:ilvl w:val="0"/>
+          <w:numId w:val="1"/>
+        </w:numPr>
+        <w:rPr/>
+      </w:pPr>
+      <w:r>
+        <w:rPr/>
+        <w:t xml:space="preserve">Maintain their own profile and contact information</w:t>
+      </w:r>
+    </w:p>
+    <w:p>
+      <w:pPr>
+        <w:pStyle w:val="Normal"/>
+        <w:rPr/>
+      </w:pPr>
+      <w:r>
+        <w:rPr/>
+      </w:r>
+    </w:p>
+    <w:p>
+      <w:pPr>
+        <w:pStyle w:val="Normal"/>
+        <w:rPr/>
+      </w:pPr>
+      <w:r>
+        <w:rPr>
+          <w:b/>
+        </w:rPr>
+        <w:t>Information Needed:</w:t>
+      </w:r>
+    </w:p>
+    <w:p>
+      <w:pPr>
+        <w:pStyle w:val="ListParagraph"/>
+        <w:numPr>
+          <w:ilvl w:val="0"/>
+          <w:numId w:val="1"/>
+        </w:numPr>
+        <w:rPr/>
+      </w:pPr>
+      <w:r>
+        <w:rPr/>
+        <w:t xml:space="preserve">CBM event and workshop schedule — to participate in relevant activities</w:t>
+      </w:r>
+    </w:p>
+    <w:p>
+      <w:pPr>
+        <w:pStyle w:val="ListParagraph"/>
+        <w:numPr>
+          <w:ilvl w:val="0"/>
+          <w:numId w:val="1"/>
+        </w:numPr>
+        <w:rPr/>
+      </w:pPr>
+      <w:r>
+        <w:rPr/>
+        <w:t xml:space="preserve">Relevant organizational communications and announcements</w:t>
+      </w:r>
+    </w:p>
+    <w:p>
+      <w:pPr>
+        <w:pStyle w:val="Normal"/>
+        <w:rPr/>
+      </w:pPr>
+      <w:r>
+        <w:rPr/>
+      </w:r>
+    </w:p>
+    <w:p>
+      <w:pPr>
+        <w:pStyle w:val="Heading1"/>
+        <w:rPr/>
+      </w:pPr>
+      <w:r>
+        <w:rPr/>
+        <w:t>3. Detailed Requirements</w:t>
+      </w:r>
+    </w:p>
+    <w:p>
+      <w:pPr>
+        <w:pStyle w:val="Normal"/>
+        <w:rPr/>
+      </w:pPr>
+      <w:r>
+        <w:rPr/>
+      </w:r>
+    </w:p>
+    <w:p>
+      <w:pPr>
+        <w:pStyle w:val="Heading2"/>
+        <w:rPr/>
+      </w:pPr>
+      <w:r>
+        <w:rPr/>
+        <w:t>3.1  Mentor Administration</w:t>
       </w:r>
     </w:p>
     <w:tbl>
@@ -1554,7 +4488,7 @@
       </w:pPr>
       <w:r>
         <w:rPr/>
-        <w:t>2.2  Client Administration</w:t>
+        <w:t>3.2  Client Administration</w:t>
       </w:r>
     </w:p>
     <w:tbl>
@@ -2737,7 +5671,7 @@
       </w:pPr>
       <w:r>
         <w:rPr/>
-        <w:t>2.3  Engagement Management</w:t>
+        <w:t>3.3  Engagement Management</w:t>
       </w:r>
     </w:p>
     <w:tbl>
@@ -3806,7 +6740,7 @@
       </w:pPr>
       <w:r>
         <w:rPr/>
-        <w:t>2.4  Partner Management</w:t>
+        <w:t>3.4  Partner Management</w:t>
       </w:r>
     </w:p>
     <w:tbl>
@@ -4875,7 +7809,7 @@
       </w:pPr>
       <w:r>
         <w:rPr/>
-        <w:t>2.5  Sponsor Management</w:t>
+        <w:t>3.5  Sponsor Management</w:t>
       </w:r>
     </w:p>
     <w:tbl>
@@ -5032,7 +7966,7 @@
       </w:pPr>
       <w:r>
         <w:rPr/>
-        <w:t>2.6  Donor &amp; Funding Management</w:t>
+        <w:t>3.6  Donor &amp; Funding Management</w:t>
       </w:r>
     </w:p>
     <w:tbl>
@@ -6272,7 +9206,7 @@
       </w:pPr>
       <w:r>
         <w:rPr/>
-        <w:t>2.7  Workshop &amp; Event Management</w:t>
+        <w:t>3.7  Workshop &amp; Event Management</w:t>
       </w:r>
     </w:p>
     <w:tbl>
@@ -7398,7 +10332,7 @@
       </w:pPr>
       <w:r>
         <w:rPr/>
-        <w:t>2.8  Communications Management</w:t>
+        <w:t>3.8  Communications Management</w:t>
       </w:r>
     </w:p>
     <w:tbl>
@@ -8353,7 +11287,7 @@
       </w:pPr>
       <w:r>
         <w:rPr/>
-        <w:t>2.9  Reporting &amp; Analytics</w:t>
+        <w:t>3.9  Reporting &amp; Analytics</w:t>
       </w:r>
     </w:p>
     <w:tbl>
@@ -9650,7 +12584,7 @@
       </w:pPr>
       <w:r>
         <w:rPr/>
-        <w:t>2.10  Integrations</w:t>
+        <w:t>3.10  Integrations</w:t>
       </w:r>
     </w:p>
     <w:tbl>
@@ -10491,7 +13425,7 @@
       </w:pPr>
       <w:r>
         <w:rPr/>
-        <w:t>2.11  System Administration</w:t>
+        <w:t>3.11  System Administration</w:t>
       </w:r>
     </w:p>
     <w:tbl>
@@ -11573,7 +14507,7 @@
       </w:pPr>
       <w:r>
         <w:rPr/>
-        <w:t>3. Platform Decision</w:t>
+        <w:t>4. Platform Decision</w:t>
       </w:r>
     </w:p>
     <w:tbl>
@@ -12040,7 +14974,7 @@
       </w:pPr>
       <w:r>
         <w:rPr/>
-        <w:t>4. Architectural Principles</w:t>
+        <w:t>5. Architectural Principles</w:t>
       </w:r>
     </w:p>
     <w:p>
@@ -12162,7 +15096,7 @@
       </w:pPr>
       <w:r>
         <w:rPr/>
-        <w:t>5. Mentoring Lifecycle</w:t>
+        <w:t>6. Mentoring Lifecycle</w:t>
       </w:r>
     </w:p>
     <w:p>
@@ -12359,7 +15293,7 @@
       </w:pPr>
       <w:r>
         <w:rPr/>
-        <w:t>6. Volunteer Role Model</w:t>
+        <w:t>7. Volunteer Role Model</w:t>
       </w:r>
     </w:p>
     <w:tbl>
@@ -15067,15 +18001,7 @@
       </w:pPr>
       <w:r>
         <w:rPr/>
-        <w:t xml:space="preserve">10. Video </w:t>
-      </w:r>
-      <w:r>
-        <w:rPr/>
-        <w:t xml:space="preserve">Meeting </w:t>
-      </w:r>
-      <w:r>
-        <w:rPr/>
-        <w:t>Platform</w:t>
+        <w:t>10. Video Meeting Platform</w:t>
       </w:r>
     </w:p>
     <w:p>
@@ -15329,15 +18255,7 @@
                 <w:sz w:val="20"/>
                 <w:szCs w:val="20"/>
               </w:rPr>
-              <w:t xml:space="preserve">Jitsi Meet (self-hosted) / </w:t>
-            </w:r>
-            <w:r>
-              <w:rPr>
-                <w:rFonts w:eastAsia="Arial" w:cs="Arial"/>
-                <w:sz w:val="20"/>
-                <w:szCs w:val="20"/>
-              </w:rPr>
-              <w:t>Zoom</w:t>
+              <w:t>Jitsi Meet (self-hosted) / Zoom</w:t>
             </w:r>
           </w:p>
         </w:tc>
@@ -15652,23 +18570,7 @@
       </w:pPr>
       <w:r>
         <w:rPr/>
-        <w:t xml:space="preserve">Each mentor is provisioned a personalized CBM email address (e.g., john.smith@cbmentors.org) via Google Workspace for Nonprofits. This address is connected to </w:t>
-      </w:r>
-      <w:r>
-        <w:rPr/>
-        <w:t xml:space="preserve">the </w:t>
-      </w:r>
-      <w:r>
-        <w:rPr/>
-        <w:t xml:space="preserve">CRM via OAuth using </w:t>
-      </w:r>
-      <w:r>
-        <w:rPr/>
-        <w:t xml:space="preserve">the </w:t>
-      </w:r>
-      <w:r>
-        <w:rPr/>
-        <w:t>CRM's official Google Integration extension, enabling bidirectional email sync while maintaining full privacy isolation between mentors.</w:t>
+        <w:t>Each mentor is provisioned a personalized CBM email address (e.g., john.smith@cbmentors.org) via Google Workspace for Nonprofits. This address is connected to the CRM via OAuth using the CRM's official Google Integration extension, enabling bidirectional email sync while maintaining full privacy isolation between mentors.</w:t>
       </w:r>
     </w:p>
     <w:p>
@@ -18366,15 +21268,22 @@
           <w:iCs/>
           <w:color w:val="B8860B"/>
         </w:rPr>
-        <w:t xml:space="preserve">○ </w:t>
-      </w:r>
+        <w:t>○ OPEN: Verify Google Workspace for Nonprofits free tier removes 60-minute group meeting limit.</w:t>
+      </w:r>
+    </w:p>
+    <w:p>
+      <w:pPr>
+        <w:pStyle w:val="Normal"/>
+        <w:spacing w:before="0" w:after="120"/>
+        <w:rPr/>
+      </w:pPr>
       <w:r>
         <w:rPr>
           <w:i/>
           <w:iCs/>
           <w:color w:val="B8860B"/>
         </w:rPr>
-        <w:t>OPEN: Verify Google Workspace for Nonprofits free tier removes 60-minute group meeting limit.</w:t>
+        <w:t>○ OPEN: Donor management — evaluate whether EspoCRM handles donor tracking natively.</w:t>
       </w:r>
     </w:p>
     <w:p>
@@ -18389,15 +21298,22 @@
           <w:iCs/>
           <w:color w:val="B8860B"/>
         </w:rPr>
-        <w:t xml:space="preserve">○ </w:t>
-      </w:r>
+        <w:t>○ OPEN: Dues payment processing — PCI-compliant payment integration for annual volunteer dues.</w:t>
+      </w:r>
+    </w:p>
+    <w:p>
+      <w:pPr>
+        <w:pStyle w:val="Normal"/>
+        <w:spacing w:before="0" w:after="120"/>
+        <w:rPr/>
+      </w:pPr>
       <w:r>
         <w:rPr>
           <w:i/>
           <w:iCs/>
           <w:color w:val="B8860B"/>
         </w:rPr>
-        <w:t>OPEN: Donor management — evaluate whether EspoCRM handles donor tracking natively.</w:t>
+        <w:t>○ OPEN: Backup and recovery strategy for self-hosted EspoCRM on AWS.</w:t>
       </w:r>
     </w:p>
     <w:p>
@@ -18412,61 +21328,7 @@
           <w:iCs/>
           <w:color w:val="B8860B"/>
         </w:rPr>
-        <w:t xml:space="preserve">○ </w:t>
-      </w:r>
-      <w:r>
-        <w:rPr>
-          <w:i/>
-          <w:iCs/>
-          <w:color w:val="B8860B"/>
-        </w:rPr>
-        <w:t>OPEN: Dues payment processing — PCI-compliant payment integration for annual volunteer dues.</w:t>
-      </w:r>
-    </w:p>
-    <w:p>
-      <w:pPr>
-        <w:pStyle w:val="Normal"/>
-        <w:spacing w:before="0" w:after="120"/>
-        <w:rPr/>
-      </w:pPr>
-      <w:r>
-        <w:rPr>
-          <w:i/>
-          <w:iCs/>
-          <w:color w:val="B8860B"/>
-        </w:rPr>
-        <w:t xml:space="preserve">○ </w:t>
-      </w:r>
-      <w:r>
-        <w:rPr>
-          <w:i/>
-          <w:iCs/>
-          <w:color w:val="B8860B"/>
-        </w:rPr>
-        <w:t>OPEN: Backup and recovery strategy for self-hosted EspoCRM on AWS.</w:t>
-      </w:r>
-    </w:p>
-    <w:p>
-      <w:pPr>
-        <w:pStyle w:val="Normal"/>
-        <w:spacing w:before="0" w:after="120"/>
-        <w:rPr/>
-      </w:pPr>
-      <w:r>
-        <w:rPr>
-          <w:i/>
-          <w:iCs/>
-          <w:color w:val="B8860B"/>
-        </w:rPr>
-        <w:t xml:space="preserve">○ </w:t>
-      </w:r>
-      <w:r>
-        <w:rPr>
-          <w:i/>
-          <w:iCs/>
-          <w:color w:val="B8860B"/>
-        </w:rPr>
-        <w:t>OPEN: Virtual meeting link auto-generation — confirm EspoCRM + Cal.com can auto-attach Google Meet links to scheduled sessions.</w:t>
+        <w:t>○ OPEN: Virtual meeting link auto-generation — confirm EspoCRM + Cal.com can auto-attach Google Meet links to scheduled sessions.</w:t>
       </w:r>
     </w:p>
     <w:p>

</xml_diff>

<commit_message>
Add Executive Member persona (2.12) to CRM PRD; update Security PRD with all 13 personas and TBD Client row
</commit_message>
<xml_diff>
--- a/PRDs/CBM-PRD-CRM.docx
+++ b/PRDs/CBM-PRD-CRM.docx
@@ -3040,6 +3040,198 @@
       <w:r>
         <w:rPr/>
         <w:t xml:space="preserve">Relevant organizational communications and announcements</w:t>
+      </w:r>
+    </w:p>
+    <w:p>
+      <w:pPr>
+        <w:pStyle w:val="Normal"/>
+        <w:rPr/>
+      </w:pPr>
+      <w:r>
+        <w:rPr/>
+      </w:r>
+    </w:p>
+    <w:p>
+      <w:pPr>
+        <w:pStyle w:val="Heading2"/>
+        <w:rPr/>
+      </w:pPr>
+      <w:r>
+        <w:rPr/>
+        <w:t>2.12  Executive Member</w:t>
+      </w:r>
+    </w:p>
+    <w:p>
+      <w:pPr>
+        <w:pStyle w:val="Normal"/>
+        <w:rPr/>
+      </w:pPr>
+      <w:r>
+        <w:rPr/>
+      </w:r>
+    </w:p>
+    <w:p>
+      <w:pPr>
+        <w:pStyle w:val="Normal"/>
+        <w:rPr/>
+      </w:pPr>
+      <w:r>
+        <w:rPr/>
+        <w:t xml:space="preserve">The Executive Member represents CBM’s senior leadership and board principals. This role has full visibility into all organizational data for oversight, reporting, and strategic decision-making purposes, but does not have the ability to modify CRM configuration, workflows, or operational data.</w:t>
+      </w:r>
+    </w:p>
+    <w:p>
+      <w:pPr>
+        <w:pStyle w:val="Normal"/>
+        <w:rPr/>
+      </w:pPr>
+      <w:r>
+        <w:rPr/>
+      </w:r>
+    </w:p>
+    <w:p>
+      <w:pPr>
+        <w:pStyle w:val="Normal"/>
+        <w:rPr/>
+      </w:pPr>
+      <w:r>
+        <w:rPr>
+          <w:b/>
+        </w:rPr>
+        <w:t>Primary Processes:</w:t>
+      </w:r>
+    </w:p>
+    <w:p>
+      <w:pPr>
+        <w:pStyle w:val="ListParagraph"/>
+        <w:numPr>
+          <w:ilvl w:val="0"/>
+          <w:numId w:val="1"/>
+        </w:numPr>
+        <w:rPr/>
+      </w:pPr>
+      <w:r>
+        <w:rPr/>
+        <w:t xml:space="preserve">Review organizational dashboards and analytics — active mentors, clients, engagements, and program trends</w:t>
+      </w:r>
+    </w:p>
+    <w:p>
+      <w:pPr>
+        <w:pStyle w:val="ListParagraph"/>
+        <w:numPr>
+          <w:ilvl w:val="0"/>
+          <w:numId w:val="1"/>
+        </w:numPr>
+        <w:rPr/>
+      </w:pPr>
+      <w:r>
+        <w:rPr/>
+        <w:t xml:space="preserve">Access donor, sponsor, partner, and funding reports for strategic oversight</w:t>
+      </w:r>
+    </w:p>
+    <w:p>
+      <w:pPr>
+        <w:pStyle w:val="ListParagraph"/>
+        <w:numPr>
+          <w:ilvl w:val="0"/>
+          <w:numId w:val="1"/>
+        </w:numPr>
+        <w:rPr/>
+      </w:pPr>
+      <w:r>
+        <w:rPr/>
+        <w:t xml:space="preserve">Review board-level impact reports and program outcome data</w:t>
+      </w:r>
+    </w:p>
+    <w:p>
+      <w:pPr>
+        <w:pStyle w:val="ListParagraph"/>
+        <w:numPr>
+          <w:ilvl w:val="0"/>
+          <w:numId w:val="1"/>
+        </w:numPr>
+        <w:rPr/>
+      </w:pPr>
+      <w:r>
+        <w:rPr/>
+        <w:t xml:space="preserve">Monitor organizational health metrics across all program areas</w:t>
+      </w:r>
+    </w:p>
+    <w:p>
+      <w:pPr>
+        <w:pStyle w:val="Normal"/>
+        <w:rPr/>
+      </w:pPr>
+      <w:r>
+        <w:rPr/>
+      </w:r>
+    </w:p>
+    <w:p>
+      <w:pPr>
+        <w:pStyle w:val="Normal"/>
+        <w:rPr/>
+      </w:pPr>
+      <w:r>
+        <w:rPr>
+          <w:b/>
+        </w:rPr>
+        <w:t>Information Needed:</w:t>
+      </w:r>
+    </w:p>
+    <w:p>
+      <w:pPr>
+        <w:pStyle w:val="ListParagraph"/>
+        <w:numPr>
+          <w:ilvl w:val="0"/>
+          <w:numId w:val="1"/>
+        </w:numPr>
+        <w:rPr/>
+      </w:pPr>
+      <w:r>
+        <w:rPr/>
+        <w:t xml:space="preserve">Full read access to all CRM records and reports across all program areas</w:t>
+      </w:r>
+    </w:p>
+    <w:p>
+      <w:pPr>
+        <w:pStyle w:val="ListParagraph"/>
+        <w:numPr>
+          <w:ilvl w:val="0"/>
+          <w:numId w:val="1"/>
+        </w:numPr>
+        <w:rPr/>
+      </w:pPr>
+      <w:r>
+        <w:rPr/>
+        <w:t xml:space="preserve">Organizational dashboards — mentor, client, engagement, partner, donor, and event analytics</w:t>
+      </w:r>
+    </w:p>
+    <w:p>
+      <w:pPr>
+        <w:pStyle w:val="ListParagraph"/>
+        <w:numPr>
+          <w:ilvl w:val="0"/>
+          <w:numId w:val="1"/>
+        </w:numPr>
+        <w:rPr/>
+      </w:pPr>
+      <w:r>
+        <w:rPr/>
+        <w:t xml:space="preserve">Board-level impact and outcome reports</w:t>
+      </w:r>
+    </w:p>
+    <w:p>
+      <w:pPr>
+        <w:pStyle w:val="ListParagraph"/>
+        <w:numPr>
+          <w:ilvl w:val="0"/>
+          <w:numId w:val="1"/>
+        </w:numPr>
+        <w:rPr/>
+      </w:pPr>
+      <w:r>
+        <w:rPr/>
+        <w:t xml:space="preserve">Financial and fundraising summaries</w:t>
       </w:r>
     </w:p>
     <w:p>

</xml_diff>